<commit_message>
docs: enhance CA4 IEEE review paper with figures, tables, and Times New Roman typography
</commit_message>
<xml_diff>
--- a/docs/CA4_Review_Research_Paper_IEEE_AlphaPulse.docx
+++ b/docs/CA4_Review_Research_Paper_IEEE_AlphaPulse.docx
@@ -4,10 +4,12 @@
   <w:body>
     <w:p>
       <w:pPr>
+        <w:spacing w:before="0" w:after="80"/>
         <w:jc w:val="center"/>
       </w:pPr>
       <w:r>
         <w:rPr>
+          <w:rFonts w:ascii="Times New Roman" w:hAnsi="Times New Roman"/>
           <w:b/>
           <w:color w:val="003366"/>
           <w:sz w:val="34"/>
@@ -17,18 +19,22 @@
     </w:p>
     <w:p>
       <w:pPr>
+        <w:spacing w:after="200"/>
         <w:jc w:val="center"/>
       </w:pPr>
       <w:r>
         <w:rPr>
+          <w:rFonts w:ascii="Times New Roman" w:hAnsi="Times New Roman"/>
           <w:i/>
-          <w:sz w:val="20"/>
+          <w:sz w:val="19"/>
         </w:rPr>
         <w:t>Manish Patil</w:t>
         <w:br/>
         <w:t>Senior Research Investigator, Department of Computer Science &amp; Engineering</w:t>
         <w:br/>
-        <w:t>IEEE Student Member / Quantitative Finance Working Group</w:t>
+        <w:t>IEEE Student Member • Quantitative Finance &amp; Microstructure Working Group</w:t>
+        <w:br/>
+        <w:t>Email: manishpatil@ieee.org</w:t>
       </w:r>
     </w:p>
     <w:tbl>
@@ -46,15 +52,19 @@
             <w:tcW w:type="dxa" w:w="10080"/>
             <w:shd w:fill="F2F5F8"/>
             <w:tcMar>
-              <w:top w:w="150" w:type="dxa"/>
-              <w:bottom w:w="150" w:type="dxa"/>
-              <w:left w:w="200" w:type="dxa"/>
-              <w:right w:w="200" w:type="dxa"/>
+              <w:top w:w="140" w:type="dxa"/>
+              <w:bottom w:w="140" w:type="dxa"/>
+              <w:left w:w="180" w:type="dxa"/>
+              <w:right w:w="180" w:type="dxa"/>
             </w:tcMar>
           </w:tcPr>
           <w:p>
+            <w:pPr>
+              <w:jc w:val="both"/>
+            </w:pPr>
             <w:r>
               <w:rPr>
+                <w:rFonts w:ascii="Times New Roman" w:hAnsi="Times New Roman"/>
                 <w:b/>
                 <w:sz w:val="19"/>
               </w:rPr>
@@ -62,12 +72,13 @@
             </w:r>
             <w:r>
               <w:rPr>
+                <w:rFonts w:ascii="Times New Roman" w:hAnsi="Times New Roman"/>
                 <w:sz w:val="19"/>
               </w:rPr>
               <w:t>Financial time-series forecasting has historically been dominated by two paradigms: classical technical indicators derived from discrete time aggregations, and high-capacity deep learning architectures optimized for directional price prediction. Both paradigms suffer from fundamental structural limitations. Traditional technical indicators decouple price changes from the underlying volume distribution across price levels, while deep neural networks operate as epistemically opaque black boxes that suffer from performance degradation during market regime transitions. This paper presents a systematic review and empirical framework for market structure analytics grounded in Auction Market Theory (AMT) and Steidlmayer Market Profile mechanics. We examine the mathematical formalization of continuous double auctions, review recent advances in financial Explainable Artificial Intelligence (XAI), and benchmark the AlphaPulse architecture—a framework designed to extract dynamic Value Areas, categorize session structural regimes, and generate deterministic, non-predictive educational insights. Using high-frequency intraday data from the National Stock Exchange of India (NSE) comprising over 465,000 observations, we demonstrate that volume-at-price distributions provide statistically significant structural levels (p &lt; 0.001) that outperform legacy time-aggregated indicators in regime detection and market state transparency.</w:t>
               <w:br/>
               <w:br/>
-              <w:t>Index Terms— Auction Market Theory, Market Microstructure, Explainable Artificial Intelligence (XAI), Volume Profile, Regime Classification, Financial Machine Learning.</w:t>
+              <w:t>Index Terms— Auction Market Theory, Market Microstructure, Explainable Artificial Intelligence (XAI), Volume Profile, Regime Classification, Financial Machine Learning, Continuous Double Auctions.</w:t>
             </w:r>
           </w:p>
         </w:tc>
@@ -81,13 +92,14 @@
     <w:p>
       <w:pPr>
         <w:pStyle w:val="Heading1"/>
-        <w:spacing w:before="280" w:after="120"/>
+        <w:spacing w:before="240" w:after="80"/>
       </w:pPr>
       <w:r>
         <w:rPr>
+          <w:rFonts w:ascii="Times New Roman" w:hAnsi="Times New Roman"/>
           <w:b/>
           <w:color w:val="003366"/>
-          <w:sz w:val="32"/>
+          <w:sz w:val="26"/>
         </w:rPr>
         <w:t>I. INTRODUCTION</w:t>
       </w:r>
@@ -95,42 +107,207 @@
     <w:p>
       <w:pPr>
         <w:spacing w:after="80" w:line="276" w:lineRule="auto"/>
+        <w:jc w:val="both"/>
       </w:pPr>
       <w:r>
         <w:rPr>
-          <w:rFonts w:ascii="Calibri" w:hAnsi="Calibri"/>
+          <w:rFonts w:ascii="Times New Roman" w:hAnsi="Times New Roman"/>
           <w:i w:val="0"/>
-          <w:sz w:val="21"/>
+          <w:sz w:val="20"/>
         </w:rPr>
-        <w:t>Quantitative analysis of financial markets has expanded rapidly with the growth of high-frequency algorithmic execution and electronic Central Limit Order Books (CLOB). Despite these technological advancements, the prevailing analytical models used by retail and semi-institutional market participants remain reliant on time-discretized price paths (e.g., standard candlestick charts). These models deploy technical indicators—such as the Relative Strength Index (RSI), Moving Average Convergence Divergence (MACD), and Bollinger Bands—that compute mathematical derivatives of past closing prices across linear time increments:</w:t>
-        <w:br/>
-        <w:t xml:space="preserve">    Indicator = f(P_close, t)    (1)</w:t>
-        <w:br/>
-        <w:t>The critical flaw in this classical paradigm is dimensional decoupling: it treats traded volume as an exogenous scalar variable at the base of the temporal bar, discarding the conditional distribution of volume across discrete price quanta, P(V | P). Consequently, an identical price movement occurring on thin liquidity is treated identically to one executed with substantial institutional volume participation [1].</w:t>
+        <w:t>Quantitative analysis of modern financial markets has evolved rapidly with the growth of electronic Central Limit Order Books (CLOB) and algorithmic execution infrastructure. Despite these technological transformations, the prevailing analytical models deployed by retail and semi-institutional market participants remain largely constrained to time-discretized price paths (e.g., standard candlestick or bar charts). These models deploy technical indicators—such as the Relative Strength Index (RSI), Moving Average Convergence Divergence (MACD), Bollinger Bands, and stochastic oscillators—that compute mathematical derivatives solely across linear time increments:</w:t>
+      </w:r>
+    </w:p>
+    <w:tbl>
+      <w:tblPr>
+        <w:tblW w:type="auto" w:w="0"/>
+        <w:jc w:val="center"/>
+        <w:tblLayout w:type="fixed"/>
+        <w:tblLook w:firstColumn="1" w:firstRow="1" w:lastColumn="0" w:lastRow="0" w:noHBand="0" w:noVBand="1" w:val="04A0"/>
+      </w:tblPr>
+      <w:tblGrid>
+        <w:gridCol w:w="5040"/>
+        <w:gridCol w:w="5040"/>
+      </w:tblGrid>
+      <w:tr>
+        <w:tc>
+          <w:tcPr>
+            <w:tcW w:type="dxa" w:w="8352"/>
+            <w:shd w:fill="F8F9FA"/>
+            <w:tcMar>
+              <w:top w:w="60" w:type="dxa"/>
+              <w:bottom w:w="60" w:type="dxa"/>
+              <w:left w:w="100" w:type="dxa"/>
+              <w:right w:w="100" w:type="dxa"/>
+            </w:tcMar>
+          </w:tcPr>
+          <w:p>
+            <w:pPr>
+              <w:jc w:val="center"/>
+            </w:pPr>
+            <w:r>
+              <w:rPr>
+                <w:rFonts w:ascii="Times New Roman" w:hAnsi="Times New Roman"/>
+                <w:i/>
+                <w:sz w:val="19"/>
+              </w:rPr>
+              <w:t>Indicator_t = f(P_close, t)</w:t>
+            </w:r>
+          </w:p>
+        </w:tc>
+        <w:tc>
+          <w:tcPr>
+            <w:tcW w:type="dxa" w:w="1008"/>
+            <w:shd w:fill="F8F9FA"/>
+            <w:tcMar>
+              <w:top w:w="60" w:type="dxa"/>
+              <w:bottom w:w="60" w:type="dxa"/>
+              <w:left w:w="100" w:type="dxa"/>
+              <w:right w:w="100" w:type="dxa"/>
+            </w:tcMar>
+          </w:tcPr>
+          <w:p>
+            <w:pPr>
+              <w:jc w:val="right"/>
+            </w:pPr>
+            <w:r>
+              <w:rPr>
+                <w:rFonts w:ascii="Times New Roman" w:hAnsi="Times New Roman"/>
+                <w:b/>
+                <w:sz w:val="19"/>
+              </w:rPr>
+              <w:t>(1)</w:t>
+            </w:r>
+          </w:p>
+        </w:tc>
+      </w:tr>
+    </w:tbl>
+    <w:p>
+      <w:pPr>
+        <w:spacing w:after="80"/>
+      </w:pPr>
+    </w:p>
+    <w:p>
+      <w:pPr>
+        <w:spacing w:after="80" w:line="276" w:lineRule="auto"/>
+        <w:jc w:val="both"/>
+      </w:pPr>
+      <w:r>
+        <w:rPr>
+          <w:rFonts w:ascii="Times New Roman" w:hAnsi="Times New Roman"/>
+          <w:i w:val="0"/>
+          <w:sz w:val="20"/>
+        </w:rPr>
+        <w:t>The fundamental flaw in this classical paradigm is dimensional decoupling: it treats traded volume as an exogenous scalar variable at the base of the temporal bar, discarding the conditional distribution of volume across discrete price quanta, P(V | P). Consequently, an identical price movement occurring on thin liquidity is treated identically to one executed with substantial institutional volume participation [1].</w:t>
       </w:r>
     </w:p>
     <w:p>
       <w:pPr>
         <w:spacing w:after="80" w:line="276" w:lineRule="auto"/>
+        <w:jc w:val="both"/>
       </w:pPr>
       <w:r>
         <w:rPr>
-          <w:rFonts w:ascii="Calibri" w:hAnsi="Calibri"/>
+          <w:rFonts w:ascii="Times New Roman" w:hAnsi="Times New Roman"/>
           <w:i w:val="0"/>
-          <w:sz w:val="21"/>
+          <w:sz w:val="20"/>
         </w:rPr>
-        <w:t>In response to these limitations, modern quantitative researchers have deployed deep learning architectures, including Recurrent Neural Networks (RNNs), Long Short-Term Memory (LSTM) networks, and Transformer-based models, to forecast price directions [2]. While these models can map complex non-linear patterns, they introduce a new vulnerability: epistemic opacity. Financial markets are non-stationary, adversarial environments characterized by low signal-to-noise ratios. High-capacity black-box models frequently fit ephemeral noise features, leading to severe performance collapse when underlying market regimes change [3]. Furthermore, increasing global regulatory oversight (e.g., SEC, SEBI, ESMA) penalizes automated unregistered directional prediction engines, demanding greater transparency, risk clarity, and human interpretability.</w:t>
+        <w:t>To circumvent the limitations of legacy indicators, quantitative researchers over the past decade turned toward modern machine learning architectures. Early implementations utilized Support Vector Machines (SVMs) and Random Forests to classify price trends. Later waves introduced deep learning systems, including Recurrent Neural Networks (RNNs), Long Short-Term Memory (LSTM) networks, Gated Recurrent Units (GRUs), and Attention-Based Transformers [2]. While these architectures capture non-linear temporal dependencies, they introduce a critical flaw: epistemic opacity. Deep financial models operate as non-linear black boxes. They output probabilistic classification vectors:</w:t>
+      </w:r>
+    </w:p>
+    <w:tbl>
+      <w:tblPr>
+        <w:tblW w:type="auto" w:w="0"/>
+        <w:jc w:val="center"/>
+        <w:tblLayout w:type="fixed"/>
+        <w:tblLook w:firstColumn="1" w:firstRow="1" w:lastColumn="0" w:lastRow="0" w:noHBand="0" w:noVBand="1" w:val="04A0"/>
+      </w:tblPr>
+      <w:tblGrid>
+        <w:gridCol w:w="5040"/>
+        <w:gridCol w:w="5040"/>
+      </w:tblGrid>
+      <w:tr>
+        <w:tc>
+          <w:tcPr>
+            <w:tcW w:type="dxa" w:w="8352"/>
+            <w:shd w:fill="F8F9FA"/>
+            <w:tcMar>
+              <w:top w:w="60" w:type="dxa"/>
+              <w:bottom w:w="60" w:type="dxa"/>
+              <w:left w:w="100" w:type="dxa"/>
+              <w:right w:w="100" w:type="dxa"/>
+            </w:tcMar>
+          </w:tcPr>
+          <w:p>
+            <w:pPr>
+              <w:jc w:val="center"/>
+            </w:pPr>
+            <w:r>
+              <w:rPr>
+                <w:rFonts w:ascii="Times New Roman" w:hAnsi="Times New Roman"/>
+                <w:i/>
+                <w:sz w:val="19"/>
+              </w:rPr>
+              <w:t>y_hat_t in [0, 1]</w:t>
+            </w:r>
+          </w:p>
+        </w:tc>
+        <w:tc>
+          <w:tcPr>
+            <w:tcW w:type="dxa" w:w="1008"/>
+            <w:shd w:fill="F8F9FA"/>
+            <w:tcMar>
+              <w:top w:w="60" w:type="dxa"/>
+              <w:bottom w:w="60" w:type="dxa"/>
+              <w:left w:w="100" w:type="dxa"/>
+              <w:right w:w="100" w:type="dxa"/>
+            </w:tcMar>
+          </w:tcPr>
+          <w:p>
+            <w:pPr>
+              <w:jc w:val="right"/>
+            </w:pPr>
+            <w:r>
+              <w:rPr>
+                <w:rFonts w:ascii="Times New Roman" w:hAnsi="Times New Roman"/>
+                <w:b/>
+                <w:sz w:val="19"/>
+              </w:rPr>
+              <w:t>(2)</w:t>
+            </w:r>
+          </w:p>
+        </w:tc>
+      </w:tr>
+    </w:tbl>
+    <w:p>
+      <w:pPr>
+        <w:spacing w:after="80"/>
+      </w:pPr>
+    </w:p>
+    <w:p>
+      <w:pPr>
+        <w:spacing w:after="80" w:line="276" w:lineRule="auto"/>
+        <w:jc w:val="both"/>
+      </w:pPr>
+      <w:r>
+        <w:rPr>
+          <w:rFonts w:ascii="Times New Roman" w:hAnsi="Times New Roman"/>
+          <w:i w:val="0"/>
+          <w:sz w:val="20"/>
+        </w:rPr>
+        <w:t>These classification vectors are decoupled from underlying market microstructure causality. In financial markets—a non-stationary, adversarial domain characterized by low signal-to-noise ratios—black-box models overfit statistical noise, resulting in severe performance decay during structural regime shifts [3]. Furthermore, global regulatory bodies (e.g., SEC, ESMA, SEBI) increasingly enforce strict transparency, explainability, and consumer-protection mandates. Systems offering automated, ungrounded directional trading signals face severe regulatory risks and consumer skepticism.</w:t>
       </w:r>
     </w:p>
     <w:p>
       <w:pPr>
         <w:spacing w:after="80" w:line="276" w:lineRule="auto"/>
+        <w:jc w:val="both"/>
       </w:pPr>
       <w:r>
         <w:rPr>
-          <w:rFonts w:ascii="Calibri" w:hAnsi="Calibri"/>
+          <w:rFonts w:ascii="Times New Roman" w:hAnsi="Times New Roman"/>
           <w:i w:val="0"/>
-          <w:sz w:val="21"/>
+          <w:sz w:val="20"/>
         </w:rPr>
         <w:t>This paper provides a comprehensive review of explainable market microstructure methodologies and evaluates the AlphaPulse framework. Grounded in Auction Market Theory (AMT), AlphaPulse reframes market analytics: rather than generating speculative buy/sell predictions, it analyzes continuous double auctions as thermodynamic balancing mechanisms that alternate between equilibrium (Value Area consolidation) and disequilibrium (directional price discovery) [4].</w:t>
       </w:r>
@@ -138,13 +315,14 @@
     <w:p>
       <w:pPr>
         <w:pStyle w:val="Heading1"/>
-        <w:spacing w:before="280" w:after="120"/>
+        <w:spacing w:before="240" w:after="80"/>
       </w:pPr>
       <w:r>
         <w:rPr>
+          <w:rFonts w:ascii="Times New Roman" w:hAnsi="Times New Roman"/>
           <w:b/>
           <w:color w:val="003366"/>
-          <w:sz w:val="32"/>
+          <w:sz w:val="26"/>
         </w:rPr>
         <w:t>II. THEORETICAL FOUNDATIONS OF AUCTION MARKET THEORY</w:t>
       </w:r>
@@ -152,12 +330,13 @@
     <w:p>
       <w:pPr>
         <w:spacing w:after="80" w:line="276" w:lineRule="auto"/>
+        <w:jc w:val="both"/>
       </w:pPr>
       <w:r>
         <w:rPr>
-          <w:rFonts w:ascii="Calibri" w:hAnsi="Calibri"/>
+          <w:rFonts w:ascii="Times New Roman" w:hAnsi="Times New Roman"/>
           <w:i w:val="0"/>
-          <w:sz w:val="21"/>
+          <w:sz w:val="20"/>
         </w:rPr>
         <w:t>Auction Market Theory, pioneered qualitatively by J. Peter Steidlmayer at the Chicago Board of Trade (CBOT), models financial exchanges as continuous, bilateral double auctions whose primary purpose is to facilitate trade [5]. Under this framework, price is an advertising mechanism, time regulates opportunity, and volume measures auction acceptance or rejection.</w:t>
       </w:r>
@@ -165,71 +344,141 @@
     <w:p>
       <w:pPr>
         <w:spacing w:after="80" w:line="276" w:lineRule="auto"/>
+        <w:jc w:val="both"/>
       </w:pPr>
       <w:r>
         <w:rPr>
-          <w:rFonts w:ascii="Calibri" w:hAnsi="Calibri"/>
+          <w:rFonts w:ascii="Times New Roman" w:hAnsi="Times New Roman"/>
           <w:i w:val="0"/>
-          <w:sz w:val="21"/>
+          <w:sz w:val="20"/>
         </w:rPr>
         <w:t>The continuous auction establishes two distinct thermodynamic market regimes:</w:t>
-        <w:br/>
-        <w:t>1) Rotational Balance: Buyers and sellers reach consensus on fair value, resulting in an approximately Gaussian volume distribution across price levels. The central region containing 68.2% (one empirical standard deviation) of the transacted volume is defined as the Value Area (VA):</w:t>
-        <w:br/>
-        <w:t xml:space="preserve">    Integral_{p in VA} H(p) dp = 0.682 * Total Volume    (2)</w:t>
-        <w:br/>
-        <w:t>where H(p) denotes the empirical volume histogram across discrete price quanta p. The price level with the highest traded volume density is designated the Volume Point of Control (VPOC).</w:t>
-        <w:br/>
-        <w:t>2) Initiative Imbalance: When new external information enters the market, the existing balance is broken. One cohort (buyers or sellers) aggressively exhausts opposing liquidity, driving prices out of the Value Area in search of new balance levels.</w:t>
-      </w:r>
-    </w:p>
-    <w:p>
-      <w:pPr>
-        <w:pStyle w:val="Heading1"/>
-        <w:spacing w:before="280" w:after="120"/>
-      </w:pPr>
-      <w:r>
-        <w:rPr>
-          <w:b/>
-          <w:color w:val="003366"/>
-          <w:sz w:val="32"/>
-        </w:rPr>
-        <w:t>III. SYSTEMATIC LITERATURE REVIEW</w:t>
       </w:r>
     </w:p>
     <w:p>
       <w:pPr>
         <w:spacing w:after="80" w:line="276" w:lineRule="auto"/>
+        <w:jc w:val="both"/>
       </w:pPr>
       <w:r>
         <w:rPr>
-          <w:rFonts w:ascii="Calibri" w:hAnsi="Calibri"/>
+          <w:rFonts w:ascii="Times New Roman" w:hAnsi="Times New Roman"/>
           <w:i w:val="0"/>
-          <w:sz w:val="21"/>
+          <w:sz w:val="20"/>
         </w:rPr>
-        <w:t>The literature at the intersection of market microstructure, deep learning, and explainable AI can be categorized into four primary eras:</w:t>
-        <w:br/>
-        <w:t>A. Classical Econometrics and Continuous Auction Formulations: Fama [6] established the foundation of modern quantitative finance with the Efficient Market Hypothesis (EMH). Kyle [7] provided the mathematical framework for continuous auctions by modeling the interaction between informed traders, uninformed noise traders, and competitive market makers.</w:t>
-        <w:br/>
-        <w:t>B. Statistical Mechanics of Complex Financial Systems: Bouchaud et al. [8] and Cont [9] demonstrated that financial time series exhibit universal non-Gaussian properties, including power-law return distributions, heavy tails, and long-memory volatility clustering.</w:t>
-        <w:br/>
-        <w:t>C. Modern Financial Machine Learning and the Interpretability Gap: López de Prado [10] demonstrated the prevalence of false discoveries in financial machine learning, caused by backtest overfitting. Fischer and Krauss [11] showed that deep LSTM networks could capture non-linear patterns, but noted that their black-box nature made them vulnerable during regime shifts.</w:t>
-        <w:br/>
-        <w:t>D. Explainable Artificial Intelligence (XAI) in Capital Markets: Arrieta et al. [12] established formal taxonomies for explainability. Lundberg and Lee [13] unified feature attribution through Shapley Additive exPlanations (SHAP), providing game-theoretically grounded explanations.</w:t>
+        <w:t>1) Rotational Balance: Buyers and sellers reach consensus on fair value, resulting in an approximately Gaussian volume distribution across price levels. The central region containing 68.2% (one empirical standard deviation) of the transacted volume is defined as the Value Area (VA):</w:t>
+      </w:r>
+    </w:p>
+    <w:tbl>
+      <w:tblPr>
+        <w:tblW w:type="auto" w:w="0"/>
+        <w:jc w:val="center"/>
+        <w:tblLayout w:type="fixed"/>
+        <w:tblLook w:firstColumn="1" w:firstRow="1" w:lastColumn="0" w:lastRow="0" w:noHBand="0" w:noVBand="1" w:val="04A0"/>
+      </w:tblPr>
+      <w:tblGrid>
+        <w:gridCol w:w="5040"/>
+        <w:gridCol w:w="5040"/>
+      </w:tblGrid>
+      <w:tr>
+        <w:tc>
+          <w:tcPr>
+            <w:tcW w:type="dxa" w:w="8352"/>
+            <w:shd w:fill="F8F9FA"/>
+            <w:tcMar>
+              <w:top w:w="60" w:type="dxa"/>
+              <w:bottom w:w="60" w:type="dxa"/>
+              <w:left w:w="100" w:type="dxa"/>
+              <w:right w:w="100" w:type="dxa"/>
+            </w:tcMar>
+          </w:tcPr>
+          <w:p>
+            <w:pPr>
+              <w:jc w:val="center"/>
+            </w:pPr>
+            <w:r>
+              <w:rPr>
+                <w:rFonts w:ascii="Times New Roman" w:hAnsi="Times New Roman"/>
+                <w:i/>
+                <w:sz w:val="19"/>
+              </w:rPr>
+              <w:t>Integral_{p in VA} H(p) dp = 0.682 * Total Volume</w:t>
+            </w:r>
+          </w:p>
+        </w:tc>
+        <w:tc>
+          <w:tcPr>
+            <w:tcW w:type="dxa" w:w="1008"/>
+            <w:shd w:fill="F8F9FA"/>
+            <w:tcMar>
+              <w:top w:w="60" w:type="dxa"/>
+              <w:bottom w:w="60" w:type="dxa"/>
+              <w:left w:w="100" w:type="dxa"/>
+              <w:right w:w="100" w:type="dxa"/>
+            </w:tcMar>
+          </w:tcPr>
+          <w:p>
+            <w:pPr>
+              <w:jc w:val="right"/>
+            </w:pPr>
+            <w:r>
+              <w:rPr>
+                <w:rFonts w:ascii="Times New Roman" w:hAnsi="Times New Roman"/>
+                <w:b/>
+                <w:sz w:val="19"/>
+              </w:rPr>
+              <w:t>(3)</w:t>
+            </w:r>
+          </w:p>
+        </w:tc>
+      </w:tr>
+    </w:tbl>
+    <w:p>
+      <w:pPr>
+        <w:spacing w:after="80"/>
+      </w:pPr>
+    </w:p>
+    <w:p>
+      <w:pPr>
+        <w:spacing w:after="80" w:line="276" w:lineRule="auto"/>
+        <w:jc w:val="both"/>
+      </w:pPr>
+      <w:r>
+        <w:rPr>
+          <w:rFonts w:ascii="Times New Roman" w:hAnsi="Times New Roman"/>
+          <w:i w:val="0"/>
+          <w:sz w:val="20"/>
+        </w:rPr>
+        <w:t>where H(p) denotes the empirical volume histogram across discrete price quanta p. The price level with the highest traded volume density is designated the Volume Point of Control (VPOC).</w:t>
       </w:r>
     </w:p>
     <w:p>
       <w:pPr>
-        <w:pStyle w:val="Heading1"/>
-        <w:spacing w:before="280" w:after="120"/>
+        <w:spacing w:after="80" w:line="276" w:lineRule="auto"/>
+        <w:jc w:val="both"/>
       </w:pPr>
       <w:r>
         <w:rPr>
+          <w:rFonts w:ascii="Times New Roman" w:hAnsi="Times New Roman"/>
+          <w:i w:val="0"/>
+          <w:sz w:val="20"/>
+        </w:rPr>
+        <w:t>2) Initiative Imbalance: When new external information enters the market, the existing balance is broken. One cohort (buyers or sellers) aggressively exhausts opposing liquidity, driving prices out of the Value Area in search of new balance levels. These dynamic states are summarized in Table I.</w:t>
+      </w:r>
+    </w:p>
+    <w:p>
+      <w:pPr>
+        <w:spacing w:before="160" w:after="60"/>
+        <w:jc w:val="center"/>
+      </w:pPr>
+      <w:r>
+        <w:rPr>
+          <w:rFonts w:ascii="Times New Roman" w:hAnsi="Times New Roman"/>
           <w:b/>
           <w:color w:val="003366"/>
-          <w:sz w:val="32"/>
+          <w:sz w:val="19"/>
         </w:rPr>
-        <w:t>IV. METHODOLOGICAL COMPARATIVE ANALYSIS</w:t>
+        <w:t>TABLE I: STEIDLMAYER CONTINUOUS AUCTION REGIME TAXONOMY</w:t>
       </w:r>
     </w:p>
     <w:tbl>
@@ -248,13 +497,13 @@
       <w:tr>
         <w:tc>
           <w:tcPr>
-            <w:tcW w:type="dxa" w:w="2160"/>
+            <w:tcW w:type="dxa" w:w="1872"/>
             <w:shd w:fill="003366"/>
             <w:tcMar>
-              <w:top w:w="120" w:type="dxa"/>
-              <w:bottom w:w="120" w:type="dxa"/>
-              <w:left w:w="150" w:type="dxa"/>
-              <w:right w:w="150" w:type="dxa"/>
+              <w:top w:w="100" w:type="dxa"/>
+              <w:bottom w:w="100" w:type="dxa"/>
+              <w:left w:w="120" w:type="dxa"/>
+              <w:right w:w="120" w:type="dxa"/>
             </w:tcMar>
           </w:tcPr>
           <w:p>
@@ -263,9 +512,806 @@
             </w:pPr>
             <w:r>
               <w:rPr>
+                <w:rFonts w:ascii="Times New Roman" w:hAnsi="Times New Roman"/>
                 <w:b/>
                 <w:color w:val="FFFFFF"/>
-                <w:sz w:val="19"/>
+                <w:sz w:val="18"/>
+              </w:rPr>
+              <w:t>Profile Archetype</w:t>
+            </w:r>
+          </w:p>
+        </w:tc>
+        <w:tc>
+          <w:tcPr>
+            <w:tcW w:type="dxa" w:w="2592"/>
+            <w:shd w:fill="003366"/>
+            <w:tcMar>
+              <w:top w:w="100" w:type="dxa"/>
+              <w:bottom w:w="100" w:type="dxa"/>
+              <w:left w:w="120" w:type="dxa"/>
+              <w:right w:w="120" w:type="dxa"/>
+            </w:tcMar>
+          </w:tcPr>
+          <w:p>
+            <w:pPr>
+              <w:jc w:val="center"/>
+            </w:pPr>
+            <w:r>
+              <w:rPr>
+                <w:rFonts w:ascii="Times New Roman" w:hAnsi="Times New Roman"/>
+                <w:b/>
+                <w:color w:val="FFFFFF"/>
+                <w:sz w:val="18"/>
+              </w:rPr>
+              <w:t>Geometric Structure</w:t>
+            </w:r>
+          </w:p>
+        </w:tc>
+        <w:tc>
+          <w:tcPr>
+            <w:tcW w:type="dxa" w:w="3312"/>
+            <w:shd w:fill="003366"/>
+            <w:tcMar>
+              <w:top w:w="100" w:type="dxa"/>
+              <w:bottom w:w="100" w:type="dxa"/>
+              <w:left w:w="120" w:type="dxa"/>
+              <w:right w:w="120" w:type="dxa"/>
+            </w:tcMar>
+          </w:tcPr>
+          <w:p>
+            <w:pPr>
+              <w:jc w:val="center"/>
+            </w:pPr>
+            <w:r>
+              <w:rPr>
+                <w:rFonts w:ascii="Times New Roman" w:hAnsi="Times New Roman"/>
+                <w:b/>
+                <w:color w:val="FFFFFF"/>
+                <w:sz w:val="18"/>
+              </w:rPr>
+              <w:t>Microstructure Dynamic</w:t>
+            </w:r>
+          </w:p>
+        </w:tc>
+        <w:tc>
+          <w:tcPr>
+            <w:tcW w:type="dxa" w:w="2016"/>
+            <w:shd w:fill="003366"/>
+            <w:tcMar>
+              <w:top w:w="100" w:type="dxa"/>
+              <w:bottom w:w="100" w:type="dxa"/>
+              <w:left w:w="120" w:type="dxa"/>
+              <w:right w:w="120" w:type="dxa"/>
+            </w:tcMar>
+          </w:tcPr>
+          <w:p>
+            <w:pPr>
+              <w:jc w:val="center"/>
+            </w:pPr>
+            <w:r>
+              <w:rPr>
+                <w:rFonts w:ascii="Times New Roman" w:hAnsi="Times New Roman"/>
+                <w:b/>
+                <w:color w:val="FFFFFF"/>
+                <w:sz w:val="18"/>
+              </w:rPr>
+              <w:t>Dominant Participant</w:t>
+            </w:r>
+          </w:p>
+        </w:tc>
+      </w:tr>
+      <w:tr>
+        <w:tc>
+          <w:tcPr>
+            <w:tcW w:type="dxa" w:w="1872"/>
+            <w:shd w:fill="FFFFFF"/>
+            <w:tcMar>
+              <w:top w:w="70" w:type="dxa"/>
+              <w:bottom w:w="70" w:type="dxa"/>
+              <w:left w:w="100" w:type="dxa"/>
+              <w:right w:w="100" w:type="dxa"/>
+            </w:tcMar>
+          </w:tcPr>
+          <w:p>
+            <w:r>
+              <w:rPr>
+                <w:rFonts w:ascii="Times New Roman" w:hAnsi="Times New Roman"/>
+                <w:sz w:val="17"/>
+              </w:rPr>
+              <w:t>Normal Day</w:t>
+            </w:r>
+          </w:p>
+        </w:tc>
+        <w:tc>
+          <w:tcPr>
+            <w:tcW w:type="dxa" w:w="2592"/>
+            <w:shd w:fill="FFFFFF"/>
+            <w:tcMar>
+              <w:top w:w="70" w:type="dxa"/>
+              <w:bottom w:w="70" w:type="dxa"/>
+              <w:left w:w="100" w:type="dxa"/>
+              <w:right w:w="100" w:type="dxa"/>
+            </w:tcMar>
+          </w:tcPr>
+          <w:p>
+            <w:r>
+              <w:rPr>
+                <w:rFonts w:ascii="Times New Roman" w:hAnsi="Times New Roman"/>
+                <w:sz w:val="17"/>
+              </w:rPr>
+              <w:t>Symmetrical Bell Curve (Gaussian)</w:t>
+            </w:r>
+          </w:p>
+        </w:tc>
+        <w:tc>
+          <w:tcPr>
+            <w:tcW w:type="dxa" w:w="3312"/>
+            <w:shd w:fill="FFFFFF"/>
+            <w:tcMar>
+              <w:top w:w="70" w:type="dxa"/>
+              <w:bottom w:w="70" w:type="dxa"/>
+              <w:left w:w="100" w:type="dxa"/>
+              <w:right w:w="100" w:type="dxa"/>
+            </w:tcMar>
+          </w:tcPr>
+          <w:p>
+            <w:r>
+              <w:rPr>
+                <w:rFonts w:ascii="Times New Roman" w:hAnsi="Times New Roman"/>
+                <w:sz w:val="17"/>
+              </w:rPr>
+              <w:t>Balanced two-sided trade; high liquidity density.</w:t>
+            </w:r>
+          </w:p>
+        </w:tc>
+        <w:tc>
+          <w:tcPr>
+            <w:tcW w:type="dxa" w:w="2016"/>
+            <w:shd w:fill="FFFFFF"/>
+            <w:tcMar>
+              <w:top w:w="70" w:type="dxa"/>
+              <w:bottom w:w="70" w:type="dxa"/>
+              <w:left w:w="100" w:type="dxa"/>
+              <w:right w:w="100" w:type="dxa"/>
+            </w:tcMar>
+          </w:tcPr>
+          <w:p>
+            <w:r>
+              <w:rPr>
+                <w:rFonts w:ascii="Times New Roman" w:hAnsi="Times New Roman"/>
+                <w:sz w:val="17"/>
+              </w:rPr>
+              <w:t>Responsive Participants</w:t>
+            </w:r>
+          </w:p>
+        </w:tc>
+      </w:tr>
+      <w:tr>
+        <w:tc>
+          <w:tcPr>
+            <w:tcW w:type="dxa" w:w="1872"/>
+            <w:shd w:fill="F4F6F9"/>
+            <w:tcMar>
+              <w:top w:w="70" w:type="dxa"/>
+              <w:bottom w:w="70" w:type="dxa"/>
+              <w:left w:w="100" w:type="dxa"/>
+              <w:right w:w="100" w:type="dxa"/>
+            </w:tcMar>
+          </w:tcPr>
+          <w:p>
+            <w:r>
+              <w:rPr>
+                <w:rFonts w:ascii="Times New Roman" w:hAnsi="Times New Roman"/>
+                <w:sz w:val="17"/>
+              </w:rPr>
+              <w:t>Trend Day</w:t>
+            </w:r>
+          </w:p>
+        </w:tc>
+        <w:tc>
+          <w:tcPr>
+            <w:tcW w:type="dxa" w:w="2592"/>
+            <w:shd w:fill="F4F6F9"/>
+            <w:tcMar>
+              <w:top w:w="70" w:type="dxa"/>
+              <w:bottom w:w="70" w:type="dxa"/>
+              <w:left w:w="100" w:type="dxa"/>
+              <w:right w:w="100" w:type="dxa"/>
+            </w:tcMar>
+          </w:tcPr>
+          <w:p>
+            <w:r>
+              <w:rPr>
+                <w:rFonts w:ascii="Times New Roman" w:hAnsi="Times New Roman"/>
+                <w:sz w:val="17"/>
+              </w:rPr>
+              <w:t>Elongated, Unimodal, High Extension</w:t>
+            </w:r>
+          </w:p>
+        </w:tc>
+        <w:tc>
+          <w:tcPr>
+            <w:tcW w:type="dxa" w:w="3312"/>
+            <w:shd w:fill="F4F6F9"/>
+            <w:tcMar>
+              <w:top w:w="70" w:type="dxa"/>
+              <w:bottom w:w="70" w:type="dxa"/>
+              <w:left w:w="100" w:type="dxa"/>
+              <w:right w:w="100" w:type="dxa"/>
+            </w:tcMar>
+          </w:tcPr>
+          <w:p>
+            <w:r>
+              <w:rPr>
+                <w:rFonts w:ascii="Times New Roman" w:hAnsi="Times New Roman"/>
+                <w:sz w:val="17"/>
+              </w:rPr>
+              <w:t>Aggressive initiative flow; persistent directional drive.</w:t>
+            </w:r>
+          </w:p>
+        </w:tc>
+        <w:tc>
+          <w:tcPr>
+            <w:tcW w:type="dxa" w:w="2016"/>
+            <w:shd w:fill="F4F6F9"/>
+            <w:tcMar>
+              <w:top w:w="70" w:type="dxa"/>
+              <w:bottom w:w="70" w:type="dxa"/>
+              <w:left w:w="100" w:type="dxa"/>
+              <w:right w:w="100" w:type="dxa"/>
+            </w:tcMar>
+          </w:tcPr>
+          <w:p>
+            <w:r>
+              <w:rPr>
+                <w:rFonts w:ascii="Times New Roman" w:hAnsi="Times New Roman"/>
+                <w:sz w:val="17"/>
+              </w:rPr>
+              <w:t>Initiative Participants</w:t>
+            </w:r>
+          </w:p>
+        </w:tc>
+      </w:tr>
+      <w:tr>
+        <w:tc>
+          <w:tcPr>
+            <w:tcW w:type="dxa" w:w="1872"/>
+            <w:shd w:fill="FFFFFF"/>
+            <w:tcMar>
+              <w:top w:w="70" w:type="dxa"/>
+              <w:bottom w:w="70" w:type="dxa"/>
+              <w:left w:w="100" w:type="dxa"/>
+              <w:right w:w="100" w:type="dxa"/>
+            </w:tcMar>
+          </w:tcPr>
+          <w:p>
+            <w:r>
+              <w:rPr>
+                <w:rFonts w:ascii="Times New Roman" w:hAnsi="Times New Roman"/>
+                <w:sz w:val="17"/>
+              </w:rPr>
+              <w:t>Double Distribution</w:t>
+            </w:r>
+          </w:p>
+        </w:tc>
+        <w:tc>
+          <w:tcPr>
+            <w:tcW w:type="dxa" w:w="2592"/>
+            <w:shd w:fill="FFFFFF"/>
+            <w:tcMar>
+              <w:top w:w="70" w:type="dxa"/>
+              <w:bottom w:w="70" w:type="dxa"/>
+              <w:left w:w="100" w:type="dxa"/>
+              <w:right w:w="100" w:type="dxa"/>
+            </w:tcMar>
+          </w:tcPr>
+          <w:p>
+            <w:r>
+              <w:rPr>
+                <w:rFonts w:ascii="Times New Roman" w:hAnsi="Times New Roman"/>
+                <w:sz w:val="17"/>
+              </w:rPr>
+              <w:t>Bimodal; Two Balanced Regions</w:t>
+            </w:r>
+          </w:p>
+        </w:tc>
+        <w:tc>
+          <w:tcPr>
+            <w:tcW w:type="dxa" w:w="3312"/>
+            <w:shd w:fill="FFFFFF"/>
+            <w:tcMar>
+              <w:top w:w="70" w:type="dxa"/>
+              <w:bottom w:w="70" w:type="dxa"/>
+              <w:left w:w="100" w:type="dxa"/>
+              <w:right w:w="100" w:type="dxa"/>
+            </w:tcMar>
+          </w:tcPr>
+          <w:p>
+            <w:r>
+              <w:rPr>
+                <w:rFonts w:ascii="Times New Roman" w:hAnsi="Times New Roman"/>
+                <w:sz w:val="17"/>
+              </w:rPr>
+              <w:t>Structural breakdown; price shifts from old to new value.</w:t>
+            </w:r>
+          </w:p>
+        </w:tc>
+        <w:tc>
+          <w:tcPr>
+            <w:tcW w:type="dxa" w:w="2016"/>
+            <w:shd w:fill="FFFFFF"/>
+            <w:tcMar>
+              <w:top w:w="70" w:type="dxa"/>
+              <w:bottom w:w="70" w:type="dxa"/>
+              <w:left w:w="100" w:type="dxa"/>
+              <w:right w:w="100" w:type="dxa"/>
+            </w:tcMar>
+          </w:tcPr>
+          <w:p>
+            <w:r>
+              <w:rPr>
+                <w:rFonts w:ascii="Times New Roman" w:hAnsi="Times New Roman"/>
+                <w:sz w:val="17"/>
+              </w:rPr>
+              <w:t>Initiative Breakout</w:t>
+            </w:r>
+          </w:p>
+        </w:tc>
+      </w:tr>
+      <w:tr>
+        <w:tc>
+          <w:tcPr>
+            <w:tcW w:type="dxa" w:w="1872"/>
+            <w:shd w:fill="F4F6F9"/>
+            <w:tcMar>
+              <w:top w:w="70" w:type="dxa"/>
+              <w:bottom w:w="70" w:type="dxa"/>
+              <w:left w:w="100" w:type="dxa"/>
+              <w:right w:w="100" w:type="dxa"/>
+            </w:tcMar>
+          </w:tcPr>
+          <w:p>
+            <w:r>
+              <w:rPr>
+                <w:rFonts w:ascii="Times New Roman" w:hAnsi="Times New Roman"/>
+                <w:sz w:val="17"/>
+              </w:rPr>
+              <w:t>P-Shaped Profile</w:t>
+            </w:r>
+          </w:p>
+        </w:tc>
+        <w:tc>
+          <w:tcPr>
+            <w:tcW w:type="dxa" w:w="2592"/>
+            <w:shd w:fill="F4F6F9"/>
+            <w:tcMar>
+              <w:top w:w="70" w:type="dxa"/>
+              <w:bottom w:w="70" w:type="dxa"/>
+              <w:left w:w="100" w:type="dxa"/>
+              <w:right w:w="100" w:type="dxa"/>
+            </w:tcMar>
+          </w:tcPr>
+          <w:p>
+            <w:r>
+              <w:rPr>
+                <w:rFonts w:ascii="Times New Roman" w:hAnsi="Times New Roman"/>
+                <w:sz w:val="17"/>
+              </w:rPr>
+              <w:t>Thin lower tail; wide high-volume body</w:t>
+            </w:r>
+          </w:p>
+        </w:tc>
+        <w:tc>
+          <w:tcPr>
+            <w:tcW w:type="dxa" w:w="3312"/>
+            <w:shd w:fill="F4F6F9"/>
+            <w:tcMar>
+              <w:top w:w="70" w:type="dxa"/>
+              <w:bottom w:w="70" w:type="dxa"/>
+              <w:left w:w="100" w:type="dxa"/>
+              <w:right w:w="100" w:type="dxa"/>
+            </w:tcMar>
+          </w:tcPr>
+          <w:p>
+            <w:r>
+              <w:rPr>
+                <w:rFonts w:ascii="Times New Roman" w:hAnsi="Times New Roman"/>
+                <w:sz w:val="17"/>
+              </w:rPr>
+              <w:t>Short covering; responsive buying; buyers in control.</w:t>
+            </w:r>
+          </w:p>
+        </w:tc>
+        <w:tc>
+          <w:tcPr>
+            <w:tcW w:type="dxa" w:w="2016"/>
+            <w:shd w:fill="F4F6F9"/>
+            <w:tcMar>
+              <w:top w:w="70" w:type="dxa"/>
+              <w:bottom w:w="70" w:type="dxa"/>
+              <w:left w:w="100" w:type="dxa"/>
+              <w:right w:w="100" w:type="dxa"/>
+            </w:tcMar>
+          </w:tcPr>
+          <w:p>
+            <w:r>
+              <w:rPr>
+                <w:rFonts w:ascii="Times New Roman" w:hAnsi="Times New Roman"/>
+                <w:sz w:val="17"/>
+              </w:rPr>
+              <w:t>Responsive Buyers</w:t>
+            </w:r>
+          </w:p>
+        </w:tc>
+      </w:tr>
+      <w:tr>
+        <w:tc>
+          <w:tcPr>
+            <w:tcW w:type="dxa" w:w="1872"/>
+            <w:shd w:fill="FFFFFF"/>
+            <w:tcMar>
+              <w:top w:w="70" w:type="dxa"/>
+              <w:bottom w:w="70" w:type="dxa"/>
+              <w:left w:w="100" w:type="dxa"/>
+              <w:right w:w="100" w:type="dxa"/>
+            </w:tcMar>
+          </w:tcPr>
+          <w:p>
+            <w:r>
+              <w:rPr>
+                <w:rFonts w:ascii="Times New Roman" w:hAnsi="Times New Roman"/>
+                <w:sz w:val="17"/>
+              </w:rPr>
+              <w:t>b-Shaped Profile</w:t>
+            </w:r>
+          </w:p>
+        </w:tc>
+        <w:tc>
+          <w:tcPr>
+            <w:tcW w:type="dxa" w:w="2592"/>
+            <w:shd w:fill="FFFFFF"/>
+            <w:tcMar>
+              <w:top w:w="70" w:type="dxa"/>
+              <w:bottom w:w="70" w:type="dxa"/>
+              <w:left w:w="100" w:type="dxa"/>
+              <w:right w:w="100" w:type="dxa"/>
+            </w:tcMar>
+          </w:tcPr>
+          <w:p>
+            <w:r>
+              <w:rPr>
+                <w:rFonts w:ascii="Times New Roman" w:hAnsi="Times New Roman"/>
+                <w:sz w:val="17"/>
+              </w:rPr>
+              <w:t>Wide high-volume base; thin upper tail</w:t>
+            </w:r>
+          </w:p>
+        </w:tc>
+        <w:tc>
+          <w:tcPr>
+            <w:tcW w:type="dxa" w:w="3312"/>
+            <w:shd w:fill="FFFFFF"/>
+            <w:tcMar>
+              <w:top w:w="70" w:type="dxa"/>
+              <w:bottom w:w="70" w:type="dxa"/>
+              <w:left w:w="100" w:type="dxa"/>
+              <w:right w:w="100" w:type="dxa"/>
+            </w:tcMar>
+          </w:tcPr>
+          <w:p>
+            <w:r>
+              <w:rPr>
+                <w:rFonts w:ascii="Times New Roman" w:hAnsi="Times New Roman"/>
+                <w:sz w:val="17"/>
+              </w:rPr>
+              <w:t>Long liquidation; aggressive selling; sellers in control.</w:t>
+            </w:r>
+          </w:p>
+        </w:tc>
+        <w:tc>
+          <w:tcPr>
+            <w:tcW w:type="dxa" w:w="2016"/>
+            <w:shd w:fill="FFFFFF"/>
+            <w:tcMar>
+              <w:top w:w="70" w:type="dxa"/>
+              <w:bottom w:w="70" w:type="dxa"/>
+              <w:left w:w="100" w:type="dxa"/>
+              <w:right w:w="100" w:type="dxa"/>
+            </w:tcMar>
+          </w:tcPr>
+          <w:p>
+            <w:r>
+              <w:rPr>
+                <w:rFonts w:ascii="Times New Roman" w:hAnsi="Times New Roman"/>
+                <w:sz w:val="17"/>
+              </w:rPr>
+              <w:t>Responsive Sellers</w:t>
+            </w:r>
+          </w:p>
+        </w:tc>
+      </w:tr>
+      <w:tr>
+        <w:tc>
+          <w:tcPr>
+            <w:tcW w:type="dxa" w:w="1872"/>
+            <w:shd w:fill="F4F6F9"/>
+            <w:tcMar>
+              <w:top w:w="70" w:type="dxa"/>
+              <w:bottom w:w="70" w:type="dxa"/>
+              <w:left w:w="100" w:type="dxa"/>
+              <w:right w:w="100" w:type="dxa"/>
+            </w:tcMar>
+          </w:tcPr>
+          <w:p>
+            <w:r>
+              <w:rPr>
+                <w:rFonts w:ascii="Times New Roman" w:hAnsi="Times New Roman"/>
+                <w:sz w:val="17"/>
+              </w:rPr>
+              <w:t>Neutral Day</w:t>
+            </w:r>
+          </w:p>
+        </w:tc>
+        <w:tc>
+          <w:tcPr>
+            <w:tcW w:type="dxa" w:w="2592"/>
+            <w:shd w:fill="F4F6F9"/>
+            <w:tcMar>
+              <w:top w:w="70" w:type="dxa"/>
+              <w:bottom w:w="70" w:type="dxa"/>
+              <w:left w:w="100" w:type="dxa"/>
+              <w:right w:w="100" w:type="dxa"/>
+            </w:tcMar>
+          </w:tcPr>
+          <w:p>
+            <w:r>
+              <w:rPr>
+                <w:rFonts w:ascii="Times New Roman" w:hAnsi="Times New Roman"/>
+                <w:sz w:val="17"/>
+              </w:rPr>
+              <w:t>Wide Initial Balance; low extension</w:t>
+            </w:r>
+          </w:p>
+        </w:tc>
+        <w:tc>
+          <w:tcPr>
+            <w:tcW w:type="dxa" w:w="3312"/>
+            <w:shd w:fill="F4F6F9"/>
+            <w:tcMar>
+              <w:top w:w="70" w:type="dxa"/>
+              <w:bottom w:w="70" w:type="dxa"/>
+              <w:left w:w="100" w:type="dxa"/>
+              <w:right w:w="100" w:type="dxa"/>
+            </w:tcMar>
+          </w:tcPr>
+          <w:p>
+            <w:r>
+              <w:rPr>
+                <w:rFonts w:ascii="Times New Roman" w:hAnsi="Times New Roman"/>
+                <w:sz w:val="17"/>
+              </w:rPr>
+              <w:t>Balanced market with both buyers and sellers active.</w:t>
+            </w:r>
+          </w:p>
+        </w:tc>
+        <w:tc>
+          <w:tcPr>
+            <w:tcW w:type="dxa" w:w="2016"/>
+            <w:shd w:fill="F4F6F9"/>
+            <w:tcMar>
+              <w:top w:w="70" w:type="dxa"/>
+              <w:bottom w:w="70" w:type="dxa"/>
+              <w:left w:w="100" w:type="dxa"/>
+              <w:right w:w="100" w:type="dxa"/>
+            </w:tcMar>
+          </w:tcPr>
+          <w:p>
+            <w:r>
+              <w:rPr>
+                <w:rFonts w:ascii="Times New Roman" w:hAnsi="Times New Roman"/>
+                <w:sz w:val="17"/>
+              </w:rPr>
+              <w:t>Two-Sided Equilibrium</w:t>
+            </w:r>
+          </w:p>
+        </w:tc>
+      </w:tr>
+    </w:tbl>
+    <w:p>
+      <w:pPr>
+        <w:spacing w:after="120"/>
+      </w:pPr>
+    </w:p>
+    <w:p>
+      <w:pPr>
+        <w:spacing w:before="160" w:after="60"/>
+        <w:jc w:val="center"/>
+      </w:pPr>
+      <w:r>
+        <w:drawing>
+          <wp:inline xmlns:a="http://schemas.openxmlformats.org/drawingml/2006/main" xmlns:pic="http://schemas.openxmlformats.org/drawingml/2006/picture">
+            <wp:extent cx="5669280" cy="2551176"/>
+            <wp:docPr id="1" name="Picture 1"/>
+            <wp:cNvGraphicFramePr>
+              <a:graphicFrameLocks noChangeAspect="1"/>
+            </wp:cNvGraphicFramePr>
+            <a:graphic>
+              <a:graphicData uri="http://schemas.openxmlformats.org/drawingml/2006/picture">
+                <pic:pic>
+                  <pic:nvPicPr>
+                    <pic:cNvPr id="0" name="fig1_auction_profile.png"/>
+                    <pic:cNvPicPr/>
+                  </pic:nvPicPr>
+                  <pic:blipFill>
+                    <a:blip r:embed="rId9"/>
+                    <a:stretch>
+                      <a:fillRect/>
+                    </a:stretch>
+                  </pic:blipFill>
+                  <pic:spPr>
+                    <a:xfrm>
+                      <a:off x="0" y="0"/>
+                      <a:ext cx="5669280" cy="2551176"/>
+                    </a:xfrm>
+                    <a:prstGeom prst="rect"/>
+                  </pic:spPr>
+                </pic:pic>
+              </a:graphicData>
+            </a:graphic>
+          </wp:inline>
+        </w:drawing>
+      </w:r>
+    </w:p>
+    <w:p>
+      <w:pPr>
+        <w:spacing w:after="160"/>
+        <w:jc w:val="center"/>
+      </w:pPr>
+      <w:r>
+        <w:rPr>
+          <w:rFonts w:ascii="Times New Roman" w:hAnsi="Times New Roman"/>
+          <w:i/>
+          <w:color w:val="3C3C3C"/>
+          <w:sz w:val="18"/>
+        </w:rPr>
+        <w:t>Fig. 1. Continuous auction price trajectory (left) and corresponding spatial Volume Profile H(p) (right) displaying the Volume Point of Control (VPOC) and symmetrical 68.2% empirical Value Area boundaries (VAH and VAL).</w:t>
+      </w:r>
+    </w:p>
+    <w:p>
+      <w:pPr>
+        <w:pStyle w:val="Heading1"/>
+        <w:spacing w:before="240" w:after="80"/>
+      </w:pPr>
+      <w:r>
+        <w:rPr>
+          <w:rFonts w:ascii="Times New Roman" w:hAnsi="Times New Roman"/>
+          <w:b/>
+          <w:color w:val="003366"/>
+          <w:sz w:val="26"/>
+        </w:rPr>
+        <w:t>III. SYSTEMATIC LITERATURE REVIEW</w:t>
+      </w:r>
+    </w:p>
+    <w:p>
+      <w:pPr>
+        <w:spacing w:after="80" w:line="276" w:lineRule="auto"/>
+        <w:jc w:val="both"/>
+      </w:pPr>
+      <w:r>
+        <w:rPr>
+          <w:rFonts w:ascii="Times New Roman" w:hAnsi="Times New Roman"/>
+          <w:i w:val="0"/>
+          <w:sz w:val="20"/>
+        </w:rPr>
+        <w:t>The quantitative finance and computer science literature at the intersection of market microstructure, deep learning, and explainable AI can be categorized into four primary eras:</w:t>
+      </w:r>
+    </w:p>
+    <w:p>
+      <w:pPr>
+        <w:spacing w:after="80" w:line="276" w:lineRule="auto"/>
+        <w:jc w:val="both"/>
+      </w:pPr>
+      <w:r>
+        <w:rPr>
+          <w:rFonts w:ascii="Times New Roman" w:hAnsi="Times New Roman"/>
+          <w:i w:val="0"/>
+          <w:sz w:val="20"/>
+        </w:rPr>
+        <w:t>A. Classical Econometrics and Continuous Auction Formulations: Fama [6] established the foundation of modern quantitative finance with the Efficient Market Hypothesis (EMH). Kyle [7] provided the mathematical framework for continuous auctions by modeling the interaction between informed traders, uninformed noise traders, and competitive market makers. Kyle's model established that order flow imbalances directly impact price dynamics, formalizing the concept of market depth and liquidity friction.</w:t>
+      </w:r>
+    </w:p>
+    <w:p>
+      <w:pPr>
+        <w:spacing w:after="80" w:line="276" w:lineRule="auto"/>
+        <w:jc w:val="both"/>
+      </w:pPr>
+      <w:r>
+        <w:rPr>
+          <w:rFonts w:ascii="Times New Roman" w:hAnsi="Times New Roman"/>
+          <w:i w:val="0"/>
+          <w:sz w:val="20"/>
+        </w:rPr>
+        <w:t>B. Statistical Mechanics of Complex Financial Systems: Bouchaud et al. [8] and Cont [9] demonstrated that financial time series exhibit universal non-Gaussian properties, including power-law return distributions, heavy tails, and long-memory volatility clustering. These findings invalidated simple Brownian motion assumptions, demonstrating that order flow distributions exhibit localized clustering around major liquidity pools.</w:t>
+      </w:r>
+    </w:p>
+    <w:p>
+      <w:pPr>
+        <w:spacing w:after="80" w:line="276" w:lineRule="auto"/>
+        <w:jc w:val="both"/>
+      </w:pPr>
+      <w:r>
+        <w:rPr>
+          <w:rFonts w:ascii="Times New Roman" w:hAnsi="Times New Roman"/>
+          <w:i w:val="0"/>
+          <w:sz w:val="20"/>
+        </w:rPr>
+        <w:t>C. Modern Financial Machine Learning and the Interpretability Gap: López de Prado [10] demonstrated the prevalence of false discoveries in financial machine learning, caused by backtest overfitting. Fischer and Krauss [11] showed that deep LSTM networks could capture non-linear patterns, but noted that their black-box nature made them vulnerable during regime shifts. Gu, Kelly, and Xiu [12] compared multiple ML frameworks, finding superior capacity in neural nets but highlighting the total absence of structural economic interpretability.</w:t>
+      </w:r>
+    </w:p>
+    <w:p>
+      <w:pPr>
+        <w:spacing w:after="80" w:line="276" w:lineRule="auto"/>
+        <w:jc w:val="both"/>
+      </w:pPr>
+      <w:r>
+        <w:rPr>
+          <w:rFonts w:ascii="Times New Roman" w:hAnsi="Times New Roman"/>
+          <w:i w:val="0"/>
+          <w:sz w:val="20"/>
+        </w:rPr>
+        <w:t>D. Explainable Artificial Intelligence (XAI) in Capital Markets: Arrieta et al. [13] established formal taxonomies for explainability. Lundberg and Lee [14] unified feature attribution through Shapley Additive exPlanations (SHAP), providing game-theoretically grounded explanations. Ribeiro et al. [15] formulated LIME for local surrogate interpretability. However, applying general XAI frameworks to raw, noisy financial time series remains challenging without domain-specific structural constraints.</w:t>
+      </w:r>
+    </w:p>
+    <w:p>
+      <w:pPr>
+        <w:spacing w:before="160" w:after="60"/>
+        <w:jc w:val="center"/>
+      </w:pPr>
+      <w:r>
+        <w:rPr>
+          <w:rFonts w:ascii="Times New Roman" w:hAnsi="Times New Roman"/>
+          <w:b/>
+          <w:color w:val="003366"/>
+          <w:sz w:val="19"/>
+        </w:rPr>
+        <w:t>TABLE II: COMPARATIVE METHODOLOGY MATRIX</w:t>
+      </w:r>
+    </w:p>
+    <w:tbl>
+      <w:tblPr>
+        <w:tblW w:type="auto" w:w="0"/>
+        <w:jc w:val="center"/>
+        <w:tblLayout w:type="fixed"/>
+        <w:tblLook w:firstColumn="1" w:firstRow="1" w:lastColumn="0" w:lastRow="0" w:noHBand="0" w:noVBand="1" w:val="04A0"/>
+      </w:tblPr>
+      <w:tblGrid>
+        <w:gridCol w:w="2520"/>
+        <w:gridCol w:w="2520"/>
+        <w:gridCol w:w="2520"/>
+        <w:gridCol w:w="2520"/>
+      </w:tblGrid>
+      <w:tr>
+        <w:tc>
+          <w:tcPr>
+            <w:tcW w:type="dxa" w:w="2016"/>
+            <w:shd w:fill="003366"/>
+            <w:tcMar>
+              <w:top w:w="100" w:type="dxa"/>
+              <w:bottom w:w="100" w:type="dxa"/>
+              <w:left w:w="120" w:type="dxa"/>
+              <w:right w:w="120" w:type="dxa"/>
+            </w:tcMar>
+          </w:tcPr>
+          <w:p>
+            <w:pPr>
+              <w:jc w:val="center"/>
+            </w:pPr>
+            <w:r>
+              <w:rPr>
+                <w:rFonts w:ascii="Times New Roman" w:hAnsi="Times New Roman"/>
+                <w:b/>
+                <w:color w:val="FFFFFF"/>
+                <w:sz w:val="18"/>
               </w:rPr>
               <w:t>Framework Class</w:t>
             </w:r>
@@ -276,10 +1322,10 @@
             <w:tcW w:type="dxa" w:w="2592"/>
             <w:shd w:fill="003366"/>
             <w:tcMar>
-              <w:top w:w="120" w:type="dxa"/>
-              <w:bottom w:w="120" w:type="dxa"/>
-              <w:left w:w="150" w:type="dxa"/>
-              <w:right w:w="150" w:type="dxa"/>
+              <w:top w:w="100" w:type="dxa"/>
+              <w:bottom w:w="100" w:type="dxa"/>
+              <w:left w:w="120" w:type="dxa"/>
+              <w:right w:w="120" w:type="dxa"/>
             </w:tcMar>
           </w:tcPr>
           <w:p>
@@ -288,9 +1334,10 @@
             </w:pPr>
             <w:r>
               <w:rPr>
+                <w:rFonts w:ascii="Times New Roman" w:hAnsi="Times New Roman"/>
                 <w:b/>
                 <w:color w:val="FFFFFF"/>
-                <w:sz w:val="19"/>
+                <w:sz w:val="18"/>
               </w:rPr>
               <w:t>Core Mechanics</w:t>
             </w:r>
@@ -301,10 +1348,10 @@
             <w:tcW w:type="dxa" w:w="2592"/>
             <w:shd w:fill="003366"/>
             <w:tcMar>
-              <w:top w:w="120" w:type="dxa"/>
-              <w:bottom w:w="120" w:type="dxa"/>
-              <w:left w:w="150" w:type="dxa"/>
-              <w:right w:w="150" w:type="dxa"/>
+              <w:top w:w="100" w:type="dxa"/>
+              <w:bottom w:w="100" w:type="dxa"/>
+              <w:left w:w="120" w:type="dxa"/>
+              <w:right w:w="120" w:type="dxa"/>
             </w:tcMar>
           </w:tcPr>
           <w:p>
@@ -313,9 +1360,10 @@
             </w:pPr>
             <w:r>
               <w:rPr>
+                <w:rFonts w:ascii="Times New Roman" w:hAnsi="Times New Roman"/>
                 <w:b/>
                 <w:color w:val="FFFFFF"/>
-                <w:sz w:val="19"/>
+                <w:sz w:val="18"/>
               </w:rPr>
               <w:t>Primary Strengths</w:t>
             </w:r>
@@ -326,10 +1374,10 @@
             <w:tcW w:type="dxa" w:w="2592"/>
             <w:shd w:fill="003366"/>
             <w:tcMar>
-              <w:top w:w="120" w:type="dxa"/>
-              <w:bottom w:w="120" w:type="dxa"/>
-              <w:left w:w="150" w:type="dxa"/>
-              <w:right w:w="150" w:type="dxa"/>
+              <w:top w:w="100" w:type="dxa"/>
+              <w:bottom w:w="100" w:type="dxa"/>
+              <w:left w:w="120" w:type="dxa"/>
+              <w:right w:w="120" w:type="dxa"/>
             </w:tcMar>
           </w:tcPr>
           <w:p>
@@ -338,9 +1386,10 @@
             </w:pPr>
             <w:r>
               <w:rPr>
+                <w:rFonts w:ascii="Times New Roman" w:hAnsi="Times New Roman"/>
                 <w:b/>
                 <w:color w:val="FFFFFF"/>
-                <w:sz w:val="19"/>
+                <w:sz w:val="18"/>
               </w:rPr>
               <w:t>Critical Flaws</w:t>
             </w:r>
@@ -350,20 +1399,20 @@
       <w:tr>
         <w:tc>
           <w:tcPr>
-            <w:tcW w:type="dxa" w:w="2160"/>
+            <w:tcW w:type="dxa" w:w="2016"/>
             <w:shd w:fill="FFFFFF"/>
             <w:tcMar>
-              <w:top w:w="80" w:type="dxa"/>
-              <w:bottom w:w="80" w:type="dxa"/>
-              <w:left w:w="120" w:type="dxa"/>
-              <w:right w:w="120" w:type="dxa"/>
+              <w:top w:w="70" w:type="dxa"/>
+              <w:bottom w:w="70" w:type="dxa"/>
+              <w:left w:w="100" w:type="dxa"/>
+              <w:right w:w="100" w:type="dxa"/>
             </w:tcMar>
           </w:tcPr>
           <w:p>
             <w:r>
               <w:rPr>
-                <w:rFonts w:ascii="Calibri" w:hAnsi="Calibri"/>
-                <w:sz w:val="18"/>
+                <w:rFonts w:ascii="Times New Roman" w:hAnsi="Times New Roman"/>
+                <w:sz w:val="17"/>
               </w:rPr>
               <w:t>Technical Indicators</w:t>
             </w:r>
@@ -374,17 +1423,17 @@
             <w:tcW w:type="dxa" w:w="2592"/>
             <w:shd w:fill="FFFFFF"/>
             <w:tcMar>
-              <w:top w:w="80" w:type="dxa"/>
-              <w:bottom w:w="80" w:type="dxa"/>
-              <w:left w:w="120" w:type="dxa"/>
-              <w:right w:w="120" w:type="dxa"/>
+              <w:top w:w="70" w:type="dxa"/>
+              <w:bottom w:w="70" w:type="dxa"/>
+              <w:left w:w="100" w:type="dxa"/>
+              <w:right w:w="100" w:type="dxa"/>
             </w:tcMar>
           </w:tcPr>
           <w:p>
             <w:r>
               <w:rPr>
-                <w:rFonts w:ascii="Calibri" w:hAnsi="Calibri"/>
-                <w:sz w:val="18"/>
+                <w:rFonts w:ascii="Times New Roman" w:hAnsi="Times New Roman"/>
+                <w:sz w:val="17"/>
               </w:rPr>
               <w:t>Price-derived formulas (RSI, Moving Averages)</w:t>
             </w:r>
@@ -395,17 +1444,17 @@
             <w:tcW w:type="dxa" w:w="2592"/>
             <w:shd w:fill="FFFFFF"/>
             <w:tcMar>
-              <w:top w:w="80" w:type="dxa"/>
-              <w:bottom w:w="80" w:type="dxa"/>
-              <w:left w:w="120" w:type="dxa"/>
-              <w:right w:w="120" w:type="dxa"/>
+              <w:top w:w="70" w:type="dxa"/>
+              <w:bottom w:w="70" w:type="dxa"/>
+              <w:left w:w="100" w:type="dxa"/>
+              <w:right w:w="100" w:type="dxa"/>
             </w:tcMar>
           </w:tcPr>
           <w:p>
             <w:r>
               <w:rPr>
-                <w:rFonts w:ascii="Calibri" w:hAnsi="Calibri"/>
-                <w:sz w:val="18"/>
+                <w:rFonts w:ascii="Times New Roman" w:hAnsi="Times New Roman"/>
+                <w:sz w:val="17"/>
               </w:rPr>
               <w:t>Low computational complexity; easy to implement.</w:t>
             </w:r>
@@ -416,17 +1465,17 @@
             <w:tcW w:type="dxa" w:w="2592"/>
             <w:shd w:fill="FFFFFF"/>
             <w:tcMar>
-              <w:top w:w="80" w:type="dxa"/>
-              <w:bottom w:w="80" w:type="dxa"/>
-              <w:left w:w="120" w:type="dxa"/>
-              <w:right w:w="120" w:type="dxa"/>
+              <w:top w:w="70" w:type="dxa"/>
+              <w:bottom w:w="70" w:type="dxa"/>
+              <w:left w:w="100" w:type="dxa"/>
+              <w:right w:w="100" w:type="dxa"/>
             </w:tcMar>
           </w:tcPr>
           <w:p>
             <w:r>
               <w:rPr>
-                <w:rFonts w:ascii="Calibri" w:hAnsi="Calibri"/>
-                <w:sz w:val="18"/>
+                <w:rFonts w:ascii="Times New Roman" w:hAnsi="Times New Roman"/>
+                <w:sz w:val="17"/>
               </w:rPr>
               <w:t>Severe lag; lacks volume-at-price dimensionality.</w:t>
             </w:r>
@@ -436,20 +1485,20 @@
       <w:tr>
         <w:tc>
           <w:tcPr>
-            <w:tcW w:type="dxa" w:w="2160"/>
+            <w:tcW w:type="dxa" w:w="2016"/>
             <w:shd w:fill="F4F6F9"/>
             <w:tcMar>
-              <w:top w:w="80" w:type="dxa"/>
-              <w:bottom w:w="80" w:type="dxa"/>
-              <w:left w:w="120" w:type="dxa"/>
-              <w:right w:w="120" w:type="dxa"/>
+              <w:top w:w="70" w:type="dxa"/>
+              <w:bottom w:w="70" w:type="dxa"/>
+              <w:left w:w="100" w:type="dxa"/>
+              <w:right w:w="100" w:type="dxa"/>
             </w:tcMar>
           </w:tcPr>
           <w:p>
             <w:r>
               <w:rPr>
-                <w:rFonts w:ascii="Calibri" w:hAnsi="Calibri"/>
-                <w:sz w:val="18"/>
+                <w:rFonts w:ascii="Times New Roman" w:hAnsi="Times New Roman"/>
+                <w:sz w:val="17"/>
               </w:rPr>
               <w:t>Deep Supervised Learning</w:t>
             </w:r>
@@ -460,17 +1509,17 @@
             <w:tcW w:type="dxa" w:w="2592"/>
             <w:shd w:fill="F4F6F9"/>
             <w:tcMar>
-              <w:top w:w="80" w:type="dxa"/>
-              <w:bottom w:w="80" w:type="dxa"/>
-              <w:left w:w="120" w:type="dxa"/>
-              <w:right w:w="120" w:type="dxa"/>
+              <w:top w:w="70" w:type="dxa"/>
+              <w:bottom w:w="70" w:type="dxa"/>
+              <w:left w:w="100" w:type="dxa"/>
+              <w:right w:w="100" w:type="dxa"/>
             </w:tcMar>
           </w:tcPr>
           <w:p>
             <w:r>
               <w:rPr>
-                <w:rFonts w:ascii="Calibri" w:hAnsi="Calibri"/>
-                <w:sz w:val="18"/>
+                <w:rFonts w:ascii="Times New Roman" w:hAnsi="Times New Roman"/>
+                <w:sz w:val="17"/>
               </w:rPr>
               <w:t>Multi-layer neural nets predicting directions</w:t>
             </w:r>
@@ -481,17 +1530,17 @@
             <w:tcW w:type="dxa" w:w="2592"/>
             <w:shd w:fill="F4F6F9"/>
             <w:tcMar>
-              <w:top w:w="80" w:type="dxa"/>
-              <w:bottom w:w="80" w:type="dxa"/>
-              <w:left w:w="120" w:type="dxa"/>
-              <w:right w:w="120" w:type="dxa"/>
+              <w:top w:w="70" w:type="dxa"/>
+              <w:bottom w:w="70" w:type="dxa"/>
+              <w:left w:w="100" w:type="dxa"/>
+              <w:right w:w="100" w:type="dxa"/>
             </w:tcMar>
           </w:tcPr>
           <w:p>
             <w:r>
               <w:rPr>
-                <w:rFonts w:ascii="Calibri" w:hAnsi="Calibri"/>
-                <w:sz w:val="18"/>
+                <w:rFonts w:ascii="Times New Roman" w:hAnsi="Times New Roman"/>
+                <w:sz w:val="17"/>
               </w:rPr>
               <w:t>Captures non-linear patterns and complex features.</w:t>
             </w:r>
@@ -502,17 +1551,17 @@
             <w:tcW w:type="dxa" w:w="2592"/>
             <w:shd w:fill="F4F6F9"/>
             <w:tcMar>
-              <w:top w:w="80" w:type="dxa"/>
-              <w:bottom w:w="80" w:type="dxa"/>
-              <w:left w:w="120" w:type="dxa"/>
-              <w:right w:w="120" w:type="dxa"/>
+              <w:top w:w="70" w:type="dxa"/>
+              <w:bottom w:w="70" w:type="dxa"/>
+              <w:left w:w="100" w:type="dxa"/>
+              <w:right w:w="100" w:type="dxa"/>
             </w:tcMar>
           </w:tcPr>
           <w:p>
             <w:r>
               <w:rPr>
-                <w:rFonts w:ascii="Calibri" w:hAnsi="Calibri"/>
-                <w:sz w:val="18"/>
+                <w:rFonts w:ascii="Times New Roman" w:hAnsi="Times New Roman"/>
+                <w:sz w:val="17"/>
               </w:rPr>
               <w:t>Complete opacity; prone to severe regime overfitting.</w:t>
             </w:r>
@@ -522,20 +1571,20 @@
       <w:tr>
         <w:tc>
           <w:tcPr>
-            <w:tcW w:type="dxa" w:w="2160"/>
+            <w:tcW w:type="dxa" w:w="2016"/>
             <w:shd w:fill="FFFFFF"/>
             <w:tcMar>
-              <w:top w:w="80" w:type="dxa"/>
-              <w:bottom w:w="80" w:type="dxa"/>
-              <w:left w:w="120" w:type="dxa"/>
-              <w:right w:w="120" w:type="dxa"/>
+              <w:top w:w="70" w:type="dxa"/>
+              <w:bottom w:w="70" w:type="dxa"/>
+              <w:left w:w="100" w:type="dxa"/>
+              <w:right w:w="100" w:type="dxa"/>
             </w:tcMar>
           </w:tcPr>
           <w:p>
             <w:r>
               <w:rPr>
-                <w:rFonts w:ascii="Calibri" w:hAnsi="Calibri"/>
-                <w:sz w:val="18"/>
+                <w:rFonts w:ascii="Times New Roman" w:hAnsi="Times New Roman"/>
+                <w:sz w:val="17"/>
               </w:rPr>
               <w:t>High-Frequency Order Flow</w:t>
             </w:r>
@@ -546,17 +1595,17 @@
             <w:tcW w:type="dxa" w:w="2592"/>
             <w:shd w:fill="FFFFFF"/>
             <w:tcMar>
-              <w:top w:w="80" w:type="dxa"/>
-              <w:bottom w:w="80" w:type="dxa"/>
-              <w:left w:w="120" w:type="dxa"/>
-              <w:right w:w="120" w:type="dxa"/>
+              <w:top w:w="70" w:type="dxa"/>
+              <w:bottom w:w="70" w:type="dxa"/>
+              <w:left w:w="100" w:type="dxa"/>
+              <w:right w:w="100" w:type="dxa"/>
             </w:tcMar>
           </w:tcPr>
           <w:p>
             <w:r>
               <w:rPr>
-                <w:rFonts w:ascii="Calibri" w:hAnsi="Calibri"/>
-                <w:sz w:val="18"/>
+                <w:rFonts w:ascii="Times New Roman" w:hAnsi="Times New Roman"/>
+                <w:sz w:val="17"/>
               </w:rPr>
               <w:t>L3 queue dynamics and microsecond tick imbalance</w:t>
             </w:r>
@@ -567,17 +1616,17 @@
             <w:tcW w:type="dxa" w:w="2592"/>
             <w:shd w:fill="FFFFFF"/>
             <w:tcMar>
-              <w:top w:w="80" w:type="dxa"/>
-              <w:bottom w:w="80" w:type="dxa"/>
-              <w:left w:w="120" w:type="dxa"/>
-              <w:right w:w="120" w:type="dxa"/>
+              <w:top w:w="70" w:type="dxa"/>
+              <w:bottom w:w="70" w:type="dxa"/>
+              <w:left w:w="100" w:type="dxa"/>
+              <w:right w:w="100" w:type="dxa"/>
             </w:tcMar>
           </w:tcPr>
           <w:p>
             <w:r>
               <w:rPr>
-                <w:rFonts w:ascii="Calibri" w:hAnsi="Calibri"/>
-                <w:sz w:val="18"/>
+                <w:rFonts w:ascii="Times New Roman" w:hAnsi="Times New Roman"/>
+                <w:sz w:val="17"/>
               </w:rPr>
               <w:t>Ultra-low latency; direct order book visibility.</w:t>
             </w:r>
@@ -588,17 +1637,17 @@
             <w:tcW w:type="dxa" w:w="2592"/>
             <w:shd w:fill="FFFFFF"/>
             <w:tcMar>
-              <w:top w:w="80" w:type="dxa"/>
-              <w:bottom w:w="80" w:type="dxa"/>
-              <w:left w:w="120" w:type="dxa"/>
-              <w:right w:w="120" w:type="dxa"/>
+              <w:top w:w="70" w:type="dxa"/>
+              <w:bottom w:w="70" w:type="dxa"/>
+              <w:left w:w="100" w:type="dxa"/>
+              <w:right w:w="100" w:type="dxa"/>
             </w:tcMar>
           </w:tcPr>
           <w:p>
             <w:r>
               <w:rPr>
-                <w:rFonts w:ascii="Calibri" w:hAnsi="Calibri"/>
-                <w:sz w:val="18"/>
+                <w:rFonts w:ascii="Times New Roman" w:hAnsi="Times New Roman"/>
+                <w:sz w:val="17"/>
               </w:rPr>
               <w:t>Extreme compute &amp; data costs; short temporal window.</w:t>
             </w:r>
@@ -608,20 +1657,20 @@
       <w:tr>
         <w:tc>
           <w:tcPr>
-            <w:tcW w:type="dxa" w:w="2160"/>
+            <w:tcW w:type="dxa" w:w="2016"/>
             <w:shd w:fill="F4F6F9"/>
             <w:tcMar>
-              <w:top w:w="80" w:type="dxa"/>
-              <w:bottom w:w="80" w:type="dxa"/>
-              <w:left w:w="120" w:type="dxa"/>
-              <w:right w:w="120" w:type="dxa"/>
+              <w:top w:w="70" w:type="dxa"/>
+              <w:bottom w:w="70" w:type="dxa"/>
+              <w:left w:w="100" w:type="dxa"/>
+              <w:right w:w="100" w:type="dxa"/>
             </w:tcMar>
           </w:tcPr>
           <w:p>
             <w:r>
               <w:rPr>
-                <w:rFonts w:ascii="Calibri" w:hAnsi="Calibri"/>
-                <w:sz w:val="18"/>
+                <w:rFonts w:ascii="Times New Roman" w:hAnsi="Times New Roman"/>
+                <w:sz w:val="17"/>
               </w:rPr>
               <w:t>AlphaPulse Framework</w:t>
             </w:r>
@@ -632,17 +1681,17 @@
             <w:tcW w:type="dxa" w:w="2592"/>
             <w:shd w:fill="F4F6F9"/>
             <w:tcMar>
-              <w:top w:w="80" w:type="dxa"/>
-              <w:bottom w:w="80" w:type="dxa"/>
-              <w:left w:w="120" w:type="dxa"/>
-              <w:right w:w="120" w:type="dxa"/>
+              <w:top w:w="70" w:type="dxa"/>
+              <w:bottom w:w="70" w:type="dxa"/>
+              <w:left w:w="100" w:type="dxa"/>
+              <w:right w:w="100" w:type="dxa"/>
             </w:tcMar>
           </w:tcPr>
           <w:p>
             <w:r>
               <w:rPr>
-                <w:rFonts w:ascii="Calibri" w:hAnsi="Calibri"/>
-                <w:sz w:val="18"/>
+                <w:rFonts w:ascii="Times New Roman" w:hAnsi="Times New Roman"/>
+                <w:sz w:val="17"/>
               </w:rPr>
               <w:t>Auction Market Theory with XAI semantics &amp; GMM</w:t>
             </w:r>
@@ -653,17 +1702,17 @@
             <w:tcW w:type="dxa" w:w="2592"/>
             <w:shd w:fill="F4F6F9"/>
             <w:tcMar>
-              <w:top w:w="80" w:type="dxa"/>
-              <w:bottom w:w="80" w:type="dxa"/>
-              <w:left w:w="120" w:type="dxa"/>
-              <w:right w:w="120" w:type="dxa"/>
+              <w:top w:w="70" w:type="dxa"/>
+              <w:bottom w:w="70" w:type="dxa"/>
+              <w:left w:w="100" w:type="dxa"/>
+              <w:right w:w="100" w:type="dxa"/>
             </w:tcMar>
           </w:tcPr>
           <w:p>
             <w:r>
               <w:rPr>
-                <w:rFonts w:ascii="Calibri" w:hAnsi="Calibri"/>
-                <w:sz w:val="18"/>
+                <w:rFonts w:ascii="Times New Roman" w:hAnsi="Times New Roman"/>
+                <w:sz w:val="17"/>
               </w:rPr>
               <w:t>Mathematically grounded; fully explainable; no black boxes.</w:t>
             </w:r>
@@ -674,17 +1723,17 @@
             <w:tcW w:type="dxa" w:w="2592"/>
             <w:shd w:fill="F4F6F9"/>
             <w:tcMar>
-              <w:top w:w="80" w:type="dxa"/>
-              <w:bottom w:w="80" w:type="dxa"/>
-              <w:left w:w="120" w:type="dxa"/>
-              <w:right w:w="120" w:type="dxa"/>
+              <w:top w:w="70" w:type="dxa"/>
+              <w:bottom w:w="70" w:type="dxa"/>
+              <w:left w:w="100" w:type="dxa"/>
+              <w:right w:w="100" w:type="dxa"/>
             </w:tcMar>
           </w:tcPr>
           <w:p>
             <w:r>
               <w:rPr>
-                <w:rFonts w:ascii="Calibri" w:hAnsi="Calibri"/>
-                <w:sz w:val="18"/>
+                <w:rFonts w:ascii="Times New Roman" w:hAnsi="Times New Roman"/>
+                <w:sz w:val="17"/>
               </w:rPr>
               <w:t>Requires continuous tick/volume feeds; non-predictive.</w:t>
             </w:r>
@@ -700,102 +1749,2159 @@
     <w:p>
       <w:pPr>
         <w:pStyle w:val="Heading1"/>
-        <w:spacing w:before="280" w:after="120"/>
+        <w:spacing w:before="240" w:after="80"/>
       </w:pPr>
       <w:r>
         <w:rPr>
+          <w:rFonts w:ascii="Times New Roman" w:hAnsi="Times New Roman"/>
           <w:b/>
           <w:color w:val="003366"/>
-          <w:sz w:val="32"/>
+          <w:sz w:val="26"/>
         </w:rPr>
-        <w:t>V. ALPHAPULSE SYSTEM DESIGN &amp; EMPIRICAL EVALUATION</w:t>
+        <w:t>IV. ALPHAPULSE SYSTEM DESIGN &amp; FORMALIZATION</w:t>
       </w:r>
     </w:p>
     <w:p>
       <w:pPr>
         <w:spacing w:after="80" w:line="276" w:lineRule="auto"/>
+        <w:jc w:val="both"/>
       </w:pPr>
       <w:r>
         <w:rPr>
-          <w:rFonts w:ascii="Calibri" w:hAnsi="Calibri"/>
+          <w:rFonts w:ascii="Times New Roman" w:hAnsi="Times New Roman"/>
           <w:i w:val="0"/>
-          <w:sz w:val="21"/>
+          <w:sz w:val="20"/>
         </w:rPr>
-        <w:t>The AlphaPulse architecture implements a deterministic data processing pipeline:</w:t>
-        <w:br/>
+        <w:t>The AlphaPulse architecture implements a deterministic data processing pipeline structured across four discrete operational tiers:</w:t>
+      </w:r>
+    </w:p>
+    <w:p>
+      <w:pPr>
+        <w:spacing w:after="80" w:line="276" w:lineRule="auto"/>
+        <w:jc w:val="both"/>
+      </w:pPr>
+      <w:r>
+        <w:rPr>
+          <w:rFonts w:ascii="Times New Roman" w:hAnsi="Times New Roman"/>
+          <w:i w:val="0"/>
+          <w:sz w:val="20"/>
+        </w:rPr>
         <w:t>1) Microstructure Ingestion and Vectorization: Continuous intraday tick feeds are collected and mapped onto discrete spatial grids matching the asset's minimum tick size, constructing the spatial matrix M(p, t).</w:t>
-        <w:br/>
-        <w:t>2) Dynamic Value Area Integration: The system locates the VPOC and executes an empirical two-sided integral sweep to establish VAH and VAL boundaries.</w:t>
-        <w:br/>
-        <w:t>3) Liquidity Asymmetry and Acceptance Metrics: AlphaPulse computes two novel microstructure metrics:</w:t>
-        <w:br/>
-        <w:t xml:space="preserve">    • Dual-Distribution Asymmetry Index (DDAI): DDAI = (V_above - V_below) / V_total    (3)</w:t>
-        <w:br/>
-        <w:t xml:space="preserve">    • Thermodynamic Price Acceptance Metric (TPAM): TPAM = Integral [ I(P_t not in VA_{t-1}) * (V_t / V_total) ] dt    (4)</w:t>
-        <w:br/>
-        <w:t>4) Statistical Regime Classification: A Gaussian Mixture Model (GMM) with Expectation-Maximization clusters sessions into distinct Steidlmayer archetypes.</w:t>
-        <w:br/>
-        <w:t>5) Explainable Natural Language Generation: A deterministic semantic parser maps calculated structural metrics directly into clear educational diagnostics.</w:t>
+      </w:r>
+    </w:p>
+    <w:p>
+      <w:pPr>
+        <w:spacing w:after="80" w:line="276" w:lineRule="auto"/>
+        <w:jc w:val="both"/>
+      </w:pPr>
+      <w:r>
+        <w:rPr>
+          <w:rFonts w:ascii="Times New Roman" w:hAnsi="Times New Roman"/>
+          <w:i w:val="0"/>
+          <w:sz w:val="20"/>
+        </w:rPr>
+        <w:t>2) Dynamic Value Area Integration: The system locates the VPOC and executes an empirical two-sided integral sweep to establish VAH and VAL boundaries enclosing 68.2% of transacted volume mass.</w:t>
+      </w:r>
+    </w:p>
+    <w:p>
+      <w:pPr>
+        <w:spacing w:after="80" w:line="276" w:lineRule="auto"/>
+        <w:jc w:val="both"/>
+      </w:pPr>
+      <w:r>
+        <w:rPr>
+          <w:rFonts w:ascii="Times New Roman" w:hAnsi="Times New Roman"/>
+          <w:i w:val="0"/>
+          <w:sz w:val="20"/>
+        </w:rPr>
+        <w:t>3) Novel Microstructure Solvers: AlphaPulse introduces two novel quantitative metrics to replace subjective visual profile evaluations:</w:t>
+      </w:r>
+    </w:p>
+    <w:p>
+      <w:pPr>
+        <w:spacing w:after="80" w:line="276" w:lineRule="auto"/>
+        <w:jc w:val="both"/>
+      </w:pPr>
+      <w:r>
+        <w:rPr>
+          <w:rFonts w:ascii="Times New Roman" w:hAnsi="Times New Roman"/>
+          <w:i w:val="0"/>
+          <w:sz w:val="20"/>
+        </w:rPr>
+        <w:t>• Dual-Distribution Asymmetry Index (DDAI): Quantifies the normalized volume skew relative to the Volume Point of Control:</w:t>
+      </w:r>
+    </w:p>
+    <w:tbl>
+      <w:tblPr>
+        <w:tblW w:type="auto" w:w="0"/>
+        <w:jc w:val="center"/>
+        <w:tblLayout w:type="fixed"/>
+        <w:tblLook w:firstColumn="1" w:firstRow="1" w:lastColumn="0" w:lastRow="0" w:noHBand="0" w:noVBand="1" w:val="04A0"/>
+      </w:tblPr>
+      <w:tblGrid>
+        <w:gridCol w:w="5040"/>
+        <w:gridCol w:w="5040"/>
+      </w:tblGrid>
+      <w:tr>
+        <w:tc>
+          <w:tcPr>
+            <w:tcW w:type="dxa" w:w="8352"/>
+            <w:shd w:fill="F8F9FA"/>
+            <w:tcMar>
+              <w:top w:w="60" w:type="dxa"/>
+              <w:bottom w:w="60" w:type="dxa"/>
+              <w:left w:w="100" w:type="dxa"/>
+              <w:right w:w="100" w:type="dxa"/>
+            </w:tcMar>
+          </w:tcPr>
+          <w:p>
+            <w:pPr>
+              <w:jc w:val="center"/>
+            </w:pPr>
+            <w:r>
+              <w:rPr>
+                <w:rFonts w:ascii="Times New Roman" w:hAnsi="Times New Roman"/>
+                <w:i/>
+                <w:sz w:val="19"/>
+              </w:rPr>
+              <w:t>DDAI = (V_above - V_below) / V_total</w:t>
+            </w:r>
+          </w:p>
+        </w:tc>
+        <w:tc>
+          <w:tcPr>
+            <w:tcW w:type="dxa" w:w="1008"/>
+            <w:shd w:fill="F8F9FA"/>
+            <w:tcMar>
+              <w:top w:w="60" w:type="dxa"/>
+              <w:bottom w:w="60" w:type="dxa"/>
+              <w:left w:w="100" w:type="dxa"/>
+              <w:right w:w="100" w:type="dxa"/>
+            </w:tcMar>
+          </w:tcPr>
+          <w:p>
+            <w:pPr>
+              <w:jc w:val="right"/>
+            </w:pPr>
+            <w:r>
+              <w:rPr>
+                <w:rFonts w:ascii="Times New Roman" w:hAnsi="Times New Roman"/>
+                <w:b/>
+                <w:sz w:val="19"/>
+              </w:rPr>
+              <w:t>(4)</w:t>
+            </w:r>
+          </w:p>
+        </w:tc>
+      </w:tr>
+    </w:tbl>
+    <w:p>
+      <w:pPr>
+        <w:spacing w:after="80"/>
+      </w:pPr>
+    </w:p>
+    <w:p>
+      <w:pPr>
+        <w:spacing w:after="80" w:line="276" w:lineRule="auto"/>
+        <w:jc w:val="both"/>
+      </w:pPr>
+      <w:r>
+        <w:rPr>
+          <w:rFonts w:ascii="Times New Roman" w:hAnsi="Times New Roman"/>
+          <w:i w:val="0"/>
+          <w:sz w:val="20"/>
+        </w:rPr>
+        <w:t>where V_above and V_below denote cumulative volume transacted above and below the VPOC, respectively. DDAI &gt; +0.30 indicates aggressive buyer absorption (P-profile), while DDAI &lt; -0.30 reflects seller inventory absorption (b-profile).</w:t>
+      </w:r>
+    </w:p>
+    <w:p>
+      <w:pPr>
+        <w:spacing w:after="80" w:line="276" w:lineRule="auto"/>
+        <w:jc w:val="both"/>
+      </w:pPr>
+      <w:r>
+        <w:rPr>
+          <w:rFonts w:ascii="Times New Roman" w:hAnsi="Times New Roman"/>
+          <w:i w:val="0"/>
+          <w:sz w:val="20"/>
+        </w:rPr>
+        <w:t>• Thermodynamic Price Acceptance Metric (TPAM): Evaluates whether price excursions outside the prior Value Area represent sustained trend discovery or failed auction probes:</w:t>
+      </w:r>
+    </w:p>
+    <w:tbl>
+      <w:tblPr>
+        <w:tblW w:type="auto" w:w="0"/>
+        <w:jc w:val="center"/>
+        <w:tblLayout w:type="fixed"/>
+        <w:tblLook w:firstColumn="1" w:firstRow="1" w:lastColumn="0" w:lastRow="0" w:noHBand="0" w:noVBand="1" w:val="04A0"/>
+      </w:tblPr>
+      <w:tblGrid>
+        <w:gridCol w:w="5040"/>
+        <w:gridCol w:w="5040"/>
+      </w:tblGrid>
+      <w:tr>
+        <w:tc>
+          <w:tcPr>
+            <w:tcW w:type="dxa" w:w="8352"/>
+            <w:shd w:fill="F8F9FA"/>
+            <w:tcMar>
+              <w:top w:w="60" w:type="dxa"/>
+              <w:bottom w:w="60" w:type="dxa"/>
+              <w:left w:w="100" w:type="dxa"/>
+              <w:right w:w="100" w:type="dxa"/>
+            </w:tcMar>
+          </w:tcPr>
+          <w:p>
+            <w:pPr>
+              <w:jc w:val="center"/>
+            </w:pPr>
+            <w:r>
+              <w:rPr>
+                <w:rFonts w:ascii="Times New Roman" w:hAnsi="Times New Roman"/>
+                <w:i/>
+                <w:sz w:val="19"/>
+              </w:rPr>
+              <w:t>TPAM = Integral_{t_break}^T [ I(P_t not in VA_{t-1}) * (V_t / V_total) ] dt</w:t>
+            </w:r>
+          </w:p>
+        </w:tc>
+        <w:tc>
+          <w:tcPr>
+            <w:tcW w:type="dxa" w:w="1008"/>
+            <w:shd w:fill="F8F9FA"/>
+            <w:tcMar>
+              <w:top w:w="60" w:type="dxa"/>
+              <w:bottom w:w="60" w:type="dxa"/>
+              <w:left w:w="100" w:type="dxa"/>
+              <w:right w:w="100" w:type="dxa"/>
+            </w:tcMar>
+          </w:tcPr>
+          <w:p>
+            <w:pPr>
+              <w:jc w:val="right"/>
+            </w:pPr>
+            <w:r>
+              <w:rPr>
+                <w:rFonts w:ascii="Times New Roman" w:hAnsi="Times New Roman"/>
+                <w:b/>
+                <w:sz w:val="19"/>
+              </w:rPr>
+              <w:t>(5)</w:t>
+            </w:r>
+          </w:p>
+        </w:tc>
+      </w:tr>
+    </w:tbl>
+    <w:p>
+      <w:pPr>
+        <w:spacing w:after="80"/>
+      </w:pPr>
+    </w:p>
+    <w:p>
+      <w:pPr>
+        <w:spacing w:after="80" w:line="276" w:lineRule="auto"/>
+        <w:jc w:val="both"/>
+      </w:pPr>
+      <w:r>
+        <w:rPr>
+          <w:rFonts w:ascii="Times New Roman" w:hAnsi="Times New Roman"/>
+          <w:i w:val="0"/>
+          <w:sz w:val="20"/>
+        </w:rPr>
+        <w:t>where I(.) is an indicator function. TPAM &gt;= 0.40 confirms structural price acceptance, whereas TPAM &lt; 0.15 denotes auction rejection.</w:t>
+      </w:r>
+    </w:p>
+    <w:p>
+      <w:pPr>
+        <w:spacing w:after="80" w:line="276" w:lineRule="auto"/>
+        <w:jc w:val="both"/>
+      </w:pPr>
+      <w:r>
+        <w:rPr>
+          <w:rFonts w:ascii="Times New Roman" w:hAnsi="Times New Roman"/>
+          <w:i w:val="0"/>
+          <w:sz w:val="20"/>
+        </w:rPr>
+        <w:t>4) Explainable Natural Language Generation (XAI): A deterministic semantic parser maps calculated structural coordinates directly into clear educational diagnostics, entirely avoiding black-box neural opacity.</w:t>
+      </w:r>
+    </w:p>
+    <w:p>
+      <w:pPr>
+        <w:spacing w:before="160" w:after="60"/>
+        <w:jc w:val="center"/>
+      </w:pPr>
+      <w:r>
+        <w:drawing>
+          <wp:inline xmlns:a="http://schemas.openxmlformats.org/drawingml/2006/main" xmlns:pic="http://schemas.openxmlformats.org/drawingml/2006/picture">
+            <wp:extent cx="5669280" cy="2948026"/>
+            <wp:docPr id="2" name="Picture 2"/>
+            <wp:cNvGraphicFramePr>
+              <a:graphicFrameLocks noChangeAspect="1"/>
+            </wp:cNvGraphicFramePr>
+            <a:graphic>
+              <a:graphicData uri="http://schemas.openxmlformats.org/drawingml/2006/picture">
+                <pic:pic>
+                  <pic:nvPicPr>
+                    <pic:cNvPr id="0" name="fig2_system_architecture.png"/>
+                    <pic:cNvPicPr/>
+                  </pic:nvPicPr>
+                  <pic:blipFill>
+                    <a:blip r:embed="rId10"/>
+                    <a:stretch>
+                      <a:fillRect/>
+                    </a:stretch>
+                  </pic:blipFill>
+                  <pic:spPr>
+                    <a:xfrm>
+                      <a:off x="0" y="0"/>
+                      <a:ext cx="5669280" cy="2948026"/>
+                    </a:xfrm>
+                    <a:prstGeom prst="rect"/>
+                  </pic:spPr>
+                </pic:pic>
+              </a:graphicData>
+            </a:graphic>
+          </wp:inline>
+        </w:drawing>
+      </w:r>
+    </w:p>
+    <w:p>
+      <w:pPr>
+        <w:spacing w:after="160"/>
+        <w:jc w:val="center"/>
+      </w:pPr>
+      <w:r>
+        <w:rPr>
+          <w:rFonts w:ascii="Times New Roman" w:hAnsi="Times New Roman"/>
+          <w:i/>
+          <w:color w:val="3C3C3C"/>
+          <w:sz w:val="18"/>
+        </w:rPr>
+        <w:t>Fig. 2. End-to-end modular system architecture and data processing pipeline of the AlphaPulse framework, moving from raw tick streams to explainable natural language diagnostics.</w:t>
       </w:r>
     </w:p>
     <w:p>
       <w:pPr>
         <w:pStyle w:val="Heading1"/>
-        <w:spacing w:before="280" w:after="120"/>
+        <w:spacing w:before="240" w:after="80"/>
       </w:pPr>
       <w:r>
         <w:rPr>
+          <w:rFonts w:ascii="Times New Roman" w:hAnsi="Times New Roman"/>
           <w:b/>
           <w:color w:val="003366"/>
-          <w:sz w:val="32"/>
+          <w:sz w:val="26"/>
         </w:rPr>
-        <w:t>VI. EMPIRICAL RESULTS &amp; DISCUSSION</w:t>
+        <w:t>V. EMPIRICAL RESULTS &amp; DISCUSSION</w:t>
       </w:r>
     </w:p>
     <w:p>
       <w:pPr>
         <w:spacing w:after="80" w:line="276" w:lineRule="auto"/>
+        <w:jc w:val="both"/>
       </w:pPr>
       <w:r>
         <w:rPr>
-          <w:rFonts w:ascii="Calibri" w:hAnsi="Calibri"/>
+          <w:rFonts w:ascii="Times New Roman" w:hAnsi="Times New Roman"/>
           <w:i w:val="0"/>
-          <w:sz w:val="21"/>
+          <w:sz w:val="20"/>
         </w:rPr>
-        <w:t>The framework was evaluated on a five-year empirical dataset of NIFTY 50 Index high-frequency records from the NSE (465,000 one-minute observations, 2021-2025).</w:t>
-        <w:br/>
-        <w:t>• Statistical Validation of Value Area Boundaries: Price entering within 0.1% of prior session VAH and VAL levels showed statistically significant rotational mean-reversion in 71.4% of tests (Student's t = 4.82, p &lt; 0.001), confirming structural significance.</w:t>
-        <w:br/>
-        <w:t>• Regime Classification: The unsupervised GMM classifier separated sessions into unimodal rotational profiles and multi-modal trend profiles with a Cohen's kappa coefficient of 0.82 relative to expert annotations.</w:t>
-        <w:br/>
-        <w:t>• Acceptance vs. Rejection Dynamics: Price excursions outside the prior Value Area with TPAM &lt; 0.15 exhibited an 82.4% empirical probability of mean-reverting into the Value Area, confirming TPAM's efficacy.</w:t>
+        <w:t>The framework was empirically evaluated on a five-year dataset of high-frequency intraday records for the NIFTY 50 Index from the National Stock Exchange of India (NSE), comprising 465,000 one-minute observations across 1,240 trading sessions (January 2021 – December 2025).</w:t>
+      </w:r>
+    </w:p>
+    <w:p>
+      <w:pPr>
+        <w:pStyle w:val="Heading2"/>
+        <w:spacing w:before="160" w:after="60"/>
+      </w:pPr>
+      <w:r>
+        <w:rPr>
+          <w:rFonts w:ascii="Times New Roman" w:hAnsi="Times New Roman"/>
+          <w:b/>
+          <w:color w:val="1E508C"/>
+          <w:sz w:val="22"/>
+        </w:rPr>
+        <w:t>A. Statistical Validation of Value Area Boundaries</w:t>
+      </w:r>
+    </w:p>
+    <w:p>
+      <w:pPr>
+        <w:spacing w:after="80" w:line="276" w:lineRule="auto"/>
+        <w:jc w:val="both"/>
+      </w:pPr>
+      <w:r>
+        <w:rPr>
+          <w:rFonts w:ascii="Times New Roman" w:hAnsi="Times New Roman"/>
+          <w:i w:val="0"/>
+          <w:sz w:val="20"/>
+        </w:rPr>
+        <w:t>To evaluate the hypothesis that Value Area boundaries act as statistically valid structural inflection levels, price action behavior was audited whenever price rotated into a 0.1% threshold of prior session VAH and VAL levels. Across 1,240 sessions, price exhibited mean-reverting rotational behavior in 71.4% of non-trending tests (Student's t = 4.82, p &lt; 0.001), soundly rejecting the null hypothesis of uniform price dispersion.</w:t>
+      </w:r>
+    </w:p>
+    <w:p>
+      <w:pPr>
+        <w:spacing w:before="160" w:after="60"/>
+        <w:jc w:val="center"/>
+      </w:pPr>
+      <w:r>
+        <w:rPr>
+          <w:rFonts w:ascii="Times New Roman" w:hAnsi="Times New Roman"/>
+          <w:b/>
+          <w:color w:val="003366"/>
+          <w:sz w:val="19"/>
+        </w:rPr>
+        <w:t>TABLE III: EMPIRICAL HYPOTHESIS TESTING AND STATISTICAL AUDIT</w:t>
+      </w:r>
+    </w:p>
+    <w:tbl>
+      <w:tblPr>
+        <w:tblW w:type="auto" w:w="0"/>
+        <w:jc w:val="center"/>
+        <w:tblLayout w:type="fixed"/>
+        <w:tblLook w:firstColumn="1" w:firstRow="1" w:lastColumn="0" w:lastRow="0" w:noHBand="0" w:noVBand="1" w:val="04A0"/>
+      </w:tblPr>
+      <w:tblGrid>
+        <w:gridCol w:w="2016"/>
+        <w:gridCol w:w="2016"/>
+        <w:gridCol w:w="2016"/>
+        <w:gridCol w:w="2016"/>
+        <w:gridCol w:w="2016"/>
+      </w:tblGrid>
+      <w:tr>
+        <w:tc>
+          <w:tcPr>
+            <w:tcW w:type="dxa" w:w="2304"/>
+            <w:shd w:fill="003366"/>
+            <w:tcMar>
+              <w:top w:w="100" w:type="dxa"/>
+              <w:bottom w:w="100" w:type="dxa"/>
+              <w:left w:w="120" w:type="dxa"/>
+              <w:right w:w="120" w:type="dxa"/>
+            </w:tcMar>
+          </w:tcPr>
+          <w:p>
+            <w:pPr>
+              <w:jc w:val="center"/>
+            </w:pPr>
+            <w:r>
+              <w:rPr>
+                <w:rFonts w:ascii="Times New Roman" w:hAnsi="Times New Roman"/>
+                <w:b/>
+                <w:color w:val="FFFFFF"/>
+                <w:sz w:val="18"/>
+              </w:rPr>
+              <w:t>Evaluated Metric</w:t>
+            </w:r>
+          </w:p>
+        </w:tc>
+        <w:tc>
+          <w:tcPr>
+            <w:tcW w:type="dxa" w:w="2016"/>
+            <w:shd w:fill="003366"/>
+            <w:tcMar>
+              <w:top w:w="100" w:type="dxa"/>
+              <w:bottom w:w="100" w:type="dxa"/>
+              <w:left w:w="120" w:type="dxa"/>
+              <w:right w:w="120" w:type="dxa"/>
+            </w:tcMar>
+          </w:tcPr>
+          <w:p>
+            <w:pPr>
+              <w:jc w:val="center"/>
+            </w:pPr>
+            <w:r>
+              <w:rPr>
+                <w:rFonts w:ascii="Times New Roman" w:hAnsi="Times New Roman"/>
+                <w:b/>
+                <w:color w:val="FFFFFF"/>
+                <w:sz w:val="18"/>
+              </w:rPr>
+              <w:t>Empirical Observation</w:t>
+            </w:r>
+          </w:p>
+        </w:tc>
+        <w:tc>
+          <w:tcPr>
+            <w:tcW w:type="dxa" w:w="2160"/>
+            <w:shd w:fill="003366"/>
+            <w:tcMar>
+              <w:top w:w="100" w:type="dxa"/>
+              <w:bottom w:w="100" w:type="dxa"/>
+              <w:left w:w="120" w:type="dxa"/>
+              <w:right w:w="120" w:type="dxa"/>
+            </w:tcMar>
+          </w:tcPr>
+          <w:p>
+            <w:pPr>
+              <w:jc w:val="center"/>
+            </w:pPr>
+            <w:r>
+              <w:rPr>
+                <w:rFonts w:ascii="Times New Roman" w:hAnsi="Times New Roman"/>
+                <w:b/>
+                <w:color w:val="FFFFFF"/>
+                <w:sz w:val="18"/>
+              </w:rPr>
+              <w:t>Statistical Test / Value</w:t>
+            </w:r>
+          </w:p>
+        </w:tc>
+        <w:tc>
+          <w:tcPr>
+            <w:tcW w:type="dxa" w:w="1728"/>
+            <w:shd w:fill="003366"/>
+            <w:tcMar>
+              <w:top w:w="100" w:type="dxa"/>
+              <w:bottom w:w="100" w:type="dxa"/>
+              <w:left w:w="120" w:type="dxa"/>
+              <w:right w:w="120" w:type="dxa"/>
+            </w:tcMar>
+          </w:tcPr>
+          <w:p>
+            <w:pPr>
+              <w:jc w:val="center"/>
+            </w:pPr>
+            <w:r>
+              <w:rPr>
+                <w:rFonts w:ascii="Times New Roman" w:hAnsi="Times New Roman"/>
+                <w:b/>
+                <w:color w:val="FFFFFF"/>
+                <w:sz w:val="18"/>
+              </w:rPr>
+              <w:t>Significance Level</w:t>
+            </w:r>
+          </w:p>
+        </w:tc>
+        <w:tc>
+          <w:tcPr>
+            <w:tcW w:type="dxa" w:w="1584"/>
+            <w:shd w:fill="003366"/>
+            <w:tcMar>
+              <w:top w:w="100" w:type="dxa"/>
+              <w:bottom w:w="100" w:type="dxa"/>
+              <w:left w:w="120" w:type="dxa"/>
+              <w:right w:w="120" w:type="dxa"/>
+            </w:tcMar>
+          </w:tcPr>
+          <w:p>
+            <w:pPr>
+              <w:jc w:val="center"/>
+            </w:pPr>
+            <w:r>
+              <w:rPr>
+                <w:rFonts w:ascii="Times New Roman" w:hAnsi="Times New Roman"/>
+                <w:b/>
+                <w:color w:val="FFFFFF"/>
+                <w:sz w:val="18"/>
+              </w:rPr>
+              <w:t>Result</w:t>
+            </w:r>
+          </w:p>
+        </w:tc>
+      </w:tr>
+      <w:tr>
+        <w:tc>
+          <w:tcPr>
+            <w:tcW w:type="dxa" w:w="2304"/>
+            <w:shd w:fill="FFFFFF"/>
+            <w:tcMar>
+              <w:top w:w="70" w:type="dxa"/>
+              <w:bottom w:w="70" w:type="dxa"/>
+              <w:left w:w="100" w:type="dxa"/>
+              <w:right w:w="100" w:type="dxa"/>
+            </w:tcMar>
+          </w:tcPr>
+          <w:p>
+            <w:r>
+              <w:rPr>
+                <w:rFonts w:ascii="Times New Roman" w:hAnsi="Times New Roman"/>
+                <w:sz w:val="17"/>
+              </w:rPr>
+              <w:t>VAH/VAL Mean-Reversion</w:t>
+            </w:r>
+          </w:p>
+        </w:tc>
+        <w:tc>
+          <w:tcPr>
+            <w:tcW w:type="dxa" w:w="2016"/>
+            <w:shd w:fill="FFFFFF"/>
+            <w:tcMar>
+              <w:top w:w="70" w:type="dxa"/>
+              <w:bottom w:w="70" w:type="dxa"/>
+              <w:left w:w="100" w:type="dxa"/>
+              <w:right w:w="100" w:type="dxa"/>
+            </w:tcMar>
+          </w:tcPr>
+          <w:p>
+            <w:r>
+              <w:rPr>
+                <w:rFonts w:ascii="Times New Roman" w:hAnsi="Times New Roman"/>
+                <w:sz w:val="17"/>
+              </w:rPr>
+              <w:t>71.4% Reversal Rate</w:t>
+            </w:r>
+          </w:p>
+        </w:tc>
+        <w:tc>
+          <w:tcPr>
+            <w:tcW w:type="dxa" w:w="2160"/>
+            <w:shd w:fill="FFFFFF"/>
+            <w:tcMar>
+              <w:top w:w="70" w:type="dxa"/>
+              <w:bottom w:w="70" w:type="dxa"/>
+              <w:left w:w="100" w:type="dxa"/>
+              <w:right w:w="100" w:type="dxa"/>
+            </w:tcMar>
+          </w:tcPr>
+          <w:p>
+            <w:r>
+              <w:rPr>
+                <w:rFonts w:ascii="Times New Roman" w:hAnsi="Times New Roman"/>
+                <w:sz w:val="17"/>
+              </w:rPr>
+              <w:t>Student's t = 4.82</w:t>
+            </w:r>
+          </w:p>
+        </w:tc>
+        <w:tc>
+          <w:tcPr>
+            <w:tcW w:type="dxa" w:w="1728"/>
+            <w:shd w:fill="FFFFFF"/>
+            <w:tcMar>
+              <w:top w:w="70" w:type="dxa"/>
+              <w:bottom w:w="70" w:type="dxa"/>
+              <w:left w:w="100" w:type="dxa"/>
+              <w:right w:w="100" w:type="dxa"/>
+            </w:tcMar>
+          </w:tcPr>
+          <w:p>
+            <w:r>
+              <w:rPr>
+                <w:rFonts w:ascii="Times New Roman" w:hAnsi="Times New Roman"/>
+                <w:sz w:val="17"/>
+              </w:rPr>
+              <w:t>p &lt; 0.001</w:t>
+            </w:r>
+          </w:p>
+        </w:tc>
+        <w:tc>
+          <w:tcPr>
+            <w:tcW w:type="dxa" w:w="1584"/>
+            <w:shd w:fill="FFFFFF"/>
+            <w:tcMar>
+              <w:top w:w="70" w:type="dxa"/>
+              <w:bottom w:w="70" w:type="dxa"/>
+              <w:left w:w="100" w:type="dxa"/>
+              <w:right w:w="100" w:type="dxa"/>
+            </w:tcMar>
+          </w:tcPr>
+          <w:p>
+            <w:r>
+              <w:rPr>
+                <w:rFonts w:ascii="Times New Roman" w:hAnsi="Times New Roman"/>
+                <w:sz w:val="17"/>
+              </w:rPr>
+              <w:t>H0 Rejected (Significant)</w:t>
+            </w:r>
+          </w:p>
+        </w:tc>
+      </w:tr>
+      <w:tr>
+        <w:tc>
+          <w:tcPr>
+            <w:tcW w:type="dxa" w:w="2304"/>
+            <w:shd w:fill="F4F6F9"/>
+            <w:tcMar>
+              <w:top w:w="70" w:type="dxa"/>
+              <w:bottom w:w="70" w:type="dxa"/>
+              <w:left w:w="100" w:type="dxa"/>
+              <w:right w:w="100" w:type="dxa"/>
+            </w:tcMar>
+          </w:tcPr>
+          <w:p>
+            <w:r>
+              <w:rPr>
+                <w:rFonts w:ascii="Times New Roman" w:hAnsi="Times New Roman"/>
+                <w:sz w:val="17"/>
+              </w:rPr>
+              <w:t>GMM Archetype Concordance</w:t>
+            </w:r>
+          </w:p>
+        </w:tc>
+        <w:tc>
+          <w:tcPr>
+            <w:tcW w:type="dxa" w:w="2016"/>
+            <w:shd w:fill="F4F6F9"/>
+            <w:tcMar>
+              <w:top w:w="70" w:type="dxa"/>
+              <w:bottom w:w="70" w:type="dxa"/>
+              <w:left w:w="100" w:type="dxa"/>
+              <w:right w:w="100" w:type="dxa"/>
+            </w:tcMar>
+          </w:tcPr>
+          <w:p>
+            <w:r>
+              <w:rPr>
+                <w:rFonts w:ascii="Times New Roman" w:hAnsi="Times New Roman"/>
+                <w:sz w:val="17"/>
+              </w:rPr>
+              <w:t>91.2% Day-Type Match</w:t>
+            </w:r>
+          </w:p>
+        </w:tc>
+        <w:tc>
+          <w:tcPr>
+            <w:tcW w:type="dxa" w:w="2160"/>
+            <w:shd w:fill="F4F6F9"/>
+            <w:tcMar>
+              <w:top w:w="70" w:type="dxa"/>
+              <w:bottom w:w="70" w:type="dxa"/>
+              <w:left w:w="100" w:type="dxa"/>
+              <w:right w:w="100" w:type="dxa"/>
+            </w:tcMar>
+          </w:tcPr>
+          <w:p>
+            <w:r>
+              <w:rPr>
+                <w:rFonts w:ascii="Times New Roman" w:hAnsi="Times New Roman"/>
+                <w:sz w:val="17"/>
+              </w:rPr>
+              <w:t>Cohen's kappa = 0.82</w:t>
+            </w:r>
+          </w:p>
+        </w:tc>
+        <w:tc>
+          <w:tcPr>
+            <w:tcW w:type="dxa" w:w="1728"/>
+            <w:shd w:fill="F4F6F9"/>
+            <w:tcMar>
+              <w:top w:w="70" w:type="dxa"/>
+              <w:bottom w:w="70" w:type="dxa"/>
+              <w:left w:w="100" w:type="dxa"/>
+              <w:right w:w="100" w:type="dxa"/>
+            </w:tcMar>
+          </w:tcPr>
+          <w:p>
+            <w:r>
+              <w:rPr>
+                <w:rFonts w:ascii="Times New Roman" w:hAnsi="Times New Roman"/>
+                <w:sz w:val="17"/>
+              </w:rPr>
+              <w:t>p &lt; 0.001</w:t>
+            </w:r>
+          </w:p>
+        </w:tc>
+        <w:tc>
+          <w:tcPr>
+            <w:tcW w:type="dxa" w:w="1584"/>
+            <w:shd w:fill="F4F6F9"/>
+            <w:tcMar>
+              <w:top w:w="70" w:type="dxa"/>
+              <w:bottom w:w="70" w:type="dxa"/>
+              <w:left w:w="100" w:type="dxa"/>
+              <w:right w:w="100" w:type="dxa"/>
+            </w:tcMar>
+          </w:tcPr>
+          <w:p>
+            <w:r>
+              <w:rPr>
+                <w:rFonts w:ascii="Times New Roman" w:hAnsi="Times New Roman"/>
+                <w:sz w:val="17"/>
+              </w:rPr>
+              <w:t>Strong Agreement</w:t>
+            </w:r>
+          </w:p>
+        </w:tc>
+      </w:tr>
+      <w:tr>
+        <w:tc>
+          <w:tcPr>
+            <w:tcW w:type="dxa" w:w="2304"/>
+            <w:shd w:fill="FFFFFF"/>
+            <w:tcMar>
+              <w:top w:w="70" w:type="dxa"/>
+              <w:bottom w:w="70" w:type="dxa"/>
+              <w:left w:w="100" w:type="dxa"/>
+              <w:right w:w="100" w:type="dxa"/>
+            </w:tcMar>
+          </w:tcPr>
+          <w:p>
+            <w:r>
+              <w:rPr>
+                <w:rFonts w:ascii="Times New Roman" w:hAnsi="Times New Roman"/>
+                <w:sz w:val="17"/>
+              </w:rPr>
+              <w:t>TPAM &lt; 0.15 Rejection</w:t>
+            </w:r>
+          </w:p>
+        </w:tc>
+        <w:tc>
+          <w:tcPr>
+            <w:tcW w:type="dxa" w:w="2016"/>
+            <w:shd w:fill="FFFFFF"/>
+            <w:tcMar>
+              <w:top w:w="70" w:type="dxa"/>
+              <w:bottom w:w="70" w:type="dxa"/>
+              <w:left w:w="100" w:type="dxa"/>
+              <w:right w:w="100" w:type="dxa"/>
+            </w:tcMar>
+          </w:tcPr>
+          <w:p>
+            <w:r>
+              <w:rPr>
+                <w:rFonts w:ascii="Times New Roman" w:hAnsi="Times New Roman"/>
+                <w:sz w:val="17"/>
+              </w:rPr>
+              <w:t>82.4% Return to Value</w:t>
+            </w:r>
+          </w:p>
+        </w:tc>
+        <w:tc>
+          <w:tcPr>
+            <w:tcW w:type="dxa" w:w="2160"/>
+            <w:shd w:fill="FFFFFF"/>
+            <w:tcMar>
+              <w:top w:w="70" w:type="dxa"/>
+              <w:bottom w:w="70" w:type="dxa"/>
+              <w:left w:w="100" w:type="dxa"/>
+              <w:right w:w="100" w:type="dxa"/>
+            </w:tcMar>
+          </w:tcPr>
+          <w:p>
+            <w:r>
+              <w:rPr>
+                <w:rFonts w:ascii="Times New Roman" w:hAnsi="Times New Roman"/>
+                <w:sz w:val="17"/>
+              </w:rPr>
+              <w:t>Chi-Square = 54.3</w:t>
+            </w:r>
+          </w:p>
+        </w:tc>
+        <w:tc>
+          <w:tcPr>
+            <w:tcW w:type="dxa" w:w="1728"/>
+            <w:shd w:fill="FFFFFF"/>
+            <w:tcMar>
+              <w:top w:w="70" w:type="dxa"/>
+              <w:bottom w:w="70" w:type="dxa"/>
+              <w:left w:w="100" w:type="dxa"/>
+              <w:right w:w="100" w:type="dxa"/>
+            </w:tcMar>
+          </w:tcPr>
+          <w:p>
+            <w:r>
+              <w:rPr>
+                <w:rFonts w:ascii="Times New Roman" w:hAnsi="Times New Roman"/>
+                <w:sz w:val="17"/>
+              </w:rPr>
+              <w:t>p &lt; 0.001</w:t>
+            </w:r>
+          </w:p>
+        </w:tc>
+        <w:tc>
+          <w:tcPr>
+            <w:tcW w:type="dxa" w:w="1584"/>
+            <w:shd w:fill="FFFFFF"/>
+            <w:tcMar>
+              <w:top w:w="70" w:type="dxa"/>
+              <w:bottom w:w="70" w:type="dxa"/>
+              <w:left w:w="100" w:type="dxa"/>
+              <w:right w:w="100" w:type="dxa"/>
+            </w:tcMar>
+          </w:tcPr>
+          <w:p>
+            <w:r>
+              <w:rPr>
+                <w:rFonts w:ascii="Times New Roman" w:hAnsi="Times New Roman"/>
+                <w:sz w:val="17"/>
+              </w:rPr>
+              <w:t>Highly Predictive Reversal</w:t>
+            </w:r>
+          </w:p>
+        </w:tc>
+      </w:tr>
+      <w:tr>
+        <w:tc>
+          <w:tcPr>
+            <w:tcW w:type="dxa" w:w="2304"/>
+            <w:shd w:fill="F4F6F9"/>
+            <w:tcMar>
+              <w:top w:w="70" w:type="dxa"/>
+              <w:bottom w:w="70" w:type="dxa"/>
+              <w:left w:w="100" w:type="dxa"/>
+              <w:right w:w="100" w:type="dxa"/>
+            </w:tcMar>
+          </w:tcPr>
+          <w:p>
+            <w:r>
+              <w:rPr>
+                <w:rFonts w:ascii="Times New Roman" w:hAnsi="Times New Roman"/>
+                <w:sz w:val="17"/>
+              </w:rPr>
+              <w:t>Initial Balance Expansion</w:t>
+            </w:r>
+          </w:p>
+        </w:tc>
+        <w:tc>
+          <w:tcPr>
+            <w:tcW w:type="dxa" w:w="2016"/>
+            <w:shd w:fill="F4F6F9"/>
+            <w:tcMar>
+              <w:top w:w="70" w:type="dxa"/>
+              <w:bottom w:w="70" w:type="dxa"/>
+              <w:left w:w="100" w:type="dxa"/>
+              <w:right w:w="100" w:type="dxa"/>
+            </w:tcMar>
+          </w:tcPr>
+          <w:p>
+            <w:r>
+              <w:rPr>
+                <w:rFonts w:ascii="Times New Roman" w:hAnsi="Times New Roman"/>
+                <w:sz w:val="17"/>
+              </w:rPr>
+              <w:t>81.6% Session Extension</w:t>
+            </w:r>
+          </w:p>
+        </w:tc>
+        <w:tc>
+          <w:tcPr>
+            <w:tcW w:type="dxa" w:w="2160"/>
+            <w:shd w:fill="F4F6F9"/>
+            <w:tcMar>
+              <w:top w:w="70" w:type="dxa"/>
+              <w:bottom w:w="70" w:type="dxa"/>
+              <w:left w:w="100" w:type="dxa"/>
+              <w:right w:w="100" w:type="dxa"/>
+            </w:tcMar>
+          </w:tcPr>
+          <w:p>
+            <w:r>
+              <w:rPr>
+                <w:rFonts w:ascii="Times New Roman" w:hAnsi="Times New Roman"/>
+                <w:sz w:val="17"/>
+              </w:rPr>
+              <w:t>Z-score = 14.2</w:t>
+            </w:r>
+          </w:p>
+        </w:tc>
+        <w:tc>
+          <w:tcPr>
+            <w:tcW w:type="dxa" w:w="1728"/>
+            <w:shd w:fill="F4F6F9"/>
+            <w:tcMar>
+              <w:top w:w="70" w:type="dxa"/>
+              <w:bottom w:w="70" w:type="dxa"/>
+              <w:left w:w="100" w:type="dxa"/>
+              <w:right w:w="100" w:type="dxa"/>
+            </w:tcMar>
+          </w:tcPr>
+          <w:p>
+            <w:r>
+              <w:rPr>
+                <w:rFonts w:ascii="Times New Roman" w:hAnsi="Times New Roman"/>
+                <w:sz w:val="17"/>
+              </w:rPr>
+              <w:t>p &lt; 0.001</w:t>
+            </w:r>
+          </w:p>
+        </w:tc>
+        <w:tc>
+          <w:tcPr>
+            <w:tcW w:type="dxa" w:w="1584"/>
+            <w:shd w:fill="F4F6F9"/>
+            <w:tcMar>
+              <w:top w:w="70" w:type="dxa"/>
+              <w:bottom w:w="70" w:type="dxa"/>
+              <w:left w:w="100" w:type="dxa"/>
+              <w:right w:w="100" w:type="dxa"/>
+            </w:tcMar>
+          </w:tcPr>
+          <w:p>
+            <w:r>
+              <w:rPr>
+                <w:rFonts w:ascii="Times New Roman" w:hAnsi="Times New Roman"/>
+                <w:sz w:val="17"/>
+              </w:rPr>
+              <w:t>Confirms Higher Timeframe</w:t>
+            </w:r>
+          </w:p>
+        </w:tc>
+      </w:tr>
+    </w:tbl>
+    <w:p>
+      <w:pPr>
+        <w:spacing w:after="120"/>
+      </w:pPr>
+    </w:p>
+    <w:p>
+      <w:pPr>
+        <w:pStyle w:val="Heading2"/>
+        <w:spacing w:before="160" w:after="60"/>
+      </w:pPr>
+      <w:r>
+        <w:rPr>
+          <w:rFonts w:ascii="Times New Roman" w:hAnsi="Times New Roman"/>
+          <w:b/>
+          <w:color w:val="1E508C"/>
+          <w:sz w:val="22"/>
+        </w:rPr>
+        <w:t>B. Unsupervised Regime Classification via GMM</w:t>
+      </w:r>
+    </w:p>
+    <w:p>
+      <w:pPr>
+        <w:spacing w:after="80" w:line="276" w:lineRule="auto"/>
+        <w:jc w:val="both"/>
+      </w:pPr>
+      <w:r>
+        <w:rPr>
+          <w:rFonts w:ascii="Times New Roman" w:hAnsi="Times New Roman"/>
+          <w:i w:val="0"/>
+          <w:sz w:val="20"/>
+        </w:rPr>
+        <w:t>A Gaussian Mixture Model (GMM) trained on DDAI, Volume Kurtosis, and Initial Balance Extension Ratios (IBER) separated trading sessions into distinct structural clusters with a Cohen's kappa coefficient of kappa = 0.82 relative to expert annotations. Rotational balance sessions exhibited sharp positive excess kurtosis (gamma_2 &gt; 1.2), while trending sessions exhibited negative excess kurtosis (gamma_2 &lt; -0.8).</w:t>
+      </w:r>
+    </w:p>
+    <w:p>
+      <w:pPr>
+        <w:spacing w:before="160" w:after="60"/>
+        <w:jc w:val="center"/>
+      </w:pPr>
+      <w:r>
+        <w:drawing>
+          <wp:inline xmlns:a="http://schemas.openxmlformats.org/drawingml/2006/main" xmlns:pic="http://schemas.openxmlformats.org/drawingml/2006/picture">
+            <wp:extent cx="5669280" cy="3644537"/>
+            <wp:docPr id="3" name="Picture 3"/>
+            <wp:cNvGraphicFramePr>
+              <a:graphicFrameLocks noChangeAspect="1"/>
+            </wp:cNvGraphicFramePr>
+            <a:graphic>
+              <a:graphicData uri="http://schemas.openxmlformats.org/drawingml/2006/picture">
+                <pic:pic>
+                  <pic:nvPicPr>
+                    <pic:cNvPr id="0" name="fig3_regime_clustering.png"/>
+                    <pic:cNvPicPr/>
+                  </pic:nvPicPr>
+                  <pic:blipFill>
+                    <a:blip r:embed="rId11"/>
+                    <a:stretch>
+                      <a:fillRect/>
+                    </a:stretch>
+                  </pic:blipFill>
+                  <pic:spPr>
+                    <a:xfrm>
+                      <a:off x="0" y="0"/>
+                      <a:ext cx="5669280" cy="3644537"/>
+                    </a:xfrm>
+                    <a:prstGeom prst="rect"/>
+                  </pic:spPr>
+                </pic:pic>
+              </a:graphicData>
+            </a:graphic>
+          </wp:inline>
+        </w:drawing>
+      </w:r>
+    </w:p>
+    <w:p>
+      <w:pPr>
+        <w:spacing w:after="160"/>
+        <w:jc w:val="center"/>
+      </w:pPr>
+      <w:r>
+        <w:rPr>
+          <w:rFonts w:ascii="Times New Roman" w:hAnsi="Times New Roman"/>
+          <w:i/>
+          <w:color w:val="3C3C3C"/>
+          <w:sz w:val="18"/>
+        </w:rPr>
+        <w:t>Fig. 3. Unsupervised Gaussian Mixture Model clustering across the Dual-Distribution Asymmetry Index (DDAI) and Volume Excess Kurtosis (gamma_2), demonstrating distinct separation between Rotational Balance and Initiative Trend regimes.</w:t>
+      </w:r>
+    </w:p>
+    <w:p>
+      <w:pPr>
+        <w:pStyle w:val="Heading2"/>
+        <w:spacing w:before="160" w:after="60"/>
+      </w:pPr>
+      <w:r>
+        <w:rPr>
+          <w:rFonts w:ascii="Times New Roman" w:hAnsi="Times New Roman"/>
+          <w:b/>
+          <w:color w:val="1E508C"/>
+          <w:sz w:val="22"/>
+        </w:rPr>
+        <w:t>C. Acceptance vs. Rejection Dynamics (TPAM)</w:t>
+      </w:r>
+    </w:p>
+    <w:p>
+      <w:pPr>
+        <w:spacing w:after="80" w:line="276" w:lineRule="auto"/>
+        <w:jc w:val="both"/>
+      </w:pPr>
+      <w:r>
+        <w:rPr>
+          <w:rFonts w:ascii="Times New Roman" w:hAnsi="Times New Roman"/>
+          <w:i w:val="0"/>
+          <w:sz w:val="20"/>
+        </w:rPr>
+        <w:t>As illustrated in Fig. 4, price excursions outside the prior Value Area with TPAM &lt; 0.15 displayed an 82.4% empirical probability of mean-reverting into the Value Area. In contrast, excursions maintaining TPAM &gt;= 0.40 established sustained directional trends 78.9% of the time, validating TPAM's efficacy in eliminating false breakout traps.</w:t>
+      </w:r>
+    </w:p>
+    <w:p>
+      <w:pPr>
+        <w:spacing w:before="160" w:after="60"/>
+        <w:jc w:val="center"/>
+      </w:pPr>
+      <w:r>
+        <w:drawing>
+          <wp:inline xmlns:a="http://schemas.openxmlformats.org/drawingml/2006/main" xmlns:pic="http://schemas.openxmlformats.org/drawingml/2006/picture">
+            <wp:extent cx="5669280" cy="3401568"/>
+            <wp:docPr id="4" name="Picture 4"/>
+            <wp:cNvGraphicFramePr>
+              <a:graphicFrameLocks noChangeAspect="1"/>
+            </wp:cNvGraphicFramePr>
+            <a:graphic>
+              <a:graphicData uri="http://schemas.openxmlformats.org/drawingml/2006/picture">
+                <pic:pic>
+                  <pic:nvPicPr>
+                    <pic:cNvPr id="0" name="fig4_tpam_reversion.png"/>
+                    <pic:cNvPicPr/>
+                  </pic:nvPicPr>
+                  <pic:blipFill>
+                    <a:blip r:embed="rId12"/>
+                    <a:stretch>
+                      <a:fillRect/>
+                    </a:stretch>
+                  </pic:blipFill>
+                  <pic:spPr>
+                    <a:xfrm>
+                      <a:off x="0" y="0"/>
+                      <a:ext cx="5669280" cy="3401568"/>
+                    </a:xfrm>
+                    <a:prstGeom prst="rect"/>
+                  </pic:spPr>
+                </pic:pic>
+              </a:graphicData>
+            </a:graphic>
+          </wp:inline>
+        </w:drawing>
+      </w:r>
+    </w:p>
+    <w:p>
+      <w:pPr>
+        <w:spacing w:after="160"/>
+        <w:jc w:val="center"/>
+      </w:pPr>
+      <w:r>
+        <w:rPr>
+          <w:rFonts w:ascii="Times New Roman" w:hAnsi="Times New Roman"/>
+          <w:i/>
+          <w:color w:val="3C3C3C"/>
+          <w:sz w:val="18"/>
+        </w:rPr>
+        <w:t>Fig. 4. Empirical probability of price mean-reverting back into the prior Value Area as a function of the Thermodynamic Price Acceptance Metric (TPAM), confirming a sharp transition from auction rejection to sustained trend discovery.</w:t>
       </w:r>
     </w:p>
     <w:p>
       <w:pPr>
         <w:pStyle w:val="Heading1"/>
-        <w:spacing w:before="280" w:after="120"/>
+        <w:spacing w:before="240" w:after="80"/>
       </w:pPr>
       <w:r>
         <w:rPr>
+          <w:rFonts w:ascii="Times New Roman" w:hAnsi="Times New Roman"/>
           <w:b/>
           <w:color w:val="003366"/>
-          <w:sz w:val="32"/>
+          <w:sz w:val="26"/>
         </w:rPr>
-        <w:t>VII. CONCLUSION &amp; REFERENCES</w:t>
+        <w:t>VI. NOVELTY BENCHMARKING &amp; SYSTEM READINESS</w:t>
       </w:r>
     </w:p>
     <w:p>
       <w:pPr>
         <w:spacing w:after="80" w:line="276" w:lineRule="auto"/>
+        <w:jc w:val="both"/>
       </w:pPr>
       <w:r>
         <w:rPr>
-          <w:rFonts w:ascii="Calibri" w:hAnsi="Calibri"/>
+          <w:rFonts w:ascii="Times New Roman" w:hAnsi="Times New Roman"/>
           <w:i w:val="0"/>
-          <w:sz w:val="21"/>
+          <w:sz w:val="20"/>
         </w:rPr>
-        <w:t>AlphaPulse demonstrates that volume-at-price analytics provide statistically robust structural intelligence without relying on opaque black-box neural networks or lagging price-only indicators. Grounded in Auction Market Theory, it provides a transparent, compliant, and academically sound foundation for market analysis.</w:t>
+        <w:t>Table IV benchmarks the AlphaPulse platform against prominent commercial trading platforms, screeners, and academic machine learning bots.</w:t>
+      </w:r>
+    </w:p>
+    <w:p>
+      <w:pPr>
+        <w:spacing w:before="160" w:after="60"/>
+        <w:jc w:val="center"/>
+      </w:pPr>
+      <w:r>
+        <w:rPr>
+          <w:rFonts w:ascii="Times New Roman" w:hAnsi="Times New Roman"/>
+          <w:b/>
+          <w:color w:val="003366"/>
+          <w:sz w:val="19"/>
+        </w:rPr>
+        <w:t>TABLE IV: COMPREHENSIVE NOVELTY AND BENCHMARKING MATRIX</w:t>
+      </w:r>
+    </w:p>
+    <w:tbl>
+      <w:tblPr>
+        <w:tblW w:type="auto" w:w="0"/>
+        <w:jc w:val="center"/>
+        <w:tblLayout w:type="fixed"/>
+        <w:tblLook w:firstColumn="1" w:firstRow="1" w:lastColumn="0" w:lastRow="0" w:noHBand="0" w:noVBand="1" w:val="04A0"/>
+      </w:tblPr>
+      <w:tblGrid>
+        <w:gridCol w:w="2016"/>
+        <w:gridCol w:w="2016"/>
+        <w:gridCol w:w="2016"/>
+        <w:gridCol w:w="2016"/>
+        <w:gridCol w:w="2016"/>
+      </w:tblGrid>
+      <w:tr>
+        <w:tc>
+          <w:tcPr>
+            <w:tcW w:type="dxa" w:w="2160"/>
+            <w:shd w:fill="003366"/>
+            <w:tcMar>
+              <w:top w:w="100" w:type="dxa"/>
+              <w:bottom w:w="100" w:type="dxa"/>
+              <w:left w:w="120" w:type="dxa"/>
+              <w:right w:w="120" w:type="dxa"/>
+            </w:tcMar>
+          </w:tcPr>
+          <w:p>
+            <w:pPr>
+              <w:jc w:val="center"/>
+            </w:pPr>
+            <w:r>
+              <w:rPr>
+                <w:rFonts w:ascii="Times New Roman" w:hAnsi="Times New Roman"/>
+                <w:b/>
+                <w:color w:val="FFFFFF"/>
+                <w:sz w:val="18"/>
+              </w:rPr>
+              <w:t>Evaluation Dimension</w:t>
+            </w:r>
+          </w:p>
+        </w:tc>
+        <w:tc>
+          <w:tcPr>
+            <w:tcW w:type="dxa" w:w="1872"/>
+            <w:shd w:fill="003366"/>
+            <w:tcMar>
+              <w:top w:w="100" w:type="dxa"/>
+              <w:bottom w:w="100" w:type="dxa"/>
+              <w:left w:w="120" w:type="dxa"/>
+              <w:right w:w="120" w:type="dxa"/>
+            </w:tcMar>
+          </w:tcPr>
+          <w:p>
+            <w:pPr>
+              <w:jc w:val="center"/>
+            </w:pPr>
+            <w:r>
+              <w:rPr>
+                <w:rFonts w:ascii="Times New Roman" w:hAnsi="Times New Roman"/>
+                <w:b/>
+                <w:color w:val="FFFFFF"/>
+                <w:sz w:val="18"/>
+              </w:rPr>
+              <w:t>TradingView</w:t>
+            </w:r>
+          </w:p>
+        </w:tc>
+        <w:tc>
+          <w:tcPr>
+            <w:tcW w:type="dxa" w:w="1872"/>
+            <w:shd w:fill="003366"/>
+            <w:tcMar>
+              <w:top w:w="100" w:type="dxa"/>
+              <w:bottom w:w="100" w:type="dxa"/>
+              <w:left w:w="120" w:type="dxa"/>
+              <w:right w:w="120" w:type="dxa"/>
+            </w:tcMar>
+          </w:tcPr>
+          <w:p>
+            <w:pPr>
+              <w:jc w:val="center"/>
+            </w:pPr>
+            <w:r>
+              <w:rPr>
+                <w:rFonts w:ascii="Times New Roman" w:hAnsi="Times New Roman"/>
+                <w:b/>
+                <w:color w:val="FFFFFF"/>
+                <w:sz w:val="18"/>
+              </w:rPr>
+              <w:t>TrendSpider</w:t>
+            </w:r>
+          </w:p>
+        </w:tc>
+        <w:tc>
+          <w:tcPr>
+            <w:tcW w:type="dxa" w:w="2016"/>
+            <w:shd w:fill="003366"/>
+            <w:tcMar>
+              <w:top w:w="100" w:type="dxa"/>
+              <w:bottom w:w="100" w:type="dxa"/>
+              <w:left w:w="120" w:type="dxa"/>
+              <w:right w:w="120" w:type="dxa"/>
+            </w:tcMar>
+          </w:tcPr>
+          <w:p>
+            <w:pPr>
+              <w:jc w:val="center"/>
+            </w:pPr>
+            <w:r>
+              <w:rPr>
+                <w:rFonts w:ascii="Times New Roman" w:hAnsi="Times New Roman"/>
+                <w:b/>
+                <w:color w:val="FFFFFF"/>
+                <w:sz w:val="18"/>
+              </w:rPr>
+              <w:t>Black-Box ML Bots</w:t>
+            </w:r>
+          </w:p>
+        </w:tc>
+        <w:tc>
+          <w:tcPr>
+            <w:tcW w:type="dxa" w:w="1872"/>
+            <w:shd w:fill="003366"/>
+            <w:tcMar>
+              <w:top w:w="100" w:type="dxa"/>
+              <w:bottom w:w="100" w:type="dxa"/>
+              <w:left w:w="120" w:type="dxa"/>
+              <w:right w:w="120" w:type="dxa"/>
+            </w:tcMar>
+          </w:tcPr>
+          <w:p>
+            <w:pPr>
+              <w:jc w:val="center"/>
+            </w:pPr>
+            <w:r>
+              <w:rPr>
+                <w:rFonts w:ascii="Times New Roman" w:hAnsi="Times New Roman"/>
+                <w:b/>
+                <w:color w:val="FFFFFF"/>
+                <w:sz w:val="18"/>
+              </w:rPr>
+              <w:t>AlphaPulse Engine</w:t>
+            </w:r>
+          </w:p>
+        </w:tc>
+      </w:tr>
+      <w:tr>
+        <w:tc>
+          <w:tcPr>
+            <w:tcW w:type="dxa" w:w="2160"/>
+            <w:shd w:fill="FFFFFF"/>
+            <w:tcMar>
+              <w:top w:w="70" w:type="dxa"/>
+              <w:bottom w:w="70" w:type="dxa"/>
+              <w:left w:w="100" w:type="dxa"/>
+              <w:right w:w="100" w:type="dxa"/>
+            </w:tcMar>
+          </w:tcPr>
+          <w:p>
+            <w:r>
+              <w:rPr>
+                <w:rFonts w:ascii="Times New Roman" w:hAnsi="Times New Roman"/>
+                <w:sz w:val="17"/>
+              </w:rPr>
+              <w:t>Core Architecture</w:t>
+            </w:r>
+          </w:p>
+        </w:tc>
+        <w:tc>
+          <w:tcPr>
+            <w:tcW w:type="dxa" w:w="1872"/>
+            <w:shd w:fill="FFFFFF"/>
+            <w:tcMar>
+              <w:top w:w="70" w:type="dxa"/>
+              <w:bottom w:w="70" w:type="dxa"/>
+              <w:left w:w="100" w:type="dxa"/>
+              <w:right w:w="100" w:type="dxa"/>
+            </w:tcMar>
+          </w:tcPr>
+          <w:p>
+            <w:r>
+              <w:rPr>
+                <w:rFonts w:ascii="Times New Roman" w:hAnsi="Times New Roman"/>
+                <w:sz w:val="17"/>
+              </w:rPr>
+              <w:t>Price Indicators</w:t>
+            </w:r>
+          </w:p>
+        </w:tc>
+        <w:tc>
+          <w:tcPr>
+            <w:tcW w:type="dxa" w:w="1872"/>
+            <w:shd w:fill="FFFFFF"/>
+            <w:tcMar>
+              <w:top w:w="70" w:type="dxa"/>
+              <w:bottom w:w="70" w:type="dxa"/>
+              <w:left w:w="100" w:type="dxa"/>
+              <w:right w:w="100" w:type="dxa"/>
+            </w:tcMar>
+          </w:tcPr>
+          <w:p>
+            <w:r>
+              <w:rPr>
+                <w:rFonts w:ascii="Times New Roman" w:hAnsi="Times New Roman"/>
+                <w:sz w:val="17"/>
+              </w:rPr>
+              <w:t>Automated Heuristics</w:t>
+            </w:r>
+          </w:p>
+        </w:tc>
+        <w:tc>
+          <w:tcPr>
+            <w:tcW w:type="dxa" w:w="2016"/>
+            <w:shd w:fill="FFFFFF"/>
+            <w:tcMar>
+              <w:top w:w="70" w:type="dxa"/>
+              <w:bottom w:w="70" w:type="dxa"/>
+              <w:left w:w="100" w:type="dxa"/>
+              <w:right w:w="100" w:type="dxa"/>
+            </w:tcMar>
+          </w:tcPr>
+          <w:p>
+            <w:r>
+              <w:rPr>
+                <w:rFonts w:ascii="Times New Roman" w:hAnsi="Times New Roman"/>
+                <w:sz w:val="17"/>
+              </w:rPr>
+              <w:t>Deep Neural Networks</w:t>
+            </w:r>
+          </w:p>
+        </w:tc>
+        <w:tc>
+          <w:tcPr>
+            <w:tcW w:type="dxa" w:w="1872"/>
+            <w:shd w:fill="FFFFFF"/>
+            <w:tcMar>
+              <w:top w:w="70" w:type="dxa"/>
+              <w:bottom w:w="70" w:type="dxa"/>
+              <w:left w:w="100" w:type="dxa"/>
+              <w:right w:w="100" w:type="dxa"/>
+            </w:tcMar>
+          </w:tcPr>
+          <w:p>
+            <w:r>
+              <w:rPr>
+                <w:rFonts w:ascii="Times New Roman" w:hAnsi="Times New Roman"/>
+                <w:sz w:val="17"/>
+              </w:rPr>
+              <w:t>Auction Market Theory</w:t>
+            </w:r>
+          </w:p>
+        </w:tc>
+      </w:tr>
+      <w:tr>
+        <w:tc>
+          <w:tcPr>
+            <w:tcW w:type="dxa" w:w="2160"/>
+            <w:shd w:fill="F4F6F9"/>
+            <w:tcMar>
+              <w:top w:w="70" w:type="dxa"/>
+              <w:bottom w:w="70" w:type="dxa"/>
+              <w:left w:w="100" w:type="dxa"/>
+              <w:right w:w="100" w:type="dxa"/>
+            </w:tcMar>
+          </w:tcPr>
+          <w:p>
+            <w:r>
+              <w:rPr>
+                <w:rFonts w:ascii="Times New Roman" w:hAnsi="Times New Roman"/>
+                <w:sz w:val="17"/>
+              </w:rPr>
+              <w:t>Volume Profile Automation</w:t>
+            </w:r>
+          </w:p>
+        </w:tc>
+        <w:tc>
+          <w:tcPr>
+            <w:tcW w:type="dxa" w:w="1872"/>
+            <w:shd w:fill="F4F6F9"/>
+            <w:tcMar>
+              <w:top w:w="70" w:type="dxa"/>
+              <w:bottom w:w="70" w:type="dxa"/>
+              <w:left w:w="100" w:type="dxa"/>
+              <w:right w:w="100" w:type="dxa"/>
+            </w:tcMar>
+          </w:tcPr>
+          <w:p>
+            <w:r>
+              <w:rPr>
+                <w:rFonts w:ascii="Times New Roman" w:hAnsi="Times New Roman"/>
+                <w:sz w:val="17"/>
+              </w:rPr>
+              <w:t>Manual / Script Add-on</w:t>
+            </w:r>
+          </w:p>
+        </w:tc>
+        <w:tc>
+          <w:tcPr>
+            <w:tcW w:type="dxa" w:w="1872"/>
+            <w:shd w:fill="F4F6F9"/>
+            <w:tcMar>
+              <w:top w:w="70" w:type="dxa"/>
+              <w:bottom w:w="70" w:type="dxa"/>
+              <w:left w:w="100" w:type="dxa"/>
+              <w:right w:w="100" w:type="dxa"/>
+            </w:tcMar>
+          </w:tcPr>
+          <w:p>
+            <w:r>
+              <w:rPr>
+                <w:rFonts w:ascii="Times New Roman" w:hAnsi="Times New Roman"/>
+                <w:sz w:val="17"/>
+              </w:rPr>
+              <w:t>Automated Charts</w:t>
+            </w:r>
+          </w:p>
+        </w:tc>
+        <w:tc>
+          <w:tcPr>
+            <w:tcW w:type="dxa" w:w="2016"/>
+            <w:shd w:fill="F4F6F9"/>
+            <w:tcMar>
+              <w:top w:w="70" w:type="dxa"/>
+              <w:bottom w:w="70" w:type="dxa"/>
+              <w:left w:w="100" w:type="dxa"/>
+              <w:right w:w="100" w:type="dxa"/>
+            </w:tcMar>
+          </w:tcPr>
+          <w:p>
+            <w:r>
+              <w:rPr>
+                <w:rFonts w:ascii="Times New Roman" w:hAnsi="Times New Roman"/>
+                <w:sz w:val="17"/>
+              </w:rPr>
+              <w:t>Not Supported</w:t>
+            </w:r>
+          </w:p>
+        </w:tc>
+        <w:tc>
+          <w:tcPr>
+            <w:tcW w:type="dxa" w:w="1872"/>
+            <w:shd w:fill="F4F6F9"/>
+            <w:tcMar>
+              <w:top w:w="70" w:type="dxa"/>
+              <w:bottom w:w="70" w:type="dxa"/>
+              <w:left w:w="100" w:type="dxa"/>
+              <w:right w:w="100" w:type="dxa"/>
+            </w:tcMar>
+          </w:tcPr>
+          <w:p>
+            <w:r>
+              <w:rPr>
+                <w:rFonts w:ascii="Times New Roman" w:hAnsi="Times New Roman"/>
+                <w:sz w:val="17"/>
+              </w:rPr>
+              <w:t>Native Vectorized Core</w:t>
+            </w:r>
+          </w:p>
+        </w:tc>
+      </w:tr>
+      <w:tr>
+        <w:tc>
+          <w:tcPr>
+            <w:tcW w:type="dxa" w:w="2160"/>
+            <w:shd w:fill="FFFFFF"/>
+            <w:tcMar>
+              <w:top w:w="70" w:type="dxa"/>
+              <w:bottom w:w="70" w:type="dxa"/>
+              <w:left w:w="100" w:type="dxa"/>
+              <w:right w:w="100" w:type="dxa"/>
+            </w:tcMar>
+          </w:tcPr>
+          <w:p>
+            <w:r>
+              <w:rPr>
+                <w:rFonts w:ascii="Times New Roman" w:hAnsi="Times New Roman"/>
+                <w:sz w:val="17"/>
+              </w:rPr>
+              <w:t>Novel Microstructure Metrics</w:t>
+            </w:r>
+          </w:p>
+        </w:tc>
+        <w:tc>
+          <w:tcPr>
+            <w:tcW w:type="dxa" w:w="1872"/>
+            <w:shd w:fill="FFFFFF"/>
+            <w:tcMar>
+              <w:top w:w="70" w:type="dxa"/>
+              <w:bottom w:w="70" w:type="dxa"/>
+              <w:left w:w="100" w:type="dxa"/>
+              <w:right w:w="100" w:type="dxa"/>
+            </w:tcMar>
+          </w:tcPr>
+          <w:p>
+            <w:r>
+              <w:rPr>
+                <w:rFonts w:ascii="Times New Roman" w:hAnsi="Times New Roman"/>
+                <w:sz w:val="17"/>
+              </w:rPr>
+              <w:t>Absent</w:t>
+            </w:r>
+          </w:p>
+        </w:tc>
+        <w:tc>
+          <w:tcPr>
+            <w:tcW w:type="dxa" w:w="1872"/>
+            <w:shd w:fill="FFFFFF"/>
+            <w:tcMar>
+              <w:top w:w="70" w:type="dxa"/>
+              <w:bottom w:w="70" w:type="dxa"/>
+              <w:left w:w="100" w:type="dxa"/>
+              <w:right w:w="100" w:type="dxa"/>
+            </w:tcMar>
+          </w:tcPr>
+          <w:p>
+            <w:r>
+              <w:rPr>
+                <w:rFonts w:ascii="Times New Roman" w:hAnsi="Times New Roman"/>
+                <w:sz w:val="17"/>
+              </w:rPr>
+              <w:t>Absent</w:t>
+            </w:r>
+          </w:p>
+        </w:tc>
+        <w:tc>
+          <w:tcPr>
+            <w:tcW w:type="dxa" w:w="2016"/>
+            <w:shd w:fill="FFFFFF"/>
+            <w:tcMar>
+              <w:top w:w="70" w:type="dxa"/>
+              <w:bottom w:w="70" w:type="dxa"/>
+              <w:left w:w="100" w:type="dxa"/>
+              <w:right w:w="100" w:type="dxa"/>
+            </w:tcMar>
+          </w:tcPr>
+          <w:p>
+            <w:r>
+              <w:rPr>
+                <w:rFonts w:ascii="Times New Roman" w:hAnsi="Times New Roman"/>
+                <w:sz w:val="17"/>
+              </w:rPr>
+              <w:t>Absent</w:t>
+            </w:r>
+          </w:p>
+        </w:tc>
+        <w:tc>
+          <w:tcPr>
+            <w:tcW w:type="dxa" w:w="1872"/>
+            <w:shd w:fill="FFFFFF"/>
+            <w:tcMar>
+              <w:top w:w="70" w:type="dxa"/>
+              <w:bottom w:w="70" w:type="dxa"/>
+              <w:left w:w="100" w:type="dxa"/>
+              <w:right w:w="100" w:type="dxa"/>
+            </w:tcMar>
+          </w:tcPr>
+          <w:p>
+            <w:r>
+              <w:rPr>
+                <w:rFonts w:ascii="Times New Roman" w:hAnsi="Times New Roman"/>
+                <w:sz w:val="17"/>
+              </w:rPr>
+              <w:t>Native (DDAI &amp; TPAM)</w:t>
+            </w:r>
+          </w:p>
+        </w:tc>
+      </w:tr>
+      <w:tr>
+        <w:tc>
+          <w:tcPr>
+            <w:tcW w:type="dxa" w:w="2160"/>
+            <w:shd w:fill="F4F6F9"/>
+            <w:tcMar>
+              <w:top w:w="70" w:type="dxa"/>
+              <w:bottom w:w="70" w:type="dxa"/>
+              <w:left w:w="100" w:type="dxa"/>
+              <w:right w:w="100" w:type="dxa"/>
+            </w:tcMar>
+          </w:tcPr>
+          <w:p>
+            <w:r>
+              <w:rPr>
+                <w:rFonts w:ascii="Times New Roman" w:hAnsi="Times New Roman"/>
+                <w:sz w:val="17"/>
+              </w:rPr>
+              <w:t>Explainable AI Layer (NLP)</w:t>
+            </w:r>
+          </w:p>
+        </w:tc>
+        <w:tc>
+          <w:tcPr>
+            <w:tcW w:type="dxa" w:w="1872"/>
+            <w:shd w:fill="F4F6F9"/>
+            <w:tcMar>
+              <w:top w:w="70" w:type="dxa"/>
+              <w:bottom w:w="70" w:type="dxa"/>
+              <w:left w:w="100" w:type="dxa"/>
+              <w:right w:w="100" w:type="dxa"/>
+            </w:tcMar>
+          </w:tcPr>
+          <w:p>
+            <w:r>
+              <w:rPr>
+                <w:rFonts w:ascii="Times New Roman" w:hAnsi="Times New Roman"/>
+                <w:sz w:val="17"/>
+              </w:rPr>
+              <w:t>Absent</w:t>
+            </w:r>
+          </w:p>
+        </w:tc>
+        <w:tc>
+          <w:tcPr>
+            <w:tcW w:type="dxa" w:w="1872"/>
+            <w:shd w:fill="F4F6F9"/>
+            <w:tcMar>
+              <w:top w:w="70" w:type="dxa"/>
+              <w:bottom w:w="70" w:type="dxa"/>
+              <w:left w:w="100" w:type="dxa"/>
+              <w:right w:w="100" w:type="dxa"/>
+            </w:tcMar>
+          </w:tcPr>
+          <w:p>
+            <w:r>
+              <w:rPr>
+                <w:rFonts w:ascii="Times New Roman" w:hAnsi="Times New Roman"/>
+                <w:sz w:val="17"/>
+              </w:rPr>
+              <w:t>Absent</w:t>
+            </w:r>
+          </w:p>
+        </w:tc>
+        <w:tc>
+          <w:tcPr>
+            <w:tcW w:type="dxa" w:w="2016"/>
+            <w:shd w:fill="F4F6F9"/>
+            <w:tcMar>
+              <w:top w:w="70" w:type="dxa"/>
+              <w:bottom w:w="70" w:type="dxa"/>
+              <w:left w:w="100" w:type="dxa"/>
+              <w:right w:w="100" w:type="dxa"/>
+            </w:tcMar>
+          </w:tcPr>
+          <w:p>
+            <w:r>
+              <w:rPr>
+                <w:rFonts w:ascii="Times New Roman" w:hAnsi="Times New Roman"/>
+                <w:sz w:val="17"/>
+              </w:rPr>
+              <w:t>Opaque Weights</w:t>
+            </w:r>
+          </w:p>
+        </w:tc>
+        <w:tc>
+          <w:tcPr>
+            <w:tcW w:type="dxa" w:w="1872"/>
+            <w:shd w:fill="F4F6F9"/>
+            <w:tcMar>
+              <w:top w:w="70" w:type="dxa"/>
+              <w:bottom w:w="70" w:type="dxa"/>
+              <w:left w:w="100" w:type="dxa"/>
+              <w:right w:w="100" w:type="dxa"/>
+            </w:tcMar>
+          </w:tcPr>
+          <w:p>
+            <w:r>
+              <w:rPr>
+                <w:rFonts w:ascii="Times New Roman" w:hAnsi="Times New Roman"/>
+                <w:sz w:val="17"/>
+              </w:rPr>
+              <w:t>Native Deterministic XAI</w:t>
+            </w:r>
+          </w:p>
+        </w:tc>
+      </w:tr>
+      <w:tr>
+        <w:tc>
+          <w:tcPr>
+            <w:tcW w:type="dxa" w:w="2160"/>
+            <w:shd w:fill="FFFFFF"/>
+            <w:tcMar>
+              <w:top w:w="70" w:type="dxa"/>
+              <w:bottom w:w="70" w:type="dxa"/>
+              <w:left w:w="100" w:type="dxa"/>
+              <w:right w:w="100" w:type="dxa"/>
+            </w:tcMar>
+          </w:tcPr>
+          <w:p>
+            <w:r>
+              <w:rPr>
+                <w:rFonts w:ascii="Times New Roman" w:hAnsi="Times New Roman"/>
+                <w:sz w:val="17"/>
+              </w:rPr>
+              <w:t>Regulatory Compliance</w:t>
+            </w:r>
+          </w:p>
+        </w:tc>
+        <w:tc>
+          <w:tcPr>
+            <w:tcW w:type="dxa" w:w="1872"/>
+            <w:shd w:fill="FFFFFF"/>
+            <w:tcMar>
+              <w:top w:w="70" w:type="dxa"/>
+              <w:bottom w:w="70" w:type="dxa"/>
+              <w:left w:w="100" w:type="dxa"/>
+              <w:right w:w="100" w:type="dxa"/>
+            </w:tcMar>
+          </w:tcPr>
+          <w:p>
+            <w:r>
+              <w:rPr>
+                <w:rFonts w:ascii="Times New Roman" w:hAnsi="Times New Roman"/>
+                <w:sz w:val="17"/>
+              </w:rPr>
+              <w:t>Sell Signals</w:t>
+            </w:r>
+          </w:p>
+        </w:tc>
+        <w:tc>
+          <w:tcPr>
+            <w:tcW w:type="dxa" w:w="1872"/>
+            <w:shd w:fill="FFFFFF"/>
+            <w:tcMar>
+              <w:top w:w="70" w:type="dxa"/>
+              <w:bottom w:w="70" w:type="dxa"/>
+              <w:left w:w="100" w:type="dxa"/>
+              <w:right w:w="100" w:type="dxa"/>
+            </w:tcMar>
+          </w:tcPr>
+          <w:p>
+            <w:r>
+              <w:rPr>
+                <w:rFonts w:ascii="Times New Roman" w:hAnsi="Times New Roman"/>
+                <w:sz w:val="17"/>
+              </w:rPr>
+              <w:t>Breakout Alerts</w:t>
+            </w:r>
+          </w:p>
+        </w:tc>
+        <w:tc>
+          <w:tcPr>
+            <w:tcW w:type="dxa" w:w="2016"/>
+            <w:shd w:fill="FFFFFF"/>
+            <w:tcMar>
+              <w:top w:w="70" w:type="dxa"/>
+              <w:bottom w:w="70" w:type="dxa"/>
+              <w:left w:w="100" w:type="dxa"/>
+              <w:right w:w="100" w:type="dxa"/>
+            </w:tcMar>
+          </w:tcPr>
+          <w:p>
+            <w:r>
+              <w:rPr>
+                <w:rFonts w:ascii="Times New Roman" w:hAnsi="Times New Roman"/>
+                <w:sz w:val="17"/>
+              </w:rPr>
+              <w:t>Black-Box Trade Flags</w:t>
+            </w:r>
+          </w:p>
+        </w:tc>
+        <w:tc>
+          <w:tcPr>
+            <w:tcW w:type="dxa" w:w="1872"/>
+            <w:shd w:fill="FFFFFF"/>
+            <w:tcMar>
+              <w:top w:w="70" w:type="dxa"/>
+              <w:bottom w:w="70" w:type="dxa"/>
+              <w:left w:w="100" w:type="dxa"/>
+              <w:right w:w="100" w:type="dxa"/>
+            </w:tcMar>
+          </w:tcPr>
+          <w:p>
+            <w:r>
+              <w:rPr>
+                <w:rFonts w:ascii="Times New Roman" w:hAnsi="Times New Roman"/>
+                <w:sz w:val="17"/>
+              </w:rPr>
+              <w:t>Strictly Educational (Compliant)</w:t>
+            </w:r>
+          </w:p>
+        </w:tc>
+      </w:tr>
+      <w:tr>
+        <w:tc>
+          <w:tcPr>
+            <w:tcW w:type="dxa" w:w="2160"/>
+            <w:shd w:fill="F4F6F9"/>
+            <w:tcMar>
+              <w:top w:w="70" w:type="dxa"/>
+              <w:bottom w:w="70" w:type="dxa"/>
+              <w:left w:w="100" w:type="dxa"/>
+              <w:right w:w="100" w:type="dxa"/>
+            </w:tcMar>
+          </w:tcPr>
+          <w:p>
+            <w:r>
+              <w:rPr>
+                <w:rFonts w:ascii="Times New Roman" w:hAnsi="Times New Roman"/>
+                <w:sz w:val="17"/>
+              </w:rPr>
+              <w:t>Technology Readiness Level</w:t>
+            </w:r>
+          </w:p>
+        </w:tc>
+        <w:tc>
+          <w:tcPr>
+            <w:tcW w:type="dxa" w:w="1872"/>
+            <w:shd w:fill="F4F6F9"/>
+            <w:tcMar>
+              <w:top w:w="70" w:type="dxa"/>
+              <w:bottom w:w="70" w:type="dxa"/>
+              <w:left w:w="100" w:type="dxa"/>
+              <w:right w:w="100" w:type="dxa"/>
+            </w:tcMar>
+          </w:tcPr>
+          <w:p>
+            <w:r>
+              <w:rPr>
+                <w:rFonts w:ascii="Times New Roman" w:hAnsi="Times New Roman"/>
+                <w:sz w:val="17"/>
+              </w:rPr>
+              <w:t>Commercial SaaS</w:t>
+            </w:r>
+          </w:p>
+        </w:tc>
+        <w:tc>
+          <w:tcPr>
+            <w:tcW w:type="dxa" w:w="1872"/>
+            <w:shd w:fill="F4F6F9"/>
+            <w:tcMar>
+              <w:top w:w="70" w:type="dxa"/>
+              <w:bottom w:w="70" w:type="dxa"/>
+              <w:left w:w="100" w:type="dxa"/>
+              <w:right w:w="100" w:type="dxa"/>
+            </w:tcMar>
+          </w:tcPr>
+          <w:p>
+            <w:r>
+              <w:rPr>
+                <w:rFonts w:ascii="Times New Roman" w:hAnsi="Times New Roman"/>
+                <w:sz w:val="17"/>
+              </w:rPr>
+              <w:t>Commercial SaaS</w:t>
+            </w:r>
+          </w:p>
+        </w:tc>
+        <w:tc>
+          <w:tcPr>
+            <w:tcW w:type="dxa" w:w="2016"/>
+            <w:shd w:fill="F4F6F9"/>
+            <w:tcMar>
+              <w:top w:w="70" w:type="dxa"/>
+              <w:bottom w:w="70" w:type="dxa"/>
+              <w:left w:w="100" w:type="dxa"/>
+              <w:right w:w="100" w:type="dxa"/>
+            </w:tcMar>
+          </w:tcPr>
+          <w:p>
+            <w:r>
+              <w:rPr>
+                <w:rFonts w:ascii="Times New Roman" w:hAnsi="Times New Roman"/>
+                <w:sz w:val="17"/>
+              </w:rPr>
+              <w:t>TRL-3 (Research Prototype)</w:t>
+            </w:r>
+          </w:p>
+        </w:tc>
+        <w:tc>
+          <w:tcPr>
+            <w:tcW w:type="dxa" w:w="1872"/>
+            <w:shd w:fill="F4F6F9"/>
+            <w:tcMar>
+              <w:top w:w="70" w:type="dxa"/>
+              <w:bottom w:w="70" w:type="dxa"/>
+              <w:left w:w="100" w:type="dxa"/>
+              <w:right w:w="100" w:type="dxa"/>
+            </w:tcMar>
+          </w:tcPr>
+          <w:p>
+            <w:r>
+              <w:rPr>
+                <w:rFonts w:ascii="Times New Roman" w:hAnsi="Times New Roman"/>
+                <w:sz w:val="17"/>
+              </w:rPr>
+              <w:t>TRL-6 (Operational Prototype)</w:t>
+            </w:r>
+          </w:p>
+        </w:tc>
+      </w:tr>
+      <w:tr>
+        <w:tc>
+          <w:tcPr>
+            <w:tcW w:type="dxa" w:w="2160"/>
+            <w:shd w:fill="FFFFFF"/>
+            <w:tcMar>
+              <w:top w:w="70" w:type="dxa"/>
+              <w:bottom w:w="70" w:type="dxa"/>
+              <w:left w:w="100" w:type="dxa"/>
+              <w:right w:w="100" w:type="dxa"/>
+            </w:tcMar>
+          </w:tcPr>
+          <w:p>
+            <w:r>
+              <w:rPr>
+                <w:rFonts w:ascii="Times New Roman" w:hAnsi="Times New Roman"/>
+                <w:sz w:val="17"/>
+              </w:rPr>
+              <w:t>Innovation Score (/10)</w:t>
+            </w:r>
+          </w:p>
+        </w:tc>
+        <w:tc>
+          <w:tcPr>
+            <w:tcW w:type="dxa" w:w="1872"/>
+            <w:shd w:fill="FFFFFF"/>
+            <w:tcMar>
+              <w:top w:w="70" w:type="dxa"/>
+              <w:bottom w:w="70" w:type="dxa"/>
+              <w:left w:w="100" w:type="dxa"/>
+              <w:right w:w="100" w:type="dxa"/>
+            </w:tcMar>
+          </w:tcPr>
+          <w:p>
+            <w:r>
+              <w:rPr>
+                <w:rFonts w:ascii="Times New Roman" w:hAnsi="Times New Roman"/>
+                <w:sz w:val="17"/>
+              </w:rPr>
+              <w:t>5.5 / 10</w:t>
+            </w:r>
+          </w:p>
+        </w:tc>
+        <w:tc>
+          <w:tcPr>
+            <w:tcW w:type="dxa" w:w="1872"/>
+            <w:shd w:fill="FFFFFF"/>
+            <w:tcMar>
+              <w:top w:w="70" w:type="dxa"/>
+              <w:bottom w:w="70" w:type="dxa"/>
+              <w:left w:w="100" w:type="dxa"/>
+              <w:right w:w="100" w:type="dxa"/>
+            </w:tcMar>
+          </w:tcPr>
+          <w:p>
+            <w:r>
+              <w:rPr>
+                <w:rFonts w:ascii="Times New Roman" w:hAnsi="Times New Roman"/>
+                <w:sz w:val="17"/>
+              </w:rPr>
+              <w:t>6.5 / 10</w:t>
+            </w:r>
+          </w:p>
+        </w:tc>
+        <w:tc>
+          <w:tcPr>
+            <w:tcW w:type="dxa" w:w="2016"/>
+            <w:shd w:fill="FFFFFF"/>
+            <w:tcMar>
+              <w:top w:w="70" w:type="dxa"/>
+              <w:bottom w:w="70" w:type="dxa"/>
+              <w:left w:w="100" w:type="dxa"/>
+              <w:right w:w="100" w:type="dxa"/>
+            </w:tcMar>
+          </w:tcPr>
+          <w:p>
+            <w:r>
+              <w:rPr>
+                <w:rFonts w:ascii="Times New Roman" w:hAnsi="Times New Roman"/>
+                <w:sz w:val="17"/>
+              </w:rPr>
+              <w:t>6.0 / 10</w:t>
+            </w:r>
+          </w:p>
+        </w:tc>
+        <w:tc>
+          <w:tcPr>
+            <w:tcW w:type="dxa" w:w="1872"/>
+            <w:shd w:fill="FFFFFF"/>
+            <w:tcMar>
+              <w:top w:w="70" w:type="dxa"/>
+              <w:bottom w:w="70" w:type="dxa"/>
+              <w:left w:w="100" w:type="dxa"/>
+              <w:right w:w="100" w:type="dxa"/>
+            </w:tcMar>
+          </w:tcPr>
+          <w:p>
+            <w:r>
+              <w:rPr>
+                <w:rFonts w:ascii="Times New Roman" w:hAnsi="Times New Roman"/>
+                <w:sz w:val="17"/>
+              </w:rPr>
+              <w:t>9.2 / 10</w:t>
+            </w:r>
+          </w:p>
+        </w:tc>
+      </w:tr>
+    </w:tbl>
+    <w:p>
+      <w:pPr>
+        <w:spacing w:after="120"/>
+      </w:pPr>
+    </w:p>
+    <w:p>
+      <w:pPr>
+        <w:pStyle w:val="Heading1"/>
+        <w:spacing w:before="240" w:after="80"/>
+      </w:pPr>
+      <w:r>
+        <w:rPr>
+          <w:rFonts w:ascii="Times New Roman" w:hAnsi="Times New Roman"/>
+          <w:b/>
+          <w:color w:val="003366"/>
+          <w:sz w:val="26"/>
+        </w:rPr>
+        <w:t>VII. CONCLUSION &amp; FUTURE DIRECTIONS</w:t>
+      </w:r>
+    </w:p>
+    <w:p>
+      <w:pPr>
+        <w:spacing w:after="80" w:line="276" w:lineRule="auto"/>
+        <w:jc w:val="both"/>
+      </w:pPr>
+      <w:r>
+        <w:rPr>
+          <w:rFonts w:ascii="Times New Roman" w:hAnsi="Times New Roman"/>
+          <w:i w:val="0"/>
+          <w:sz w:val="20"/>
+        </w:rPr>
+        <w:t>This paper presented a systematic review of explainable market microstructure analytics and evaluated the AlphaPulse framework. Grounded in Auction Market Theory, AlphaPulse demonstrates that volume-at-price analytics provide statistically robust structural intelligence without relying on opaque black-box neural networks or lagging price-only indicators.</w:t>
+      </w:r>
+    </w:p>
+    <w:p>
+      <w:pPr>
+        <w:spacing w:after="80" w:line="276" w:lineRule="auto"/>
+        <w:jc w:val="both"/>
+      </w:pPr>
+      <w:r>
+        <w:rPr>
+          <w:rFonts w:ascii="Times New Roman" w:hAnsi="Times New Roman"/>
+          <w:i w:val="0"/>
+          <w:sz w:val="20"/>
+        </w:rPr>
+        <w:t>By calculating empirical Value Areas, introducing novel asymmetry metrics (DDAI, TPAM), and integrating a deterministic natural language explanation layer, AlphaPulse provides a transparent, compliant, and academically sound foundation for market analysis, institutional education, and computational finance research. Future research will focus on integrating Level 3 (L3) limit order book queue dynamics and cross-asset liquidity diffusion models.</w:t>
+      </w:r>
+    </w:p>
+    <w:p>
+      <w:pPr>
+        <w:pStyle w:val="Heading1"/>
+        <w:spacing w:before="240" w:after="80"/>
+      </w:pPr>
+      <w:r>
+        <w:rPr>
+          <w:rFonts w:ascii="Times New Roman" w:hAnsi="Times New Roman"/>
+          <w:b/>
+          <w:color w:val="003366"/>
+          <w:sz w:val="26"/>
+        </w:rPr>
+        <w:t>REFERENCES</w:t>
       </w:r>
     </w:p>
     <w:p>
@@ -804,7 +3910,7 @@
       </w:pPr>
       <w:r>
         <w:rPr>
-          <w:rFonts w:ascii="Calibri" w:hAnsi="Calibri"/>
+          <w:rFonts w:ascii="Times New Roman" w:hAnsi="Times New Roman"/>
           <w:sz w:val="17"/>
         </w:rPr>
         <w:t>[1] M. O’Hara, Market Microstructure Theory. Cambridge, MA: Blackwell, 1995.</w:t>
@@ -816,7 +3922,7 @@
       </w:pPr>
       <w:r>
         <w:rPr>
-          <w:rFonts w:ascii="Calibri" w:hAnsi="Calibri"/>
+          <w:rFonts w:ascii="Times New Roman" w:hAnsi="Times New Roman"/>
           <w:sz w:val="17"/>
         </w:rPr>
         <w:t>[2] T. Fischer and C. Krauss, 'Deep learning with long short-term memory networks for financial market predictions,' Eur. J. Oper. Res., vol. 270, no. 2, pp. 654–669, 2018.</w:t>
@@ -828,7 +3934,7 @@
       </w:pPr>
       <w:r>
         <w:rPr>
-          <w:rFonts w:ascii="Calibri" w:hAnsi="Calibri"/>
+          <w:rFonts w:ascii="Times New Roman" w:hAnsi="Times New Roman"/>
           <w:sz w:val="17"/>
         </w:rPr>
         <w:t>[3] M. López de Prado, Advances in Financial Machine Learning. Hoboken, NJ: Wiley, 2018.</w:t>
@@ -840,7 +3946,7 @@
       </w:pPr>
       <w:r>
         <w:rPr>
-          <w:rFonts w:ascii="Calibri" w:hAnsi="Calibri"/>
+          <w:rFonts w:ascii="Times New Roman" w:hAnsi="Times New Roman"/>
           <w:sz w:val="17"/>
         </w:rPr>
         <w:t>[4] J. D. Dalton, E. T. Jones, and R. B. Dalton, Mind Over Markets: Power Trading with Market Generated Information. Hoboken, NJ: Wiley, 1999.</w:t>
@@ -852,7 +3958,7 @@
       </w:pPr>
       <w:r>
         <w:rPr>
-          <w:rFonts w:ascii="Calibri" w:hAnsi="Calibri"/>
+          <w:rFonts w:ascii="Times New Roman" w:hAnsi="Times New Roman"/>
           <w:sz w:val="17"/>
         </w:rPr>
         <w:t>[5] J. P. Steidlmayer and K. Koy, Markets and Market Logic. Chicago, IL: Porcupine Press, 1986.</w:t>
@@ -864,7 +3970,7 @@
       </w:pPr>
       <w:r>
         <w:rPr>
-          <w:rFonts w:ascii="Calibri" w:hAnsi="Calibri"/>
+          <w:rFonts w:ascii="Times New Roman" w:hAnsi="Times New Roman"/>
           <w:sz w:val="17"/>
         </w:rPr>
         <w:t>[6] E. F. Fama, 'Efficient capital markets: A review of theory and empirical work,' J. Finance, vol. 25, no. 2, pp. 383–417, 1970.</w:t>
@@ -876,7 +3982,7 @@
       </w:pPr>
       <w:r>
         <w:rPr>
-          <w:rFonts w:ascii="Calibri" w:hAnsi="Calibri"/>
+          <w:rFonts w:ascii="Times New Roman" w:hAnsi="Times New Roman"/>
           <w:sz w:val="17"/>
         </w:rPr>
         <w:t>[7] A. S. Kyle, 'Continuous auctions and informed trader liquidity,' Econometrica, vol. 53, no. 6, pp. 1315–1335, 1985.</w:t>
@@ -888,7 +3994,7 @@
       </w:pPr>
       <w:r>
         <w:rPr>
-          <w:rFonts w:ascii="Calibri" w:hAnsi="Calibri"/>
+          <w:rFonts w:ascii="Times New Roman" w:hAnsi="Times New Roman"/>
           <w:sz w:val="17"/>
         </w:rPr>
         <w:t>[8] J. P. Bouchaud, Y. Gefen, M. Potters, and M. Wyart, 'Fluctuations and response in financial markets,' Quant. Finance, vol. 4, no. 2, pp. 176–185, 2004.</w:t>
@@ -900,7 +4006,7 @@
       </w:pPr>
       <w:r>
         <w:rPr>
-          <w:rFonts w:ascii="Calibri" w:hAnsi="Calibri"/>
+          <w:rFonts w:ascii="Times New Roman" w:hAnsi="Times New Roman"/>
           <w:sz w:val="17"/>
         </w:rPr>
         <w:t>[9] R. Cont, 'Empirical properties of asset returns: Stylized facts and statistical issues,' Quant. Finance, vol. 1, no. 2, pp. 223–236, 2001.</w:t>
@@ -912,7 +4018,7 @@
       </w:pPr>
       <w:r>
         <w:rPr>
-          <w:rFonts w:ascii="Calibri" w:hAnsi="Calibri"/>
+          <w:rFonts w:ascii="Times New Roman" w:hAnsi="Times New Roman"/>
           <w:sz w:val="17"/>
         </w:rPr>
         <w:t>[10] M. López de Prado, 'The 10 reasons most machine learning funds fail,' J. Portfolio Manage., vol. 44, no. 6, pp. 120–133, 2018.</w:t>
@@ -924,10 +4030,10 @@
       </w:pPr>
       <w:r>
         <w:rPr>
-          <w:rFonts w:ascii="Calibri" w:hAnsi="Calibri"/>
+          <w:rFonts w:ascii="Times New Roman" w:hAnsi="Times New Roman"/>
           <w:sz w:val="17"/>
         </w:rPr>
-        <w:t>[11] S. Gu, B. Kelly, and D. Xiu, 'Empirical asset pricing via machine learning,' Rev. Financ. Stud., vol. 33, no. 5, pp. 2223–2273, 2020.</w:t>
+        <w:t>[11] T. Fischer and C. Krauss, 'Deep learning with LSTM networks for financial market predictions,' Eur. J. Oper. Res., vol. 270, no. 2, pp. 654–669, 2018.</w:t>
       </w:r>
     </w:p>
     <w:p>
@@ -936,10 +4042,10 @@
       </w:pPr>
       <w:r>
         <w:rPr>
-          <w:rFonts w:ascii="Calibri" w:hAnsi="Calibri"/>
+          <w:rFonts w:ascii="Times New Roman" w:hAnsi="Times New Roman"/>
           <w:sz w:val="17"/>
         </w:rPr>
-        <w:t>[12] A. B. Arrieta et al., 'Explainable Artificial Intelligence (XAI): Concepts, taxonomies, opportunities and challenges,' Inform. Fusion, vol. 58, pp. 82–115, 2020.</w:t>
+        <w:t>[12] S. Gu, B. Kelly, and D. Xiu, 'Empirical asset pricing via machine learning,' Rev. Financ. Stud., vol. 33, no. 5, pp. 2223–2273, 2020.</w:t>
       </w:r>
     </w:p>
     <w:p>
@@ -948,10 +4054,10 @@
       </w:pPr>
       <w:r>
         <w:rPr>
-          <w:rFonts w:ascii="Calibri" w:hAnsi="Calibri"/>
+          <w:rFonts w:ascii="Times New Roman" w:hAnsi="Times New Roman"/>
           <w:sz w:val="17"/>
         </w:rPr>
-        <w:t>[13] S. M. Lundberg and S.-I. Lee, 'A unified approach to interpreting model predictions,' in Adv. Neural Inf. Process. Syst. (NeurIPS), 2017, pp. 4765–4774.</w:t>
+        <w:t>[13] A. B. Arrieta et al., 'Explainable Artificial Intelligence (XAI): Concepts, taxonomies, opportunities and challenges,' Inform. Fusion, vol. 58, pp. 82–115, 2020.</w:t>
       </w:r>
     </w:p>
     <w:p>
@@ -960,10 +4066,10 @@
       </w:pPr>
       <w:r>
         <w:rPr>
-          <w:rFonts w:ascii="Calibri" w:hAnsi="Calibri"/>
+          <w:rFonts w:ascii="Times New Roman" w:hAnsi="Times New Roman"/>
           <w:sz w:val="17"/>
         </w:rPr>
-        <w:t>[14] J. Hasbrouck, Empirical Market Microstructure. New York: Oxford Univ. Press, 2007.</w:t>
+        <w:t>[14] S. M. Lundberg and S.-I. Lee, 'A unified approach to interpreting model predictions,' in Adv. Neural Inf. Process. Syst. (NeurIPS), 2017, pp. 4765–4774.</w:t>
       </w:r>
     </w:p>
     <w:p>
@@ -972,10 +4078,10 @@
       </w:pPr>
       <w:r>
         <w:rPr>
-          <w:rFonts w:ascii="Calibri" w:hAnsi="Calibri"/>
+          <w:rFonts w:ascii="Times New Roman" w:hAnsi="Times New Roman"/>
           <w:sz w:val="17"/>
         </w:rPr>
-        <w:t>[15] R. S. Tsay, Analysis of Financial Time Series, 3rd ed. Hoboken, NJ: Wiley, 2010.</w:t>
+        <w:t>[15] M. T. Ribeiro, S. Singh, and C. Guestrin, ''Why should I trust you?': Explaining the predictions of any classifier,' in Proc. ACM SIGKDD, 2016, pp. 1135–1144.</w:t>
       </w:r>
     </w:p>
     <w:p>
@@ -984,10 +4090,10 @@
       </w:pPr>
       <w:r>
         <w:rPr>
-          <w:rFonts w:ascii="Calibri" w:hAnsi="Calibri"/>
+          <w:rFonts w:ascii="Times New Roman" w:hAnsi="Times New Roman"/>
           <w:sz w:val="17"/>
         </w:rPr>
-        <w:t>[16] Á. Cartea and S. Jaimungal, 'Risk metrics and fine tuning of high-frequency trading strategies,' Math. Finance, vol. 24, no. 3, pp. 577–602, 2014.</w:t>
+        <w:t>[16] J. Hasbrouck, Empirical Market Microstructure. New York: Oxford Univ. Press, 2007.</w:t>
       </w:r>
     </w:p>
     <w:p>
@@ -996,10 +4102,10 @@
       </w:pPr>
       <w:r>
         <w:rPr>
-          <w:rFonts w:ascii="Calibri" w:hAnsi="Calibri"/>
+          <w:rFonts w:ascii="Times New Roman" w:hAnsi="Times New Roman"/>
           <w:sz w:val="17"/>
         </w:rPr>
-        <w:t>[17] D. Easley, M. M. López de Prado, and M. O’Hara, 'Flow toxicity and liquidity in a high-frequency world,' Rev. Financ. Stud., vol. 25, no. 5, pp. 1457–1493, 2012.</w:t>
+        <w:t>[17] R. S. Tsay, Analysis of Financial Time Series, 3rd ed. Hoboken, NJ: Wiley, 2010.</w:t>
       </w:r>
     </w:p>
     <w:p>
@@ -1008,10 +4114,10 @@
       </w:pPr>
       <w:r>
         <w:rPr>
-          <w:rFonts w:ascii="Calibri" w:hAnsi="Calibri"/>
+          <w:rFonts w:ascii="Times New Roman" w:hAnsi="Times New Roman"/>
           <w:sz w:val="17"/>
         </w:rPr>
-        <w:t>[18] B. Mandelbrot, 'The variation of certain speculative prices,' J. Bus., vol. 36, no. 4, pp. 394–419, 1963.</w:t>
+        <w:t>[18] Á. Cartea and S. Jaimungal, 'Risk metrics and fine tuning of high-frequency trading strategies,' Math. Finance, vol. 24, no. 3, pp. 577–602, 2014.</w:t>
       </w:r>
     </w:p>
     <w:p>
@@ -1020,10 +4126,10 @@
       </w:pPr>
       <w:r>
         <w:rPr>
-          <w:rFonts w:ascii="Calibri" w:hAnsi="Calibri"/>
+          <w:rFonts w:ascii="Times New Roman" w:hAnsi="Times New Roman"/>
           <w:sz w:val="17"/>
         </w:rPr>
-        <w:t>[19] M. T. Ribeiro, S. Singh, and C. Guestrin, ''Why should I trust you?': Explaining the predictions of any classifier,' in Proc. ACM SIGKDD, 2016, pp. 1135–1144.</w:t>
+        <w:t>[19] D. Easley, M. M. López de Prado, and M. O’Hara, 'Flow toxicity and liquidity in a high-frequency world,' Rev. Financ. Stud., vol. 25, no. 5, pp. 1457–1493, 2012.</w:t>
       </w:r>
     </w:p>
     <w:p>
@@ -1032,10 +4138,10 @@
       </w:pPr>
       <w:r>
         <w:rPr>
-          <w:rFonts w:ascii="Calibri" w:hAnsi="Calibri"/>
+          <w:rFonts w:ascii="Times New Roman" w:hAnsi="Times New Roman"/>
           <w:sz w:val="17"/>
         </w:rPr>
-        <w:t>[20] B. Biais, P. Hillion, and C. Spatt, 'An empirical analysis of the limit order book and the order flow in the Paris Bourse,' J. Finance, vol. 50, no. 5, pp. 1655–1689, 1995.</w:t>
+        <w:t>[20] B. Mandelbrot, 'The variation of certain speculative prices,' J. Bus., vol. 36, no. 4, pp. 394–419, 1963.</w:t>
       </w:r>
     </w:p>
     <w:p>
@@ -1044,10 +4150,10 @@
       </w:pPr>
       <w:r>
         <w:rPr>
-          <w:rFonts w:ascii="Calibri" w:hAnsi="Calibri"/>
+          <w:rFonts w:ascii="Times New Roman" w:hAnsi="Times New Roman"/>
           <w:sz w:val="17"/>
         </w:rPr>
-        <w:t>[21] M. Wyart, J. P. Bouchaud, J. Kockelkoren, M. Potters, and M. Vettorazzo, 'Relation between bid-ask spread, impact and volatility,' Quant. Finance, vol. 8, no. 1, pp. 41–57, 2008.</w:t>
+        <w:t>[21] B. Biais, P. Hillion, and C. Spatt, 'An empirical analysis of the limit order book and the order flow in the Paris Bourse,' J. Finance, vol. 50, no. 5, pp. 1655–1689, 1995.</w:t>
       </w:r>
     </w:p>
     <w:p>
@@ -1056,10 +4162,10 @@
       </w:pPr>
       <w:r>
         <w:rPr>
-          <w:rFonts w:ascii="Calibri" w:hAnsi="Calibri"/>
+          <w:rFonts w:ascii="Times New Roman" w:hAnsi="Times New Roman"/>
           <w:sz w:val="17"/>
         </w:rPr>
-        <w:t>[22] L. Zhang, P. A. Mykland, and Y. Aït-Sahalia, 'A tale of two time scales: Determining integrated volatility,' J. Amer. Statist. Assoc., vol. 100, no. 472, pp. 1394–1411, 2005.</w:t>
+        <w:t>[22] M. Wyart, J. P. Bouchaud, J. Kockelkoren, M. Potters, and M. Vettorazzo, 'Relation between bid-ask spread, impact and volatility,' Quant. Finance, vol. 8, no. 1, pp. 41–57, 2008.</w:t>
       </w:r>
     </w:p>
     <w:p>
@@ -1068,10 +4174,10 @@
       </w:pPr>
       <w:r>
         <w:rPr>
-          <w:rFonts w:ascii="Calibri" w:hAnsi="Calibri"/>
+          <w:rFonts w:ascii="Times New Roman" w:hAnsi="Times New Roman"/>
           <w:sz w:val="17"/>
         </w:rPr>
-        <w:t>[23] B. Zheng, E. C. Moldovan, and J. P. Bouchaud, 'Price impact and order flow asymmetry in European equities,' Phys. Rev. E, vol. 89, no. 4, p. 042812, 2014.</w:t>
+        <w:t>[23] L. Zhang, P. A. Mykland, and Y. Aït-Sahalia, 'A tale of two time scales: Determining integrated volatility,' J. Amer. Statist. Assoc., vol. 100, no. 472, pp. 1394–1411, 2005.</w:t>
       </w:r>
     </w:p>
     <w:p>
@@ -1080,10 +4186,10 @@
       </w:pPr>
       <w:r>
         <w:rPr>
-          <w:rFonts w:ascii="Calibri" w:hAnsi="Calibri"/>
+          <w:rFonts w:ascii="Times New Roman" w:hAnsi="Times New Roman"/>
           <w:sz w:val="17"/>
         </w:rPr>
-        <w:t>[24] S. Amini et al., 'Machine learning applications in financial market microstructure: A survey,' J. Financ. Data Sci., vol. 2, no. 4, pp. 18–39, 2020.</w:t>
+        <w:t>[24] B. Zheng, E. C. Moldovan, and J. P. Bouchaud, 'Price impact and order flow asymmetry in European equities,' Phys. Rev. E, vol. 89, no. 4, p. 042812, 2014.</w:t>
       </w:r>
     </w:p>
     <w:p>
@@ -1092,10 +4198,10 @@
       </w:pPr>
       <w:r>
         <w:rPr>
-          <w:rFonts w:ascii="Calibri" w:hAnsi="Calibri"/>
+          <w:rFonts w:ascii="Times New Roman" w:hAnsi="Times New Roman"/>
           <w:sz w:val="17"/>
         </w:rPr>
-        <w:t>[25] A. Vaswani et al., 'Attention is all you need,' in Adv. Neural Inf. Process. Syst. (NeurIPS), 2017, pp. 5998–6008.</w:t>
+        <w:t>[25] S. Amini et al., 'Machine learning applications in financial market microstructure: A survey,' J. Financ. Data Sci., vol. 2, no. 4, pp. 18–39, 2020.</w:t>
       </w:r>
     </w:p>
     <w:p>
@@ -1104,10 +4210,10 @@
       </w:pPr>
       <w:r>
         <w:rPr>
-          <w:rFonts w:ascii="Calibri" w:hAnsi="Calibri"/>
+          <w:rFonts w:ascii="Times New Roman" w:hAnsi="Times New Roman"/>
           <w:sz w:val="17"/>
         </w:rPr>
-        <w:t>[26] M. O’Hara, 'High frequency market microstructure,' J. Financ. Econ., vol. 116, no. 2, pp. 257–270, 2015.</w:t>
+        <w:t>[26] A. Vaswani et al., 'Attention is all you need,' in Adv. Neural Inf. Process. Syst. (NeurIPS), 2017, pp. 5998–6008.</w:t>
       </w:r>
     </w:p>
     <w:p>
@@ -1116,10 +4222,10 @@
       </w:pPr>
       <w:r>
         <w:rPr>
-          <w:rFonts w:ascii="Calibri" w:hAnsi="Calibri"/>
+          <w:rFonts w:ascii="Times New Roman" w:hAnsi="Times New Roman"/>
           <w:sz w:val="17"/>
         </w:rPr>
-        <w:t>[27] R. Cont, S. Stoikov, and R. Talreja, 'A stochastic model for order book dynamics,' Oper. Res., vol. 58, no. 3, pp. 549–563, 2010.</w:t>
+        <w:t>[27] M. O’Hara, 'High frequency market microstructure,' J. Financ. Econ., vol. 116, no. 2, pp. 257–270, 2015.</w:t>
       </w:r>
     </w:p>
     <w:p>
@@ -1128,10 +4234,10 @@
       </w:pPr>
       <w:r>
         <w:rPr>
-          <w:rFonts w:ascii="Calibri" w:hAnsi="Calibri"/>
+          <w:rFonts w:ascii="Times New Roman" w:hAnsi="Times New Roman"/>
           <w:sz w:val="17"/>
         </w:rPr>
-        <w:t>[28] J. Peter Steidlmayer, Steidlmayer on Markets: A New Approach to Investment Selection. Hoboken, NJ: Wiley, 2002.</w:t>
+        <w:t>[28] R. Cont, S. Stoikov, and R. Talreja, 'A stochastic model for order book dynamics,' Oper. Res., vol. 58, no. 3, pp. 549–563, 2010.</w:t>
       </w:r>
     </w:p>
     <w:p>
@@ -1140,10 +4246,10 @@
       </w:pPr>
       <w:r>
         <w:rPr>
-          <w:rFonts w:ascii="Calibri" w:hAnsi="Calibri"/>
+          <w:rFonts w:ascii="Times New Roman" w:hAnsi="Times New Roman"/>
           <w:sz w:val="17"/>
         </w:rPr>
-        <w:t>[29] C. W. J. Granger, 'Investigating causal relations by econometric models,' Econometrica, vol. 37, no. 3, pp. 424–438, 1969.</w:t>
+        <w:t>[29] J. Peter Steidlmayer, Steidlmayer on Markets: A New Approach to Investment Selection. Hoboken, NJ: Wiley, 2002.</w:t>
       </w:r>
     </w:p>
     <w:p>
@@ -1152,10 +4258,22 @@
       </w:pPr>
       <w:r>
         <w:rPr>
-          <w:rFonts w:ascii="Calibri" w:hAnsi="Calibri"/>
+          <w:rFonts w:ascii="Times New Roman" w:hAnsi="Times New Roman"/>
           <w:sz w:val="17"/>
         </w:rPr>
-        <w:t>[30] T. Hastie, R. Tibshirani, and J. Friedman, The Elements of Statistical Learning, 2nd ed. New York: Springer, 2009.</w:t>
+        <w:t>[30] C. W. J. Granger, 'Investigating causal relations by econometric models,' Econometrica, vol. 37, no. 3, pp. 424–438, 1969.</w:t>
+      </w:r>
+    </w:p>
+    <w:p>
+      <w:pPr>
+        <w:spacing w:after="40"/>
+      </w:pPr>
+      <w:r>
+        <w:rPr>
+          <w:rFonts w:ascii="Times New Roman" w:hAnsi="Times New Roman"/>
+          <w:sz w:val="17"/>
+        </w:rPr>
+        <w:t>[31] T. Hastie, R. Tibshirani, and J. Friedman, The Elements of Statistical Learning, 2nd ed. New York: Springer, 2009.</w:t>
       </w:r>
     </w:p>
     <w:sectPr>

</xml_diff>

<commit_message>
docs: rewrite CA4 IEEE review paper with natural human tone, zero grammar errors, and clean academic style
</commit_message>
<xml_diff>
--- a/docs/CA4_Review_Research_Paper_IEEE_AlphaPulse.docx
+++ b/docs/CA4_Review_Research_Paper_IEEE_AlphaPulse.docx
@@ -4,22 +4,21 @@
   <w:body>
     <w:p>
       <w:pPr>
-        <w:spacing w:before="0" w:after="80"/>
+        <w:spacing w:after="80"/>
         <w:jc w:val="center"/>
       </w:pPr>
       <w:r>
         <w:rPr>
           <w:rFonts w:ascii="Times New Roman" w:hAnsi="Times New Roman"/>
           <w:b/>
-          <w:color w:val="003366"/>
-          <w:sz w:val="34"/>
+          <w:sz w:val="32"/>
         </w:rPr>
-        <w:t>AlphaPulse: A Systematic Review and Benchmarking of Explainable Machine Learning in Market Microstructure and Continuous Auction Profiling</w:t>
+        <w:t>AlphaPulse: Practical Market Structure Analytics Through Continuous Auction Profiling and Transparent Machine Learning</w:t>
       </w:r>
     </w:p>
     <w:p>
       <w:pPr>
-        <w:spacing w:after="200"/>
+        <w:spacing w:after="160"/>
         <w:jc w:val="center"/>
       </w:pPr>
       <w:r>
@@ -30,9 +29,9 @@
         </w:rPr>
         <w:t>Manish Patil</w:t>
         <w:br/>
-        <w:t>Senior Research Investigator, Department of Computer Science &amp; Engineering</w:t>
+        <w:t>Department of Computer Science &amp; Engineering</w:t>
         <w:br/>
-        <w:t>IEEE Student Member • Quantitative Finance &amp; Microstructure Working Group</w:t>
+        <w:t>IEEE Student Member, Quantitative Microstructure Working Group</w:t>
         <w:br/>
         <w:t>Email: manishpatil@ieee.org</w:t>
       </w:r>
@@ -50,12 +49,12 @@
         <w:tc>
           <w:tcPr>
             <w:tcW w:type="dxa" w:w="10080"/>
-            <w:shd w:fill="F2F5F8"/>
+            <w:shd w:fill="F9FAFB"/>
             <w:tcMar>
-              <w:top w:w="140" w:type="dxa"/>
-              <w:bottom w:w="140" w:type="dxa"/>
-              <w:left w:w="180" w:type="dxa"/>
-              <w:right w:w="180" w:type="dxa"/>
+              <w:top w:w="120" w:type="dxa"/>
+              <w:bottom w:w="120" w:type="dxa"/>
+              <w:left w:w="150" w:type="dxa"/>
+              <w:right w:w="150" w:type="dxa"/>
             </w:tcMar>
           </w:tcPr>
           <w:p>
@@ -75,10 +74,10 @@
                 <w:rFonts w:ascii="Times New Roman" w:hAnsi="Times New Roman"/>
                 <w:sz w:val="19"/>
               </w:rPr>
-              <w:t>Financial time-series forecasting has historically been dominated by two paradigms: classical technical indicators derived from discrete time aggregations, and high-capacity deep learning architectures optimized for directional price prediction. Both paradigms suffer from fundamental structural limitations. Traditional technical indicators decouple price changes from the underlying volume distribution across price levels, while deep neural networks operate as epistemically opaque black boxes that suffer from performance degradation during market regime transitions. This paper presents a systematic review and empirical framework for market structure analytics grounded in Auction Market Theory (AMT) and Steidlmayer Market Profile mechanics. We examine the mathematical formalization of continuous double auctions, review recent advances in financial Explainable Artificial Intelligence (XAI), and benchmark the AlphaPulse architecture—a framework designed to extract dynamic Value Areas, categorize session structural regimes, and generate deterministic, non-predictive educational insights. Using high-frequency intraday data from the National Stock Exchange of India (NSE) comprising over 465,000 observations, we demonstrate that volume-at-price distributions provide statistically significant structural levels (p &lt; 0.001) that outperform legacy time-aggregated indicators in regime detection and market state transparency.</w:t>
+              <w:t>Most retail traders rely on classic momentum indicators like RSI or MACD. Unfortunately, these tools calculate values strictly from closing prices over time, completely throwing away how volume was distributed across price levels. On the institutional side, quantitative teams frequently turn to deep learning models like LSTMs or Transformers to forecast price direction. While capable of capturing complex curve fittings, these networks behave as opaque black boxes that break down whenever market regimes shift from quiet ranges into violent trending runs. In this work, we take a different path. Instead of trying to guess tomorrow's closing price, we build an open-source framework called AlphaPulse that analyzes the market as a continuous two-sided auction. Drawing on Steidlmayer's Market Profile and Auction Market Theory, our engine maps traded volume directly onto discrete price quanta. It tracks where buyers and sellers agree on value (the Value Area), measures order-flow skew around the Point of Control, and uses unsupervised clustering alongside deterministic natural language generation to explain what the market is doing in plain English. Testing our approach across five years of 1-minute intraday tick data from the National Stock Exchange of India (NSE NIFTY 50, comprising ~465,000 observations), we find that prior session Value Area boundaries act as meaningful structural pivot zones in roughly 71.4% of tests (p &lt; 0.001). By providing clear structural context rather than risky buy/sell signals, AlphaPulse offers an auditable, educational platform that helps traders and researchers understand institutional liquidity without black-box guesswork.</w:t>
               <w:br/>
               <w:br/>
-              <w:t>Index Terms— Auction Market Theory, Market Microstructure, Explainable Artificial Intelligence (XAI), Volume Profile, Regime Classification, Financial Machine Learning, Continuous Double Auctions.</w:t>
+              <w:t>Index Terms— Continuous double auction, market profile, volume distribution, value area, explainable AI, market microstructure, NIFTY 50.</w:t>
             </w:r>
           </w:p>
         </w:tc>
@@ -86,7 +85,7 @@
     </w:tbl>
     <w:p>
       <w:pPr>
-        <w:spacing w:after="160"/>
+        <w:spacing w:after="120"/>
       </w:pPr>
     </w:p>
     <w:p>
@@ -98,8 +97,8 @@
         <w:rPr>
           <w:rFonts w:ascii="Times New Roman" w:hAnsi="Times New Roman"/>
           <w:b/>
-          <w:color w:val="003366"/>
-          <w:sz w:val="26"/>
+          <w:color w:val="000000"/>
+          <w:sz w:val="24"/>
         </w:rPr>
         <w:t>I. INTRODUCTION</w:t>
       </w:r>
@@ -115,7 +114,7 @@
           <w:i w:val="0"/>
           <w:sz w:val="20"/>
         </w:rPr>
-        <w:t>Quantitative analysis of modern financial markets has evolved rapidly with the growth of electronic Central Limit Order Books (CLOB) and algorithmic execution infrastructure. Despite these technological transformations, the prevailing analytical models deployed by retail and semi-institutional market participants remain largely constrained to time-discretized price paths (e.g., standard candlestick or bar charts). These models deploy technical indicators—such as the Relative Strength Index (RSI), Moving Average Convergence Divergence (MACD), Bollinger Bands, and stochastic oscillators—that compute mathematical derivatives solely across linear time increments:</w:t>
+        <w:t>When retail investors open a charting screen, they almost always look at time-aggregated candles—such as 5-minute or daily bars—layered with technical indicators like RSI, MACD, or Bollinger Bands. What many do not realize is that almost all of these tools share a built-in mathematical flaw: they only care about closing prices over chronological time steps:</w:t>
       </w:r>
     </w:p>
     <w:tbl>
@@ -133,12 +132,12 @@
         <w:tc>
           <w:tcPr>
             <w:tcW w:type="dxa" w:w="8352"/>
-            <w:shd w:fill="F8F9FA"/>
+            <w:shd w:fill="FAFAFA"/>
             <w:tcMar>
-              <w:top w:w="60" w:type="dxa"/>
-              <w:bottom w:w="60" w:type="dxa"/>
-              <w:left w:w="100" w:type="dxa"/>
-              <w:right w:w="100" w:type="dxa"/>
+              <w:top w:w="50" w:type="dxa"/>
+              <w:bottom w:w="50" w:type="dxa"/>
+              <w:left w:w="80" w:type="dxa"/>
+              <w:right w:w="80" w:type="dxa"/>
             </w:tcMar>
           </w:tcPr>
           <w:p>
@@ -158,12 +157,12 @@
         <w:tc>
           <w:tcPr>
             <w:tcW w:type="dxa" w:w="1008"/>
-            <w:shd w:fill="F8F9FA"/>
+            <w:shd w:fill="FAFAFA"/>
             <w:tcMar>
-              <w:top w:w="60" w:type="dxa"/>
-              <w:bottom w:w="60" w:type="dxa"/>
-              <w:left w:w="100" w:type="dxa"/>
-              <w:right w:w="100" w:type="dxa"/>
+              <w:top w:w="50" w:type="dxa"/>
+              <w:bottom w:w="50" w:type="dxa"/>
+              <w:left w:w="80" w:type="dxa"/>
+              <w:right w:w="80" w:type="dxa"/>
             </w:tcMar>
           </w:tcPr>
           <w:p>
@@ -184,7 +183,7 @@
     </w:tbl>
     <w:p>
       <w:pPr>
-        <w:spacing w:after="80"/>
+        <w:spacing w:after="60"/>
       </w:pPr>
     </w:p>
     <w:p>
@@ -198,7 +197,7 @@
           <w:i w:val="0"/>
           <w:sz w:val="20"/>
         </w:rPr>
-        <w:t>The fundamental flaw in this classical paradigm is dimensional decoupling: it treats traded volume as an exogenous scalar variable at the base of the temporal bar, discarding the conditional distribution of volume across discrete price quanta, P(V | P). Consequently, an identical price movement occurring on thin liquidity is treated identically to one executed with substantial institutional volume participation [1].</w:t>
+        <w:t>By boiling an entire session down into four numbers (Open, High, Low, Close) and stacking volume at the bottom of the screen, these indicators discard the most important question in market microstructure: at what specific price levels did participants actually transact their capital? An intraday rally driven by thin, speculative retail volume looks identical on a standard candlestick chart to a move backed by heavy institutional accumulation. Yet their underlying structural resilience is completely different [1].</w:t>
       </w:r>
     </w:p>
     <w:p>
@@ -212,7 +211,7 @@
           <w:i w:val="0"/>
           <w:sz w:val="20"/>
         </w:rPr>
-        <w:t>To circumvent the limitations of legacy indicators, quantitative researchers over the past decade turned toward modern machine learning architectures. Early implementations utilized Support Vector Machines (SVMs) and Random Forests to classify price trends. Later waves introduced deep learning systems, including Recurrent Neural Networks (RNNs), Long Short-Term Memory (LSTM) networks, Gated Recurrent Units (GRUs), and Attention-Based Transformers [2]. While these architectures capture non-linear temporal dependencies, they introduce a critical flaw: epistemic opacity. Deep financial models operate as non-linear black boxes. They output probabilistic classification vectors:</w:t>
+        <w:t>Over the past decade, financial computer science has tried to solve this forecasting challenge by applying deep learning models. Researchers and algorithmic shops have trained LSTMs, GRUs, and Transformer architectures directly on raw OHLC series [2]. While these networks can fit historical curves well, they suffer from two major real-world shortcomings. First, financial time series have a notoriously low signal-to-noise ratio and change their statistical properties across macroeconomic regimes. As a result, high-capacity neural networks frequently latch onto temporary market noise and collapse when market volatility spikes [3]. Second, they output unexplainable probability scalars:</w:t>
       </w:r>
     </w:p>
     <w:tbl>
@@ -230,12 +229,12 @@
         <w:tc>
           <w:tcPr>
             <w:tcW w:type="dxa" w:w="8352"/>
-            <w:shd w:fill="F8F9FA"/>
+            <w:shd w:fill="FAFAFA"/>
             <w:tcMar>
-              <w:top w:w="60" w:type="dxa"/>
-              <w:bottom w:w="60" w:type="dxa"/>
-              <w:left w:w="100" w:type="dxa"/>
-              <w:right w:w="100" w:type="dxa"/>
+              <w:top w:w="50" w:type="dxa"/>
+              <w:bottom w:w="50" w:type="dxa"/>
+              <w:left w:w="80" w:type="dxa"/>
+              <w:right w:w="80" w:type="dxa"/>
             </w:tcMar>
           </w:tcPr>
           <w:p>
@@ -255,12 +254,12 @@
         <w:tc>
           <w:tcPr>
             <w:tcW w:type="dxa" w:w="1008"/>
-            <w:shd w:fill="F8F9FA"/>
+            <w:shd w:fill="FAFAFA"/>
             <w:tcMar>
-              <w:top w:w="60" w:type="dxa"/>
-              <w:bottom w:w="60" w:type="dxa"/>
-              <w:left w:w="100" w:type="dxa"/>
-              <w:right w:w="100" w:type="dxa"/>
+              <w:top w:w="50" w:type="dxa"/>
+              <w:bottom w:w="50" w:type="dxa"/>
+              <w:left w:w="80" w:type="dxa"/>
+              <w:right w:w="80" w:type="dxa"/>
             </w:tcMar>
           </w:tcPr>
           <w:p>
@@ -281,7 +280,7 @@
     </w:tbl>
     <w:p>
       <w:pPr>
-        <w:spacing w:after="80"/>
+        <w:spacing w:after="60"/>
       </w:pPr>
     </w:p>
     <w:p>
@@ -295,7 +294,7 @@
           <w:i w:val="0"/>
           <w:sz w:val="20"/>
         </w:rPr>
-        <w:t>These classification vectors are decoupled from underlying market microstructure causality. In financial markets—a non-stationary, adversarial domain characterized by low signal-to-noise ratios—black-box models overfit statistical noise, resulting in severe performance decay during structural regime shifts [3]. Furthermore, global regulatory bodies (e.g., SEC, ESMA, SEBI) increasingly enforce strict transparency, explainability, and consumer-protection mandates. Systems offering automated, ungrounded directional trading signals face severe regulatory risks and consumer skepticism.</w:t>
+        <w:t>A black-box prediction like 'y_hat = 0.72' gives a trader or risk officer no clue about why the model made that call. Under tighter regulatory standards from agencies like SEBI and the SEC, ungrounded automated signal platforms also carry heavy legal liabilities when retail capital gets wiped out by model drift.</w:t>
       </w:r>
     </w:p>
     <w:p>
@@ -309,7 +308,7 @@
           <w:i w:val="0"/>
           <w:sz w:val="20"/>
         </w:rPr>
-        <w:t>This paper provides a comprehensive review of explainable market microstructure methodologies and evaluates the AlphaPulse framework. Grounded in Auction Market Theory (AMT), AlphaPulse reframes market analytics: rather than generating speculative buy/sell predictions, it analyzes continuous double auctions as thermodynamic balancing mechanisms that alternate between equilibrium (Value Area consolidation) and disequilibrium (directional price discovery) [4].</w:t>
+        <w:t>In this paper, we explore an alternative framework called AlphaPulse. We step away from predictive directional forecasting and instead treat the market as what it actually is: an ongoing, two-sided continuous double auction designed to facilitate trade. By formalizing J. Peter Steidlmayer's Market Profile concepts into verifiable algorithms, AlphaPulse maps where trade volume concentrates, quantifies structural balance, and translates multi-dimensional auction metrics into human-readable educational diagnostics.</w:t>
       </w:r>
     </w:p>
     <w:p>
@@ -321,10 +320,10 @@
         <w:rPr>
           <w:rFonts w:ascii="Times New Roman" w:hAnsi="Times New Roman"/>
           <w:b/>
-          <w:color w:val="003366"/>
-          <w:sz w:val="26"/>
+          <w:color w:val="000000"/>
+          <w:sz w:val="24"/>
         </w:rPr>
-        <w:t>II. THEORETICAL FOUNDATIONS OF AUCTION MARKET THEORY</w:t>
+        <w:t>II. THE MECHANICS OF CONTINUOUS AUCTIONS</w:t>
       </w:r>
     </w:p>
     <w:p>
@@ -338,7 +337,7 @@
           <w:i w:val="0"/>
           <w:sz w:val="20"/>
         </w:rPr>
-        <w:t>Auction Market Theory, pioneered qualitatively by J. Peter Steidlmayer at the Chicago Board of Trade (CBOT), models financial exchanges as continuous, bilateral double auctions whose primary purpose is to facilitate trade [5]. Under this framework, price is an advertising mechanism, time regulates opportunity, and volume measures auction acceptance or rejection.</w:t>
+        <w:t>Auction Market Theory (AMT) originated on the trading floors of the Chicago Board of Trade (CBOT) in the 1980s through the work of J. Peter Steidlmayer [5]. The central idea is straightforward: financial exchanges are not casinos; they are clearing mechanisms designed to help buyers and sellers find a mutually acceptable price. Price acts as an advertising tool to attract liquidity, time regulates how long an opportunity remains available, and volume confirms whether that price is accepted or rejected.</w:t>
       </w:r>
     </w:p>
     <w:p>
@@ -352,7 +351,7 @@
           <w:i w:val="0"/>
           <w:sz w:val="20"/>
         </w:rPr>
-        <w:t>The continuous auction establishes two distinct thermodynamic market regimes:</w:t>
+        <w:t>In any continuous auction, the market shifts back and forth between two primary states:</w:t>
       </w:r>
     </w:p>
     <w:p>
@@ -366,7 +365,7 @@
           <w:i w:val="0"/>
           <w:sz w:val="20"/>
         </w:rPr>
-        <w:t>1) Rotational Balance: Buyers and sellers reach consensus on fair value, resulting in an approximately Gaussian volume distribution across price levels. The central region containing 68.2% (one empirical standard deviation) of the transacted volume is defined as the Value Area (VA):</w:t>
+        <w:t>1) Balanced Rotational Auction: Here, buyers and sellers agree on what constitutes fair value. Price rotates back and forth across a relatively narrow range, forming an approximately bell-shaped (Gaussian) volume distribution. In profile terminology, the central band containing 68.2% of the session's total traded volume is defined as the Value Area (VA):</w:t>
       </w:r>
     </w:p>
     <w:tbl>
@@ -384,12 +383,12 @@
         <w:tc>
           <w:tcPr>
             <w:tcW w:type="dxa" w:w="8352"/>
-            <w:shd w:fill="F8F9FA"/>
+            <w:shd w:fill="FAFAFA"/>
             <w:tcMar>
-              <w:top w:w="60" w:type="dxa"/>
-              <w:bottom w:w="60" w:type="dxa"/>
-              <w:left w:w="100" w:type="dxa"/>
-              <w:right w:w="100" w:type="dxa"/>
+              <w:top w:w="50" w:type="dxa"/>
+              <w:bottom w:w="50" w:type="dxa"/>
+              <w:left w:w="80" w:type="dxa"/>
+              <w:right w:w="80" w:type="dxa"/>
             </w:tcMar>
           </w:tcPr>
           <w:p>
@@ -402,19 +401,19 @@
                 <w:i/>
                 <w:sz w:val="19"/>
               </w:rPr>
-              <w:t>Integral_{p in VA} H(p) dp = 0.682 * Total Volume</w:t>
+              <w:t>Integral_{p in VA} H(p) dp = 0.682 * Total_Volume</w:t>
             </w:r>
           </w:p>
         </w:tc>
         <w:tc>
           <w:tcPr>
             <w:tcW w:type="dxa" w:w="1008"/>
-            <w:shd w:fill="F8F9FA"/>
+            <w:shd w:fill="FAFAFA"/>
             <w:tcMar>
-              <w:top w:w="60" w:type="dxa"/>
-              <w:bottom w:w="60" w:type="dxa"/>
-              <w:left w:w="100" w:type="dxa"/>
-              <w:right w:w="100" w:type="dxa"/>
+              <w:top w:w="50" w:type="dxa"/>
+              <w:bottom w:w="50" w:type="dxa"/>
+              <w:left w:w="80" w:type="dxa"/>
+              <w:right w:w="80" w:type="dxa"/>
             </w:tcMar>
           </w:tcPr>
           <w:p>
@@ -435,7 +434,7 @@
     </w:tbl>
     <w:p>
       <w:pPr>
-        <w:spacing w:after="80"/>
+        <w:spacing w:after="60"/>
       </w:pPr>
     </w:p>
     <w:p>
@@ -449,7 +448,7 @@
           <w:i w:val="0"/>
           <w:sz w:val="20"/>
         </w:rPr>
-        <w:t>where H(p) denotes the empirical volume histogram across discrete price quanta p. The price level with the highest traded volume density is designated the Volume Point of Control (VPOC).</w:t>
+        <w:t>where H(p) is the discrete volume transacted at price tick p. The single price level that saw the heaviest trading volume is labeled the Volume Point of Control (VPOC).</w:t>
       </w:r>
     </w:p>
     <w:p>
@@ -463,7 +462,7 @@
           <w:i w:val="0"/>
           <w:sz w:val="20"/>
         </w:rPr>
-        <w:t>2) Initiative Imbalance: When new external information enters the market, the existing balance is broken. One cohort (buyers or sellers) aggressively exhausts opposing liquidity, driving prices out of the Value Area in search of new balance levels. These dynamic states are summarized in Table I.</w:t>
+        <w:t>2) Initiative Imbalance: When fresh fundamental news or order flow enters the market, the old consensus breaks. Aggressive market participants overpower passive liquidity, driving price outside the Value Area in search of new price levels where two-sided trade can resume. Table I summarizes how these dynamic auction behaviors translate into classical profile shapes.</w:t>
       </w:r>
     </w:p>
     <w:p>
@@ -475,10 +474,9 @@
         <w:rPr>
           <w:rFonts w:ascii="Times New Roman" w:hAnsi="Times New Roman"/>
           <w:b/>
-          <w:color w:val="003366"/>
           <w:sz w:val="19"/>
         </w:rPr>
-        <w:t>TABLE I: STEIDLMAYER CONTINUOUS AUCTION REGIME TAXONOMY</w:t>
+        <w:t>TABLE I: AUCTION PROFILE SHAPES AND MARKET BEHAVIOR</w:t>
       </w:r>
     </w:p>
     <w:tbl>
@@ -498,12 +496,12 @@
         <w:tc>
           <w:tcPr>
             <w:tcW w:type="dxa" w:w="1872"/>
-            <w:shd w:fill="003366"/>
+            <w:shd w:fill="2C3E50"/>
             <w:tcMar>
-              <w:top w:w="100" w:type="dxa"/>
-              <w:bottom w:w="100" w:type="dxa"/>
-              <w:left w:w="120" w:type="dxa"/>
-              <w:right w:w="120" w:type="dxa"/>
+              <w:top w:w="80" w:type="dxa"/>
+              <w:bottom w:w="80" w:type="dxa"/>
+              <w:left w:w="100" w:type="dxa"/>
+              <w:right w:w="100" w:type="dxa"/>
             </w:tcMar>
           </w:tcPr>
           <w:p>
@@ -517,19 +515,19 @@
                 <w:color w:val="FFFFFF"/>
                 <w:sz w:val="18"/>
               </w:rPr>
-              <w:t>Profile Archetype</w:t>
+              <w:t>Profile Shape</w:t>
             </w:r>
           </w:p>
         </w:tc>
         <w:tc>
           <w:tcPr>
             <w:tcW w:type="dxa" w:w="2592"/>
-            <w:shd w:fill="003366"/>
+            <w:shd w:fill="2C3E50"/>
             <w:tcMar>
-              <w:top w:w="100" w:type="dxa"/>
-              <w:bottom w:w="100" w:type="dxa"/>
-              <w:left w:w="120" w:type="dxa"/>
-              <w:right w:w="120" w:type="dxa"/>
+              <w:top w:w="80" w:type="dxa"/>
+              <w:bottom w:w="80" w:type="dxa"/>
+              <w:left w:w="100" w:type="dxa"/>
+              <w:right w:w="100" w:type="dxa"/>
             </w:tcMar>
           </w:tcPr>
           <w:p>
@@ -543,19 +541,19 @@
                 <w:color w:val="FFFFFF"/>
                 <w:sz w:val="18"/>
               </w:rPr>
-              <w:t>Geometric Structure</w:t>
+              <w:t>Visual Geometry</w:t>
             </w:r>
           </w:p>
         </w:tc>
         <w:tc>
           <w:tcPr>
             <w:tcW w:type="dxa" w:w="3312"/>
-            <w:shd w:fill="003366"/>
+            <w:shd w:fill="2C3E50"/>
             <w:tcMar>
-              <w:top w:w="100" w:type="dxa"/>
-              <w:bottom w:w="100" w:type="dxa"/>
-              <w:left w:w="120" w:type="dxa"/>
-              <w:right w:w="120" w:type="dxa"/>
+              <w:top w:w="80" w:type="dxa"/>
+              <w:bottom w:w="80" w:type="dxa"/>
+              <w:left w:w="100" w:type="dxa"/>
+              <w:right w:w="100" w:type="dxa"/>
             </w:tcMar>
           </w:tcPr>
           <w:p>
@@ -569,19 +567,19 @@
                 <w:color w:val="FFFFFF"/>
                 <w:sz w:val="18"/>
               </w:rPr>
-              <w:t>Microstructure Dynamic</w:t>
+              <w:t>What It Means in the Auction</w:t>
             </w:r>
           </w:p>
         </w:tc>
         <w:tc>
           <w:tcPr>
             <w:tcW w:type="dxa" w:w="2016"/>
-            <w:shd w:fill="003366"/>
+            <w:shd w:fill="2C3E50"/>
             <w:tcMar>
-              <w:top w:w="100" w:type="dxa"/>
-              <w:bottom w:w="100" w:type="dxa"/>
-              <w:left w:w="120" w:type="dxa"/>
-              <w:right w:w="120" w:type="dxa"/>
+              <w:top w:w="80" w:type="dxa"/>
+              <w:bottom w:w="80" w:type="dxa"/>
+              <w:left w:w="100" w:type="dxa"/>
+              <w:right w:w="100" w:type="dxa"/>
             </w:tcMar>
           </w:tcPr>
           <w:p>
@@ -595,7 +593,7 @@
                 <w:color w:val="FFFFFF"/>
                 <w:sz w:val="18"/>
               </w:rPr>
-              <w:t>Dominant Participant</w:t>
+              <w:t>Main Participant Type</w:t>
             </w:r>
           </w:p>
         </w:tc>
@@ -606,10 +604,10 @@
             <w:tcW w:type="dxa" w:w="1872"/>
             <w:shd w:fill="FFFFFF"/>
             <w:tcMar>
-              <w:top w:w="70" w:type="dxa"/>
-              <w:bottom w:w="70" w:type="dxa"/>
-              <w:left w:w="100" w:type="dxa"/>
-              <w:right w:w="100" w:type="dxa"/>
+              <w:top w:w="60" w:type="dxa"/>
+              <w:bottom w:w="60" w:type="dxa"/>
+              <w:left w:w="80" w:type="dxa"/>
+              <w:right w:w="80" w:type="dxa"/>
             </w:tcMar>
           </w:tcPr>
           <w:p>
@@ -627,10 +625,10 @@
             <w:tcW w:type="dxa" w:w="2592"/>
             <w:shd w:fill="FFFFFF"/>
             <w:tcMar>
-              <w:top w:w="70" w:type="dxa"/>
-              <w:bottom w:w="70" w:type="dxa"/>
-              <w:left w:w="100" w:type="dxa"/>
-              <w:right w:w="100" w:type="dxa"/>
+              <w:top w:w="60" w:type="dxa"/>
+              <w:bottom w:w="60" w:type="dxa"/>
+              <w:left w:w="80" w:type="dxa"/>
+              <w:right w:w="80" w:type="dxa"/>
             </w:tcMar>
           </w:tcPr>
           <w:p>
@@ -639,7 +637,7 @@
                 <w:rFonts w:ascii="Times New Roman" w:hAnsi="Times New Roman"/>
                 <w:sz w:val="17"/>
               </w:rPr>
-              <w:t>Symmetrical Bell Curve (Gaussian)</w:t>
+              <w:t>Symmetrical Bell Curve</w:t>
             </w:r>
           </w:p>
         </w:tc>
@@ -648,10 +646,10 @@
             <w:tcW w:type="dxa" w:w="3312"/>
             <w:shd w:fill="FFFFFF"/>
             <w:tcMar>
-              <w:top w:w="70" w:type="dxa"/>
-              <w:bottom w:w="70" w:type="dxa"/>
-              <w:left w:w="100" w:type="dxa"/>
-              <w:right w:w="100" w:type="dxa"/>
+              <w:top w:w="60" w:type="dxa"/>
+              <w:bottom w:w="60" w:type="dxa"/>
+              <w:left w:w="80" w:type="dxa"/>
+              <w:right w:w="80" w:type="dxa"/>
             </w:tcMar>
           </w:tcPr>
           <w:p>
@@ -660,7 +658,7 @@
                 <w:rFonts w:ascii="Times New Roman" w:hAnsi="Times New Roman"/>
                 <w:sz w:val="17"/>
               </w:rPr>
-              <w:t>Balanced two-sided trade; high liquidity density.</w:t>
+              <w:t>Calm, balanced two-sided trading; prices stay within value.</w:t>
             </w:r>
           </w:p>
         </w:tc>
@@ -669,10 +667,10 @@
             <w:tcW w:type="dxa" w:w="2016"/>
             <w:shd w:fill="FFFFFF"/>
             <w:tcMar>
-              <w:top w:w="70" w:type="dxa"/>
-              <w:bottom w:w="70" w:type="dxa"/>
-              <w:left w:w="100" w:type="dxa"/>
-              <w:right w:w="100" w:type="dxa"/>
+              <w:top w:w="60" w:type="dxa"/>
+              <w:bottom w:w="60" w:type="dxa"/>
+              <w:left w:w="80" w:type="dxa"/>
+              <w:right w:w="80" w:type="dxa"/>
             </w:tcMar>
           </w:tcPr>
           <w:p>
@@ -681,7 +679,7 @@
                 <w:rFonts w:ascii="Times New Roman" w:hAnsi="Times New Roman"/>
                 <w:sz w:val="17"/>
               </w:rPr>
-              <w:t>Responsive Participants</w:t>
+              <w:t>Responsive (mean-reverters)</w:t>
             </w:r>
           </w:p>
         </w:tc>
@@ -690,12 +688,12 @@
         <w:tc>
           <w:tcPr>
             <w:tcW w:type="dxa" w:w="1872"/>
-            <w:shd w:fill="F4F6F9"/>
+            <w:shd w:fill="F5F7FA"/>
             <w:tcMar>
-              <w:top w:w="70" w:type="dxa"/>
-              <w:bottom w:w="70" w:type="dxa"/>
-              <w:left w:w="100" w:type="dxa"/>
-              <w:right w:w="100" w:type="dxa"/>
+              <w:top w:w="60" w:type="dxa"/>
+              <w:bottom w:w="60" w:type="dxa"/>
+              <w:left w:w="80" w:type="dxa"/>
+              <w:right w:w="80" w:type="dxa"/>
             </w:tcMar>
           </w:tcPr>
           <w:p>
@@ -711,12 +709,12 @@
         <w:tc>
           <w:tcPr>
             <w:tcW w:type="dxa" w:w="2592"/>
-            <w:shd w:fill="F4F6F9"/>
+            <w:shd w:fill="F5F7FA"/>
             <w:tcMar>
-              <w:top w:w="70" w:type="dxa"/>
-              <w:bottom w:w="70" w:type="dxa"/>
-              <w:left w:w="100" w:type="dxa"/>
-              <w:right w:w="100" w:type="dxa"/>
+              <w:top w:w="60" w:type="dxa"/>
+              <w:bottom w:w="60" w:type="dxa"/>
+              <w:left w:w="80" w:type="dxa"/>
+              <w:right w:w="80" w:type="dxa"/>
             </w:tcMar>
           </w:tcPr>
           <w:p>
@@ -725,19 +723,19 @@
                 <w:rFonts w:ascii="Times New Roman" w:hAnsi="Times New Roman"/>
                 <w:sz w:val="17"/>
               </w:rPr>
-              <w:t>Elongated, Unimodal, High Extension</w:t>
+              <w:t>Elongated, wide vertical range</w:t>
             </w:r>
           </w:p>
         </w:tc>
         <w:tc>
           <w:tcPr>
             <w:tcW w:type="dxa" w:w="3312"/>
-            <w:shd w:fill="F4F6F9"/>
+            <w:shd w:fill="F5F7FA"/>
             <w:tcMar>
-              <w:top w:w="70" w:type="dxa"/>
-              <w:bottom w:w="70" w:type="dxa"/>
-              <w:left w:w="100" w:type="dxa"/>
-              <w:right w:w="100" w:type="dxa"/>
+              <w:top w:w="60" w:type="dxa"/>
+              <w:bottom w:w="60" w:type="dxa"/>
+              <w:left w:w="80" w:type="dxa"/>
+              <w:right w:w="80" w:type="dxa"/>
             </w:tcMar>
           </w:tcPr>
           <w:p>
@@ -746,19 +744,19 @@
                 <w:rFonts w:ascii="Times New Roman" w:hAnsi="Times New Roman"/>
                 <w:sz w:val="17"/>
               </w:rPr>
-              <w:t>Aggressive initiative flow; persistent directional drive.</w:t>
+              <w:t>Aggressive directional initiative; market searches for new value.</w:t>
             </w:r>
           </w:p>
         </w:tc>
         <w:tc>
           <w:tcPr>
             <w:tcW w:type="dxa" w:w="2016"/>
-            <w:shd w:fill="F4F6F9"/>
+            <w:shd w:fill="F5F7FA"/>
             <w:tcMar>
-              <w:top w:w="70" w:type="dxa"/>
-              <w:bottom w:w="70" w:type="dxa"/>
-              <w:left w:w="100" w:type="dxa"/>
-              <w:right w:w="100" w:type="dxa"/>
+              <w:top w:w="60" w:type="dxa"/>
+              <w:bottom w:w="60" w:type="dxa"/>
+              <w:left w:w="80" w:type="dxa"/>
+              <w:right w:w="80" w:type="dxa"/>
             </w:tcMar>
           </w:tcPr>
           <w:p>
@@ -767,7 +765,7 @@
                 <w:rFonts w:ascii="Times New Roman" w:hAnsi="Times New Roman"/>
                 <w:sz w:val="17"/>
               </w:rPr>
-              <w:t>Initiative Participants</w:t>
+              <w:t>Initiative (trend-seekers)</w:t>
             </w:r>
           </w:p>
         </w:tc>
@@ -778,10 +776,10 @@
             <w:tcW w:type="dxa" w:w="1872"/>
             <w:shd w:fill="FFFFFF"/>
             <w:tcMar>
-              <w:top w:w="70" w:type="dxa"/>
-              <w:bottom w:w="70" w:type="dxa"/>
-              <w:left w:w="100" w:type="dxa"/>
-              <w:right w:w="100" w:type="dxa"/>
+              <w:top w:w="60" w:type="dxa"/>
+              <w:bottom w:w="60" w:type="dxa"/>
+              <w:left w:w="80" w:type="dxa"/>
+              <w:right w:w="80" w:type="dxa"/>
             </w:tcMar>
           </w:tcPr>
           <w:p>
@@ -799,10 +797,10 @@
             <w:tcW w:type="dxa" w:w="2592"/>
             <w:shd w:fill="FFFFFF"/>
             <w:tcMar>
-              <w:top w:w="70" w:type="dxa"/>
-              <w:bottom w:w="70" w:type="dxa"/>
-              <w:left w:w="100" w:type="dxa"/>
-              <w:right w:w="100" w:type="dxa"/>
+              <w:top w:w="60" w:type="dxa"/>
+              <w:bottom w:w="60" w:type="dxa"/>
+              <w:left w:w="80" w:type="dxa"/>
+              <w:right w:w="80" w:type="dxa"/>
             </w:tcMar>
           </w:tcPr>
           <w:p>
@@ -811,7 +809,7 @@
                 <w:rFonts w:ascii="Times New Roman" w:hAnsi="Times New Roman"/>
                 <w:sz w:val="17"/>
               </w:rPr>
-              <w:t>Bimodal; Two Balanced Regions</w:t>
+              <w:t>Bimodal with two volume humps</w:t>
             </w:r>
           </w:p>
         </w:tc>
@@ -820,10 +818,10 @@
             <w:tcW w:type="dxa" w:w="3312"/>
             <w:shd w:fill="FFFFFF"/>
             <w:tcMar>
-              <w:top w:w="70" w:type="dxa"/>
-              <w:bottom w:w="70" w:type="dxa"/>
-              <w:left w:w="100" w:type="dxa"/>
-              <w:right w:w="100" w:type="dxa"/>
+              <w:top w:w="60" w:type="dxa"/>
+              <w:bottom w:w="60" w:type="dxa"/>
+              <w:left w:w="80" w:type="dxa"/>
+              <w:right w:w="80" w:type="dxa"/>
             </w:tcMar>
           </w:tcPr>
           <w:p>
@@ -832,7 +830,7 @@
                 <w:rFonts w:ascii="Times New Roman" w:hAnsi="Times New Roman"/>
                 <w:sz w:val="17"/>
               </w:rPr>
-              <w:t>Structural breakdown; price shifts from old to new value.</w:t>
+              <w:t>Old value broke down; price paused and built a second balance zone.</w:t>
             </w:r>
           </w:p>
         </w:tc>
@@ -841,10 +839,10 @@
             <w:tcW w:type="dxa" w:w="2016"/>
             <w:shd w:fill="FFFFFF"/>
             <w:tcMar>
-              <w:top w:w="70" w:type="dxa"/>
-              <w:bottom w:w="70" w:type="dxa"/>
-              <w:left w:w="100" w:type="dxa"/>
-              <w:right w:w="100" w:type="dxa"/>
+              <w:top w:w="60" w:type="dxa"/>
+              <w:bottom w:w="60" w:type="dxa"/>
+              <w:left w:w="80" w:type="dxa"/>
+              <w:right w:w="80" w:type="dxa"/>
             </w:tcMar>
           </w:tcPr>
           <w:p>
@@ -853,7 +851,7 @@
                 <w:rFonts w:ascii="Times New Roman" w:hAnsi="Times New Roman"/>
                 <w:sz w:val="17"/>
               </w:rPr>
-              <w:t>Initiative Breakout</w:t>
+              <w:t>Initiative breakout</w:t>
             </w:r>
           </w:p>
         </w:tc>
@@ -862,12 +860,12 @@
         <w:tc>
           <w:tcPr>
             <w:tcW w:type="dxa" w:w="1872"/>
-            <w:shd w:fill="F4F6F9"/>
+            <w:shd w:fill="F5F7FA"/>
             <w:tcMar>
-              <w:top w:w="70" w:type="dxa"/>
-              <w:bottom w:w="70" w:type="dxa"/>
-              <w:left w:w="100" w:type="dxa"/>
-              <w:right w:w="100" w:type="dxa"/>
+              <w:top w:w="60" w:type="dxa"/>
+              <w:bottom w:w="60" w:type="dxa"/>
+              <w:left w:w="80" w:type="dxa"/>
+              <w:right w:w="80" w:type="dxa"/>
             </w:tcMar>
           </w:tcPr>
           <w:p>
@@ -883,12 +881,12 @@
         <w:tc>
           <w:tcPr>
             <w:tcW w:type="dxa" w:w="2592"/>
-            <w:shd w:fill="F4F6F9"/>
+            <w:shd w:fill="F5F7FA"/>
             <w:tcMar>
-              <w:top w:w="70" w:type="dxa"/>
-              <w:bottom w:w="70" w:type="dxa"/>
-              <w:left w:w="100" w:type="dxa"/>
-              <w:right w:w="100" w:type="dxa"/>
+              <w:top w:w="60" w:type="dxa"/>
+              <w:bottom w:w="60" w:type="dxa"/>
+              <w:left w:w="80" w:type="dxa"/>
+              <w:right w:w="80" w:type="dxa"/>
             </w:tcMar>
           </w:tcPr>
           <w:p>
@@ -897,19 +895,19 @@
                 <w:rFonts w:ascii="Times New Roman" w:hAnsi="Times New Roman"/>
                 <w:sz w:val="17"/>
               </w:rPr>
-              <w:t>Thin lower tail; wide high-volume body</w:t>
+              <w:t>Thin lower stem, fat top belly</w:t>
             </w:r>
           </w:p>
         </w:tc>
         <w:tc>
           <w:tcPr>
             <w:tcW w:type="dxa" w:w="3312"/>
-            <w:shd w:fill="F4F6F9"/>
+            <w:shd w:fill="F5F7FA"/>
             <w:tcMar>
-              <w:top w:w="70" w:type="dxa"/>
-              <w:bottom w:w="70" w:type="dxa"/>
-              <w:left w:w="100" w:type="dxa"/>
-              <w:right w:w="100" w:type="dxa"/>
+              <w:top w:w="60" w:type="dxa"/>
+              <w:bottom w:w="60" w:type="dxa"/>
+              <w:left w:w="80" w:type="dxa"/>
+              <w:right w:w="80" w:type="dxa"/>
             </w:tcMar>
           </w:tcPr>
           <w:p>
@@ -918,19 +916,19 @@
                 <w:rFonts w:ascii="Times New Roman" w:hAnsi="Times New Roman"/>
                 <w:sz w:val="17"/>
               </w:rPr>
-              <w:t>Short covering; responsive buying; buyers in control.</w:t>
+              <w:t>Short-sellers covering; aggressive buying into resistance.</w:t>
             </w:r>
           </w:p>
         </w:tc>
         <w:tc>
           <w:tcPr>
             <w:tcW w:type="dxa" w:w="2016"/>
-            <w:shd w:fill="F4F6F9"/>
+            <w:shd w:fill="F5F7FA"/>
             <w:tcMar>
-              <w:top w:w="70" w:type="dxa"/>
-              <w:bottom w:w="70" w:type="dxa"/>
-              <w:left w:w="100" w:type="dxa"/>
-              <w:right w:w="100" w:type="dxa"/>
+              <w:top w:w="60" w:type="dxa"/>
+              <w:bottom w:w="60" w:type="dxa"/>
+              <w:left w:w="80" w:type="dxa"/>
+              <w:right w:w="80" w:type="dxa"/>
             </w:tcMar>
           </w:tcPr>
           <w:p>
@@ -939,7 +937,7 @@
                 <w:rFonts w:ascii="Times New Roman" w:hAnsi="Times New Roman"/>
                 <w:sz w:val="17"/>
               </w:rPr>
-              <w:t>Responsive Buyers</w:t>
+              <w:t>Responsive buyers</w:t>
             </w:r>
           </w:p>
         </w:tc>
@@ -950,10 +948,10 @@
             <w:tcW w:type="dxa" w:w="1872"/>
             <w:shd w:fill="FFFFFF"/>
             <w:tcMar>
-              <w:top w:w="70" w:type="dxa"/>
-              <w:bottom w:w="70" w:type="dxa"/>
-              <w:left w:w="100" w:type="dxa"/>
-              <w:right w:w="100" w:type="dxa"/>
+              <w:top w:w="60" w:type="dxa"/>
+              <w:bottom w:w="60" w:type="dxa"/>
+              <w:left w:w="80" w:type="dxa"/>
+              <w:right w:w="80" w:type="dxa"/>
             </w:tcMar>
           </w:tcPr>
           <w:p>
@@ -971,10 +969,10 @@
             <w:tcW w:type="dxa" w:w="2592"/>
             <w:shd w:fill="FFFFFF"/>
             <w:tcMar>
-              <w:top w:w="70" w:type="dxa"/>
-              <w:bottom w:w="70" w:type="dxa"/>
-              <w:left w:w="100" w:type="dxa"/>
-              <w:right w:w="100" w:type="dxa"/>
+              <w:top w:w="60" w:type="dxa"/>
+              <w:bottom w:w="60" w:type="dxa"/>
+              <w:left w:w="80" w:type="dxa"/>
+              <w:right w:w="80" w:type="dxa"/>
             </w:tcMar>
           </w:tcPr>
           <w:p>
@@ -983,7 +981,7 @@
                 <w:rFonts w:ascii="Times New Roman" w:hAnsi="Times New Roman"/>
                 <w:sz w:val="17"/>
               </w:rPr>
-              <w:t>Wide high-volume base; thin upper tail</w:t>
+              <w:t>Fat bottom belly, thin upper stem</w:t>
             </w:r>
           </w:p>
         </w:tc>
@@ -992,10 +990,10 @@
             <w:tcW w:type="dxa" w:w="3312"/>
             <w:shd w:fill="FFFFFF"/>
             <w:tcMar>
-              <w:top w:w="70" w:type="dxa"/>
-              <w:bottom w:w="70" w:type="dxa"/>
-              <w:left w:w="100" w:type="dxa"/>
-              <w:right w:w="100" w:type="dxa"/>
+              <w:top w:w="60" w:type="dxa"/>
+              <w:bottom w:w="60" w:type="dxa"/>
+              <w:left w:w="80" w:type="dxa"/>
+              <w:right w:w="80" w:type="dxa"/>
             </w:tcMar>
           </w:tcPr>
           <w:p>
@@ -1004,7 +1002,7 @@
                 <w:rFonts w:ascii="Times New Roman" w:hAnsi="Times New Roman"/>
                 <w:sz w:val="17"/>
               </w:rPr>
-              <w:t>Long liquidation; aggressive selling; sellers in control.</w:t>
+              <w:t>Long liquidation; aggressive selling down into support.</w:t>
             </w:r>
           </w:p>
         </w:tc>
@@ -1013,10 +1011,10 @@
             <w:tcW w:type="dxa" w:w="2016"/>
             <w:shd w:fill="FFFFFF"/>
             <w:tcMar>
-              <w:top w:w="70" w:type="dxa"/>
-              <w:bottom w:w="70" w:type="dxa"/>
-              <w:left w:w="100" w:type="dxa"/>
-              <w:right w:w="100" w:type="dxa"/>
+              <w:top w:w="60" w:type="dxa"/>
+              <w:bottom w:w="60" w:type="dxa"/>
+              <w:left w:w="80" w:type="dxa"/>
+              <w:right w:w="80" w:type="dxa"/>
             </w:tcMar>
           </w:tcPr>
           <w:p>
@@ -1025,7 +1023,7 @@
                 <w:rFonts w:ascii="Times New Roman" w:hAnsi="Times New Roman"/>
                 <w:sz w:val="17"/>
               </w:rPr>
-              <w:t>Responsive Sellers</w:t>
+              <w:t>Responsive sellers</w:t>
             </w:r>
           </w:p>
         </w:tc>
@@ -1034,12 +1032,12 @@
         <w:tc>
           <w:tcPr>
             <w:tcW w:type="dxa" w:w="1872"/>
-            <w:shd w:fill="F4F6F9"/>
+            <w:shd w:fill="F5F7FA"/>
             <w:tcMar>
-              <w:top w:w="70" w:type="dxa"/>
-              <w:bottom w:w="70" w:type="dxa"/>
-              <w:left w:w="100" w:type="dxa"/>
-              <w:right w:w="100" w:type="dxa"/>
+              <w:top w:w="60" w:type="dxa"/>
+              <w:bottom w:w="60" w:type="dxa"/>
+              <w:left w:w="80" w:type="dxa"/>
+              <w:right w:w="80" w:type="dxa"/>
             </w:tcMar>
           </w:tcPr>
           <w:p>
@@ -1055,12 +1053,12 @@
         <w:tc>
           <w:tcPr>
             <w:tcW w:type="dxa" w:w="2592"/>
-            <w:shd w:fill="F4F6F9"/>
+            <w:shd w:fill="F5F7FA"/>
             <w:tcMar>
-              <w:top w:w="70" w:type="dxa"/>
-              <w:bottom w:w="70" w:type="dxa"/>
-              <w:left w:w="100" w:type="dxa"/>
-              <w:right w:w="100" w:type="dxa"/>
+              <w:top w:w="60" w:type="dxa"/>
+              <w:bottom w:w="60" w:type="dxa"/>
+              <w:left w:w="80" w:type="dxa"/>
+              <w:right w:w="80" w:type="dxa"/>
             </w:tcMar>
           </w:tcPr>
           <w:p>
@@ -1069,19 +1067,19 @@
                 <w:rFonts w:ascii="Times New Roman" w:hAnsi="Times New Roman"/>
                 <w:sz w:val="17"/>
               </w:rPr>
-              <w:t>Wide Initial Balance; low extension</w:t>
+              <w:t>Wide opening range, small close</w:t>
             </w:r>
           </w:p>
         </w:tc>
         <w:tc>
           <w:tcPr>
             <w:tcW w:type="dxa" w:w="3312"/>
-            <w:shd w:fill="F4F6F9"/>
+            <w:shd w:fill="F5F7FA"/>
             <w:tcMar>
-              <w:top w:w="70" w:type="dxa"/>
-              <w:bottom w:w="70" w:type="dxa"/>
-              <w:left w:w="100" w:type="dxa"/>
-              <w:right w:w="100" w:type="dxa"/>
+              <w:top w:w="60" w:type="dxa"/>
+              <w:bottom w:w="60" w:type="dxa"/>
+              <w:left w:w="80" w:type="dxa"/>
+              <w:right w:w="80" w:type="dxa"/>
             </w:tcMar>
           </w:tcPr>
           <w:p>
@@ -1090,19 +1088,19 @@
                 <w:rFonts w:ascii="Times New Roman" w:hAnsi="Times New Roman"/>
                 <w:sz w:val="17"/>
               </w:rPr>
-              <w:t>Balanced market with both buyers and sellers active.</w:t>
+              <w:t>Both buyers and sellers fought for control; ended in deadlock.</w:t>
             </w:r>
           </w:p>
         </w:tc>
         <w:tc>
           <w:tcPr>
             <w:tcW w:type="dxa" w:w="2016"/>
-            <w:shd w:fill="F4F6F9"/>
+            <w:shd w:fill="F5F7FA"/>
             <w:tcMar>
-              <w:top w:w="70" w:type="dxa"/>
-              <w:bottom w:w="70" w:type="dxa"/>
-              <w:left w:w="100" w:type="dxa"/>
-              <w:right w:w="100" w:type="dxa"/>
+              <w:top w:w="60" w:type="dxa"/>
+              <w:bottom w:w="60" w:type="dxa"/>
+              <w:left w:w="80" w:type="dxa"/>
+              <w:right w:w="80" w:type="dxa"/>
             </w:tcMar>
           </w:tcPr>
           <w:p>
@@ -1111,7 +1109,7 @@
                 <w:rFonts w:ascii="Times New Roman" w:hAnsi="Times New Roman"/>
                 <w:sz w:val="17"/>
               </w:rPr>
-              <w:t>Two-Sided Equilibrium</w:t>
+              <w:t>Two-sided balance</w:t>
             </w:r>
           </w:p>
         </w:tc>
@@ -1119,7 +1117,7 @@
     </w:tbl>
     <w:p>
       <w:pPr>
-        <w:spacing w:after="120"/>
+        <w:spacing w:after="80"/>
       </w:pPr>
     </w:p>
     <w:p>
@@ -1130,7 +1128,7 @@
       <w:r>
         <w:drawing>
           <wp:inline xmlns:a="http://schemas.openxmlformats.org/drawingml/2006/main" xmlns:pic="http://schemas.openxmlformats.org/drawingml/2006/picture">
-            <wp:extent cx="5669280" cy="2551176"/>
+            <wp:extent cx="5486400" cy="2468880"/>
             <wp:docPr id="1" name="Picture 1"/>
             <wp:cNvGraphicFramePr>
               <a:graphicFrameLocks noChangeAspect="1"/>
@@ -1151,7 +1149,7 @@
                   <pic:spPr>
                     <a:xfrm>
                       <a:off x="0" y="0"/>
-                      <a:ext cx="5669280" cy="2551176"/>
+                      <a:ext cx="5486400" cy="2468880"/>
                     </a:xfrm>
                     <a:prstGeom prst="rect"/>
                   </pic:spPr>
@@ -1171,10 +1169,9 @@
         <w:rPr>
           <w:rFonts w:ascii="Times New Roman" w:hAnsi="Times New Roman"/>
           <w:i/>
-          <w:color w:val="3C3C3C"/>
           <w:sz w:val="18"/>
         </w:rPr>
-        <w:t>Fig. 1. Continuous auction price trajectory (left) and corresponding spatial Volume Profile H(p) (right) displaying the Volume Point of Control (VPOC) and symmetrical 68.2% empirical Value Area boundaries (VAH and VAL).</w:t>
+        <w:t>Fig. 1. How a continuous intraday price path (left) converts into a discrete horizontal Volume Profile H(p) (right), highlighting the VPOC and the central 68.2% Value Area boundaries (VAH and VAL).</w:t>
       </w:r>
     </w:p>
     <w:p>
@@ -1186,10 +1183,10 @@
         <w:rPr>
           <w:rFonts w:ascii="Times New Roman" w:hAnsi="Times New Roman"/>
           <w:b/>
-          <w:color w:val="003366"/>
-          <w:sz w:val="26"/>
+          <w:color w:val="000000"/>
+          <w:sz w:val="24"/>
         </w:rPr>
-        <w:t>III. SYSTEMATIC LITERATURE REVIEW</w:t>
+        <w:t>III. WHAT PREVIOUS STUDIES SHOW</w:t>
       </w:r>
     </w:p>
     <w:p>
@@ -1203,7 +1200,7 @@
           <w:i w:val="0"/>
           <w:sz w:val="20"/>
         </w:rPr>
-        <w:t>The quantitative finance and computer science literature at the intersection of market microstructure, deep learning, and explainable AI can be categorized into four primary eras:</w:t>
+        <w:t>To see where AlphaPulse fits, we examined four decades of market microstructure and financial machine learning research:</w:t>
       </w:r>
     </w:p>
     <w:p>
@@ -1217,7 +1214,7 @@
           <w:i w:val="0"/>
           <w:sz w:val="20"/>
         </w:rPr>
-        <w:t>A. Classical Econometrics and Continuous Auction Formulations: Fama [6] established the foundation of modern quantitative finance with the Efficient Market Hypothesis (EMH). Kyle [7] provided the mathematical framework for continuous auctions by modeling the interaction between informed traders, uninformed noise traders, and competitive market makers. Kyle's model established that order flow imbalances directly impact price dynamics, formalizing the concept of market depth and liquidity friction.</w:t>
+        <w:t>Early Econometrics &amp; Auction Modeling: Fama's Efficient Market Hypothesis [6] provided the standard baseline, assuming price changes follow a random walk. However, Kyle [7] showed that order flow from informed traders directly pushes prices, proving that liquidity friction and order book imbalance cannot be ignored.</w:t>
       </w:r>
     </w:p>
     <w:p>
@@ -1231,7 +1228,7 @@
           <w:i w:val="0"/>
           <w:sz w:val="20"/>
         </w:rPr>
-        <w:t>B. Statistical Mechanics of Complex Financial Systems: Bouchaud et al. [8] and Cont [9] demonstrated that financial time series exhibit universal non-Gaussian properties, including power-law return distributions, heavy tails, and long-memory volatility clustering. These findings invalidated simple Brownian motion assumptions, demonstrating that order flow distributions exhibit localized clustering around major liquidity pools.</w:t>
+        <w:t>Non-Gaussian Market Realities: Works by Mandelbrot [18], Bouchaud et al. [8], and Cont [9] proved empirically that financial asset returns exhibit fat tails, volatility clustering, and long memory. These statistical properties invalidate simple Gaussian assumptions and explain why price tends to cluster around major institutional liquidity nodes.</w:t>
       </w:r>
     </w:p>
     <w:p>
@@ -1245,7 +1242,7 @@
           <w:i w:val="0"/>
           <w:sz w:val="20"/>
         </w:rPr>
-        <w:t>C. Modern Financial Machine Learning and the Interpretability Gap: López de Prado [10] demonstrated the prevalence of false discoveries in financial machine learning, caused by backtest overfitting. Fischer and Krauss [11] showed that deep LSTM networks could capture non-linear patterns, but noted that their black-box nature made them vulnerable during regime shifts. Gu, Kelly, and Xiu [12] compared multiple ML frameworks, finding superior capacity in neural nets but highlighting the total absence of structural economic interpretability.</w:t>
+        <w:t>The Limits of Machine Learning in Trading: Modern research by López de Prado [10] showed that a huge portion of backtested machine learning strategies fail out-of-sample due to multiple testing and cross-validation leakage. Fischer and Krauss [11] demonstrated that while LSTMs capture temporal sequences, their uninterpretable weights leave risk managers in the dark during market crises.</w:t>
       </w:r>
     </w:p>
     <w:p>
@@ -1259,7 +1256,7 @@
           <w:i w:val="0"/>
           <w:sz w:val="20"/>
         </w:rPr>
-        <w:t>D. Explainable Artificial Intelligence (XAI) in Capital Markets: Arrieta et al. [13] established formal taxonomies for explainability. Lundberg and Lee [14] unified feature attribution through Shapley Additive exPlanations (SHAP), providing game-theoretically grounded explanations. Ribeiro et al. [15] formulated LIME for local surrogate interpretability. However, applying general XAI frameworks to raw, noisy financial time series remains challenging without domain-specific structural constraints.</w:t>
+        <w:t>The Push for Explainable AI (XAI): While general interpretability tools like LIME [15] and SHAP [14] have gained ground in machine learning, applying them to raw, noisy financial ticks without domain-specific constraints often yields unstable results [13]. Table II compares these different approaches against our proposed engine.</w:t>
       </w:r>
     </w:p>
     <w:p>
@@ -1271,10 +1268,9 @@
         <w:rPr>
           <w:rFonts w:ascii="Times New Roman" w:hAnsi="Times New Roman"/>
           <w:b/>
-          <w:color w:val="003366"/>
           <w:sz w:val="19"/>
         </w:rPr>
-        <w:t>TABLE II: COMPARATIVE METHODOLOGY MATRIX</w:t>
+        <w:t>TABLE II: COMPARING DIFFERENT MARKET ANALYSIS METHODS</w:t>
       </w:r>
     </w:p>
     <w:tbl>
@@ -1294,12 +1290,12 @@
         <w:tc>
           <w:tcPr>
             <w:tcW w:type="dxa" w:w="2016"/>
-            <w:shd w:fill="003366"/>
+            <w:shd w:fill="2C3E50"/>
             <w:tcMar>
-              <w:top w:w="100" w:type="dxa"/>
-              <w:bottom w:w="100" w:type="dxa"/>
-              <w:left w:w="120" w:type="dxa"/>
-              <w:right w:w="120" w:type="dxa"/>
+              <w:top w:w="80" w:type="dxa"/>
+              <w:bottom w:w="80" w:type="dxa"/>
+              <w:left w:w="100" w:type="dxa"/>
+              <w:right w:w="100" w:type="dxa"/>
             </w:tcMar>
           </w:tcPr>
           <w:p>
@@ -1313,19 +1309,19 @@
                 <w:color w:val="FFFFFF"/>
                 <w:sz w:val="18"/>
               </w:rPr>
-              <w:t>Framework Class</w:t>
+              <w:t>Methodology</w:t>
             </w:r>
           </w:p>
         </w:tc>
         <w:tc>
           <w:tcPr>
             <w:tcW w:type="dxa" w:w="2592"/>
-            <w:shd w:fill="003366"/>
+            <w:shd w:fill="2C3E50"/>
             <w:tcMar>
-              <w:top w:w="100" w:type="dxa"/>
-              <w:bottom w:w="100" w:type="dxa"/>
-              <w:left w:w="120" w:type="dxa"/>
-              <w:right w:w="120" w:type="dxa"/>
+              <w:top w:w="80" w:type="dxa"/>
+              <w:bottom w:w="80" w:type="dxa"/>
+              <w:left w:w="100" w:type="dxa"/>
+              <w:right w:w="100" w:type="dxa"/>
             </w:tcMar>
           </w:tcPr>
           <w:p>
@@ -1339,19 +1335,19 @@
                 <w:color w:val="FFFFFF"/>
                 <w:sz w:val="18"/>
               </w:rPr>
-              <w:t>Core Mechanics</w:t>
+              <w:t>How It Works</w:t>
             </w:r>
           </w:p>
         </w:tc>
         <w:tc>
           <w:tcPr>
             <w:tcW w:type="dxa" w:w="2592"/>
-            <w:shd w:fill="003366"/>
+            <w:shd w:fill="2C3E50"/>
             <w:tcMar>
-              <w:top w:w="100" w:type="dxa"/>
-              <w:bottom w:w="100" w:type="dxa"/>
-              <w:left w:w="120" w:type="dxa"/>
-              <w:right w:w="120" w:type="dxa"/>
+              <w:top w:w="80" w:type="dxa"/>
+              <w:bottom w:w="80" w:type="dxa"/>
+              <w:left w:w="100" w:type="dxa"/>
+              <w:right w:w="100" w:type="dxa"/>
             </w:tcMar>
           </w:tcPr>
           <w:p>
@@ -1365,19 +1361,19 @@
                 <w:color w:val="FFFFFF"/>
                 <w:sz w:val="18"/>
               </w:rPr>
-              <w:t>Primary Strengths</w:t>
+              <w:t>Practical Advantages</w:t>
             </w:r>
           </w:p>
         </w:tc>
         <w:tc>
           <w:tcPr>
             <w:tcW w:type="dxa" w:w="2592"/>
-            <w:shd w:fill="003366"/>
+            <w:shd w:fill="2C3E50"/>
             <w:tcMar>
-              <w:top w:w="100" w:type="dxa"/>
-              <w:bottom w:w="100" w:type="dxa"/>
-              <w:left w:w="120" w:type="dxa"/>
-              <w:right w:w="120" w:type="dxa"/>
+              <w:top w:w="80" w:type="dxa"/>
+              <w:bottom w:w="80" w:type="dxa"/>
+              <w:left w:w="100" w:type="dxa"/>
+              <w:right w:w="100" w:type="dxa"/>
             </w:tcMar>
           </w:tcPr>
           <w:p>
@@ -1391,7 +1387,7 @@
                 <w:color w:val="FFFFFF"/>
                 <w:sz w:val="18"/>
               </w:rPr>
-              <w:t>Critical Flaws</w:t>
+              <w:t>Main Weaknesses</w:t>
             </w:r>
           </w:p>
         </w:tc>
@@ -1402,10 +1398,10 @@
             <w:tcW w:type="dxa" w:w="2016"/>
             <w:shd w:fill="FFFFFF"/>
             <w:tcMar>
-              <w:top w:w="70" w:type="dxa"/>
-              <w:bottom w:w="70" w:type="dxa"/>
-              <w:left w:w="100" w:type="dxa"/>
-              <w:right w:w="100" w:type="dxa"/>
+              <w:top w:w="60" w:type="dxa"/>
+              <w:bottom w:w="60" w:type="dxa"/>
+              <w:left w:w="80" w:type="dxa"/>
+              <w:right w:w="80" w:type="dxa"/>
             </w:tcMar>
           </w:tcPr>
           <w:p>
@@ -1414,7 +1410,7 @@
                 <w:rFonts w:ascii="Times New Roman" w:hAnsi="Times New Roman"/>
                 <w:sz w:val="17"/>
               </w:rPr>
-              <w:t>Technical Indicators</w:t>
+              <w:t>Standard Indicators</w:t>
             </w:r>
           </w:p>
         </w:tc>
@@ -1423,10 +1419,10 @@
             <w:tcW w:type="dxa" w:w="2592"/>
             <w:shd w:fill="FFFFFF"/>
             <w:tcMar>
-              <w:top w:w="70" w:type="dxa"/>
-              <w:bottom w:w="70" w:type="dxa"/>
-              <w:left w:w="100" w:type="dxa"/>
-              <w:right w:w="100" w:type="dxa"/>
+              <w:top w:w="60" w:type="dxa"/>
+              <w:bottom w:w="60" w:type="dxa"/>
+              <w:left w:w="80" w:type="dxa"/>
+              <w:right w:w="80" w:type="dxa"/>
             </w:tcMar>
           </w:tcPr>
           <w:p>
@@ -1435,7 +1431,7 @@
                 <w:rFonts w:ascii="Times New Roman" w:hAnsi="Times New Roman"/>
                 <w:sz w:val="17"/>
               </w:rPr>
-              <w:t>Price-derived formulas (RSI, Moving Averages)</w:t>
+              <w:t>Simple price formulas (RSI, Moving Averages)</w:t>
             </w:r>
           </w:p>
         </w:tc>
@@ -1444,10 +1440,10 @@
             <w:tcW w:type="dxa" w:w="2592"/>
             <w:shd w:fill="FFFFFF"/>
             <w:tcMar>
-              <w:top w:w="70" w:type="dxa"/>
-              <w:bottom w:w="70" w:type="dxa"/>
-              <w:left w:w="100" w:type="dxa"/>
-              <w:right w:w="100" w:type="dxa"/>
+              <w:top w:w="60" w:type="dxa"/>
+              <w:bottom w:w="60" w:type="dxa"/>
+              <w:left w:w="80" w:type="dxa"/>
+              <w:right w:w="80" w:type="dxa"/>
             </w:tcMar>
           </w:tcPr>
           <w:p>
@@ -1456,7 +1452,7 @@
                 <w:rFonts w:ascii="Times New Roman" w:hAnsi="Times New Roman"/>
                 <w:sz w:val="17"/>
               </w:rPr>
-              <w:t>Low computational complexity; easy to implement.</w:t>
+              <w:t>Very fast to run; familiar to all traders.</w:t>
             </w:r>
           </w:p>
         </w:tc>
@@ -1465,10 +1461,10 @@
             <w:tcW w:type="dxa" w:w="2592"/>
             <w:shd w:fill="FFFFFF"/>
             <w:tcMar>
-              <w:top w:w="70" w:type="dxa"/>
-              <w:bottom w:w="70" w:type="dxa"/>
-              <w:left w:w="100" w:type="dxa"/>
-              <w:right w:w="100" w:type="dxa"/>
+              <w:top w:w="60" w:type="dxa"/>
+              <w:bottom w:w="60" w:type="dxa"/>
+              <w:left w:w="80" w:type="dxa"/>
+              <w:right w:w="80" w:type="dxa"/>
             </w:tcMar>
           </w:tcPr>
           <w:p>
@@ -1477,7 +1473,7 @@
                 <w:rFonts w:ascii="Times New Roman" w:hAnsi="Times New Roman"/>
                 <w:sz w:val="17"/>
               </w:rPr>
-              <w:t>Severe lag; lacks volume-at-price dimensionality.</w:t>
+              <w:t>Lagging; ignores how volume is spread across price.</w:t>
             </w:r>
           </w:p>
         </w:tc>
@@ -1486,12 +1482,12 @@
         <w:tc>
           <w:tcPr>
             <w:tcW w:type="dxa" w:w="2016"/>
-            <w:shd w:fill="F4F6F9"/>
+            <w:shd w:fill="F5F7FA"/>
             <w:tcMar>
-              <w:top w:w="70" w:type="dxa"/>
-              <w:bottom w:w="70" w:type="dxa"/>
-              <w:left w:w="100" w:type="dxa"/>
-              <w:right w:w="100" w:type="dxa"/>
+              <w:top w:w="60" w:type="dxa"/>
+              <w:bottom w:w="60" w:type="dxa"/>
+              <w:left w:w="80" w:type="dxa"/>
+              <w:right w:w="80" w:type="dxa"/>
             </w:tcMar>
           </w:tcPr>
           <w:p>
@@ -1500,19 +1496,19 @@
                 <w:rFonts w:ascii="Times New Roman" w:hAnsi="Times New Roman"/>
                 <w:sz w:val="17"/>
               </w:rPr>
-              <w:t>Deep Supervised Learning</w:t>
+              <w:t>Deep Neural Nets</w:t>
             </w:r>
           </w:p>
         </w:tc>
         <w:tc>
           <w:tcPr>
             <w:tcW w:type="dxa" w:w="2592"/>
-            <w:shd w:fill="F4F6F9"/>
+            <w:shd w:fill="F5F7FA"/>
             <w:tcMar>
-              <w:top w:w="70" w:type="dxa"/>
-              <w:bottom w:w="70" w:type="dxa"/>
-              <w:left w:w="100" w:type="dxa"/>
-              <w:right w:w="100" w:type="dxa"/>
+              <w:top w:w="60" w:type="dxa"/>
+              <w:bottom w:w="60" w:type="dxa"/>
+              <w:left w:w="80" w:type="dxa"/>
+              <w:right w:w="80" w:type="dxa"/>
             </w:tcMar>
           </w:tcPr>
           <w:p>
@@ -1521,19 +1517,19 @@
                 <w:rFonts w:ascii="Times New Roman" w:hAnsi="Times New Roman"/>
                 <w:sz w:val="17"/>
               </w:rPr>
-              <w:t>Multi-layer neural nets predicting directions</w:t>
+              <w:t>Multi-layer networks predicting price direction</w:t>
             </w:r>
           </w:p>
         </w:tc>
         <w:tc>
           <w:tcPr>
             <w:tcW w:type="dxa" w:w="2592"/>
-            <w:shd w:fill="F4F6F9"/>
+            <w:shd w:fill="F5F7FA"/>
             <w:tcMar>
-              <w:top w:w="70" w:type="dxa"/>
-              <w:bottom w:w="70" w:type="dxa"/>
-              <w:left w:w="100" w:type="dxa"/>
-              <w:right w:w="100" w:type="dxa"/>
+              <w:top w:w="60" w:type="dxa"/>
+              <w:bottom w:w="60" w:type="dxa"/>
+              <w:left w:w="80" w:type="dxa"/>
+              <w:right w:w="80" w:type="dxa"/>
             </w:tcMar>
           </w:tcPr>
           <w:p>
@@ -1542,19 +1538,19 @@
                 <w:rFonts w:ascii="Times New Roman" w:hAnsi="Times New Roman"/>
                 <w:sz w:val="17"/>
               </w:rPr>
-              <w:t>Captures non-linear patterns and complex features.</w:t>
+              <w:t>Finds non-linear patterns across large datasets.</w:t>
             </w:r>
           </w:p>
         </w:tc>
         <w:tc>
           <w:tcPr>
             <w:tcW w:type="dxa" w:w="2592"/>
-            <w:shd w:fill="F4F6F9"/>
+            <w:shd w:fill="F5F7FA"/>
             <w:tcMar>
-              <w:top w:w="70" w:type="dxa"/>
-              <w:bottom w:w="70" w:type="dxa"/>
-              <w:left w:w="100" w:type="dxa"/>
-              <w:right w:w="100" w:type="dxa"/>
+              <w:top w:w="60" w:type="dxa"/>
+              <w:bottom w:w="60" w:type="dxa"/>
+              <w:left w:w="80" w:type="dxa"/>
+              <w:right w:w="80" w:type="dxa"/>
             </w:tcMar>
           </w:tcPr>
           <w:p>
@@ -1563,7 +1559,7 @@
                 <w:rFonts w:ascii="Times New Roman" w:hAnsi="Times New Roman"/>
                 <w:sz w:val="17"/>
               </w:rPr>
-              <w:t>Complete opacity; prone to severe regime overfitting.</w:t>
+              <w:t>Opaque black box; prone to overfitting market noise.</w:t>
             </w:r>
           </w:p>
         </w:tc>
@@ -1574,10 +1570,10 @@
             <w:tcW w:type="dxa" w:w="2016"/>
             <w:shd w:fill="FFFFFF"/>
             <w:tcMar>
-              <w:top w:w="70" w:type="dxa"/>
-              <w:bottom w:w="70" w:type="dxa"/>
-              <w:left w:w="100" w:type="dxa"/>
-              <w:right w:w="100" w:type="dxa"/>
+              <w:top w:w="60" w:type="dxa"/>
+              <w:bottom w:w="60" w:type="dxa"/>
+              <w:left w:w="80" w:type="dxa"/>
+              <w:right w:w="80" w:type="dxa"/>
             </w:tcMar>
           </w:tcPr>
           <w:p>
@@ -1586,7 +1582,7 @@
                 <w:rFonts w:ascii="Times New Roman" w:hAnsi="Times New Roman"/>
                 <w:sz w:val="17"/>
               </w:rPr>
-              <w:t>High-Frequency Order Flow</w:t>
+              <w:t>High-Frequency Tick ML</w:t>
             </w:r>
           </w:p>
         </w:tc>
@@ -1595,10 +1591,10 @@
             <w:tcW w:type="dxa" w:w="2592"/>
             <w:shd w:fill="FFFFFF"/>
             <w:tcMar>
-              <w:top w:w="70" w:type="dxa"/>
-              <w:bottom w:w="70" w:type="dxa"/>
-              <w:left w:w="100" w:type="dxa"/>
-              <w:right w:w="100" w:type="dxa"/>
+              <w:top w:w="60" w:type="dxa"/>
+              <w:bottom w:w="60" w:type="dxa"/>
+              <w:left w:w="80" w:type="dxa"/>
+              <w:right w:w="80" w:type="dxa"/>
             </w:tcMar>
           </w:tcPr>
           <w:p>
@@ -1607,7 +1603,7 @@
                 <w:rFonts w:ascii="Times New Roman" w:hAnsi="Times New Roman"/>
                 <w:sz w:val="17"/>
               </w:rPr>
-              <w:t>L3 queue dynamics and microsecond tick imbalance</w:t>
+              <w:t>Microsecond order book queue analysis</w:t>
             </w:r>
           </w:p>
         </w:tc>
@@ -1616,10 +1612,10 @@
             <w:tcW w:type="dxa" w:w="2592"/>
             <w:shd w:fill="FFFFFF"/>
             <w:tcMar>
-              <w:top w:w="70" w:type="dxa"/>
-              <w:bottom w:w="70" w:type="dxa"/>
-              <w:left w:w="100" w:type="dxa"/>
-              <w:right w:w="100" w:type="dxa"/>
+              <w:top w:w="60" w:type="dxa"/>
+              <w:bottom w:w="60" w:type="dxa"/>
+              <w:left w:w="80" w:type="dxa"/>
+              <w:right w:w="80" w:type="dxa"/>
             </w:tcMar>
           </w:tcPr>
           <w:p>
@@ -1628,7 +1624,7 @@
                 <w:rFonts w:ascii="Times New Roman" w:hAnsi="Times New Roman"/>
                 <w:sz w:val="17"/>
               </w:rPr>
-              <w:t>Ultra-low latency; direct order book visibility.</w:t>
+              <w:t>Captures immediate resting liquidity imbalances.</w:t>
             </w:r>
           </w:p>
         </w:tc>
@@ -1637,10 +1633,10 @@
             <w:tcW w:type="dxa" w:w="2592"/>
             <w:shd w:fill="FFFFFF"/>
             <w:tcMar>
-              <w:top w:w="70" w:type="dxa"/>
-              <w:bottom w:w="70" w:type="dxa"/>
-              <w:left w:w="100" w:type="dxa"/>
-              <w:right w:w="100" w:type="dxa"/>
+              <w:top w:w="60" w:type="dxa"/>
+              <w:bottom w:w="60" w:type="dxa"/>
+              <w:left w:w="80" w:type="dxa"/>
+              <w:right w:w="80" w:type="dxa"/>
             </w:tcMar>
           </w:tcPr>
           <w:p>
@@ -1649,7 +1645,7 @@
                 <w:rFonts w:ascii="Times New Roman" w:hAnsi="Times New Roman"/>
                 <w:sz w:val="17"/>
               </w:rPr>
-              <w:t>Extreme compute &amp; data costs; short temporal window.</w:t>
+              <w:t>Extremely expensive compute; requires specialized tick feeds.</w:t>
             </w:r>
           </w:p>
         </w:tc>
@@ -1658,12 +1654,12 @@
         <w:tc>
           <w:tcPr>
             <w:tcW w:type="dxa" w:w="2016"/>
-            <w:shd w:fill="F4F6F9"/>
+            <w:shd w:fill="F5F7FA"/>
             <w:tcMar>
-              <w:top w:w="70" w:type="dxa"/>
-              <w:bottom w:w="70" w:type="dxa"/>
-              <w:left w:w="100" w:type="dxa"/>
-              <w:right w:w="100" w:type="dxa"/>
+              <w:top w:w="60" w:type="dxa"/>
+              <w:bottom w:w="60" w:type="dxa"/>
+              <w:left w:w="80" w:type="dxa"/>
+              <w:right w:w="80" w:type="dxa"/>
             </w:tcMar>
           </w:tcPr>
           <w:p>
@@ -1672,19 +1668,19 @@
                 <w:rFonts w:ascii="Times New Roman" w:hAnsi="Times New Roman"/>
                 <w:sz w:val="17"/>
               </w:rPr>
-              <w:t>AlphaPulse Framework</w:t>
+              <w:t>AlphaPulse (Our Approach)</w:t>
             </w:r>
           </w:p>
         </w:tc>
         <w:tc>
           <w:tcPr>
             <w:tcW w:type="dxa" w:w="2592"/>
-            <w:shd w:fill="F4F6F9"/>
+            <w:shd w:fill="F5F7FA"/>
             <w:tcMar>
-              <w:top w:w="70" w:type="dxa"/>
-              <w:bottom w:w="70" w:type="dxa"/>
-              <w:left w:w="100" w:type="dxa"/>
-              <w:right w:w="100" w:type="dxa"/>
+              <w:top w:w="60" w:type="dxa"/>
+              <w:bottom w:w="60" w:type="dxa"/>
+              <w:left w:w="80" w:type="dxa"/>
+              <w:right w:w="80" w:type="dxa"/>
             </w:tcMar>
           </w:tcPr>
           <w:p>
@@ -1693,19 +1689,19 @@
                 <w:rFonts w:ascii="Times New Roman" w:hAnsi="Times New Roman"/>
                 <w:sz w:val="17"/>
               </w:rPr>
-              <w:t>Auction Market Theory with XAI semantics &amp; GMM</w:t>
+              <w:t>Auction Market Theory + GMM clustering + XAI</w:t>
             </w:r>
           </w:p>
         </w:tc>
         <w:tc>
           <w:tcPr>
             <w:tcW w:type="dxa" w:w="2592"/>
-            <w:shd w:fill="F4F6F9"/>
+            <w:shd w:fill="F5F7FA"/>
             <w:tcMar>
-              <w:top w:w="70" w:type="dxa"/>
-              <w:bottom w:w="70" w:type="dxa"/>
-              <w:left w:w="100" w:type="dxa"/>
-              <w:right w:w="100" w:type="dxa"/>
+              <w:top w:w="60" w:type="dxa"/>
+              <w:bottom w:w="60" w:type="dxa"/>
+              <w:left w:w="80" w:type="dxa"/>
+              <w:right w:w="80" w:type="dxa"/>
             </w:tcMar>
           </w:tcPr>
           <w:p>
@@ -1714,19 +1710,19 @@
                 <w:rFonts w:ascii="Times New Roman" w:hAnsi="Times New Roman"/>
                 <w:sz w:val="17"/>
               </w:rPr>
-              <w:t>Mathematically grounded; fully explainable; no black boxes.</w:t>
+              <w:t>Transparent math; explainable plain English outputs.</w:t>
             </w:r>
           </w:p>
         </w:tc>
         <w:tc>
           <w:tcPr>
             <w:tcW w:type="dxa" w:w="2592"/>
-            <w:shd w:fill="F4F6F9"/>
+            <w:shd w:fill="F5F7FA"/>
             <w:tcMar>
-              <w:top w:w="70" w:type="dxa"/>
-              <w:bottom w:w="70" w:type="dxa"/>
-              <w:left w:w="100" w:type="dxa"/>
-              <w:right w:w="100" w:type="dxa"/>
+              <w:top w:w="60" w:type="dxa"/>
+              <w:bottom w:w="60" w:type="dxa"/>
+              <w:left w:w="80" w:type="dxa"/>
+              <w:right w:w="80" w:type="dxa"/>
             </w:tcMar>
           </w:tcPr>
           <w:p>
@@ -1735,7 +1731,7 @@
                 <w:rFonts w:ascii="Times New Roman" w:hAnsi="Times New Roman"/>
                 <w:sz w:val="17"/>
               </w:rPr>
-              <w:t>Requires continuous tick/volume feeds; non-predictive.</w:t>
+              <w:t>Requires continuous intraday feeds; strictly non-predictive.</w:t>
             </w:r>
           </w:p>
         </w:tc>
@@ -1743,7 +1739,7 @@
     </w:tbl>
     <w:p>
       <w:pPr>
-        <w:spacing w:after="120"/>
+        <w:spacing w:after="80"/>
       </w:pPr>
     </w:p>
     <w:p>
@@ -1755,10 +1751,10 @@
         <w:rPr>
           <w:rFonts w:ascii="Times New Roman" w:hAnsi="Times New Roman"/>
           <w:b/>
-          <w:color w:val="003366"/>
-          <w:sz w:val="26"/>
+          <w:color w:val="000000"/>
+          <w:sz w:val="24"/>
         </w:rPr>
-        <w:t>IV. ALPHAPULSE SYSTEM DESIGN &amp; FORMALIZATION</w:t>
+        <w:t>IV. HOW ALPHAPULSE WORKS</w:t>
       </w:r>
     </w:p>
     <w:p>
@@ -1772,7 +1768,7 @@
           <w:i w:val="0"/>
           <w:sz w:val="20"/>
         </w:rPr>
-        <w:t>The AlphaPulse architecture implements a deterministic data processing pipeline structured across four discrete operational tiers:</w:t>
+        <w:t>The AlphaPulse pipeline is structured as a modular four-tier engine that runs from raw tick ingestion down to plain-English semantic explanations:</w:t>
       </w:r>
     </w:p>
     <w:p>
@@ -1786,7 +1782,7 @@
           <w:i w:val="0"/>
           <w:sz w:val="20"/>
         </w:rPr>
-        <w:t>1) Microstructure Ingestion and Vectorization: Continuous intraday tick feeds are collected and mapped onto discrete spatial grids matching the asset's minimum tick size, constructing the spatial matrix M(p, t).</w:t>
+        <w:t>1) Data Ingestion and Spatial Binning: Continuous trade records (Timestamp, Price, Volume) are ingested and mapped onto a discrete price grid matching the exchange's minimum tick size, creating an intraday matrix M(p, t).</w:t>
       </w:r>
     </w:p>
     <w:p>
@@ -1800,7 +1796,7 @@
           <w:i w:val="0"/>
           <w:sz w:val="20"/>
         </w:rPr>
-        <w:t>2) Dynamic Value Area Integration: The system locates the VPOC and executes an empirical two-sided integral sweep to establish VAH and VAL boundaries enclosing 68.2% of transacted volume mass.</w:t>
+        <w:t>2) Value Area &amp; VPOC Solver: The system identifies the price level with the highest total volume (VPOC) and then sweeps outward symmetrically until 68.2% of the cumulative session volume is captured between Value Area High (VAH) and Value Area Low (VAL).</w:t>
       </w:r>
     </w:p>
     <w:p>
@@ -1814,7 +1810,7 @@
           <w:i w:val="0"/>
           <w:sz w:val="20"/>
         </w:rPr>
-        <w:t>3) Novel Microstructure Solvers: AlphaPulse introduces two novel quantitative metrics to replace subjective visual profile evaluations:</w:t>
+        <w:t>3) Mathematical Microstructure Metrics: To avoid relying on subjective visual interpretations of profile charts, we formulate two objective metrics:</w:t>
       </w:r>
     </w:p>
     <w:p>
@@ -1828,7 +1824,7 @@
           <w:i w:val="0"/>
           <w:sz w:val="20"/>
         </w:rPr>
-        <w:t>• Dual-Distribution Asymmetry Index (DDAI): Quantifies the normalized volume skew relative to the Volume Point of Control:</w:t>
+        <w:t>• Dual-Distribution Asymmetry Index (DDAI): Measures whether volume is skewed above or below the VPOC:</w:t>
       </w:r>
     </w:p>
     <w:tbl>
@@ -1846,12 +1842,12 @@
         <w:tc>
           <w:tcPr>
             <w:tcW w:type="dxa" w:w="8352"/>
-            <w:shd w:fill="F8F9FA"/>
+            <w:shd w:fill="FAFAFA"/>
             <w:tcMar>
-              <w:top w:w="60" w:type="dxa"/>
-              <w:bottom w:w="60" w:type="dxa"/>
-              <w:left w:w="100" w:type="dxa"/>
-              <w:right w:w="100" w:type="dxa"/>
+              <w:top w:w="50" w:type="dxa"/>
+              <w:bottom w:w="50" w:type="dxa"/>
+              <w:left w:w="80" w:type="dxa"/>
+              <w:right w:w="80" w:type="dxa"/>
             </w:tcMar>
           </w:tcPr>
           <w:p>
@@ -1864,19 +1860,19 @@
                 <w:i/>
                 <w:sz w:val="19"/>
               </w:rPr>
-              <w:t>DDAI = (V_above - V_below) / V_total</w:t>
+              <w:t>DDAI = (V_above - V_below) / Total_Volume</w:t>
             </w:r>
           </w:p>
         </w:tc>
         <w:tc>
           <w:tcPr>
             <w:tcW w:type="dxa" w:w="1008"/>
-            <w:shd w:fill="F8F9FA"/>
+            <w:shd w:fill="FAFAFA"/>
             <w:tcMar>
-              <w:top w:w="60" w:type="dxa"/>
-              <w:bottom w:w="60" w:type="dxa"/>
-              <w:left w:w="100" w:type="dxa"/>
-              <w:right w:w="100" w:type="dxa"/>
+              <w:top w:w="50" w:type="dxa"/>
+              <w:bottom w:w="50" w:type="dxa"/>
+              <w:left w:w="80" w:type="dxa"/>
+              <w:right w:w="80" w:type="dxa"/>
             </w:tcMar>
           </w:tcPr>
           <w:p>
@@ -1897,7 +1893,7 @@
     </w:tbl>
     <w:p>
       <w:pPr>
-        <w:spacing w:after="80"/>
+        <w:spacing w:after="60"/>
       </w:pPr>
     </w:p>
     <w:p>
@@ -1911,7 +1907,7 @@
           <w:i w:val="0"/>
           <w:sz w:val="20"/>
         </w:rPr>
-        <w:t>where V_above and V_below denote cumulative volume transacted above and below the VPOC, respectively. DDAI &gt; +0.30 indicates aggressive buyer absorption (P-profile), while DDAI &lt; -0.30 reflects seller inventory absorption (b-profile).</w:t>
+        <w:t>When DDAI is above +0.30, buyers are actively transacting above value (P-profile). When DDAI drops below -0.30, sellers are dominating below value (b-profile).</w:t>
       </w:r>
     </w:p>
     <w:p>
@@ -1925,7 +1921,7 @@
           <w:i w:val="0"/>
           <w:sz w:val="20"/>
         </w:rPr>
-        <w:t>• Thermodynamic Price Acceptance Metric (TPAM): Evaluates whether price excursions outside the prior Value Area represent sustained trend discovery or failed auction probes:</w:t>
+        <w:t>• Thermodynamic Price Acceptance Metric (TPAM): Tracks whether a move outside the prior Value Area is supported by volume over time:</w:t>
       </w:r>
     </w:p>
     <w:tbl>
@@ -1943,12 +1939,12 @@
         <w:tc>
           <w:tcPr>
             <w:tcW w:type="dxa" w:w="8352"/>
-            <w:shd w:fill="F8F9FA"/>
+            <w:shd w:fill="FAFAFA"/>
             <w:tcMar>
-              <w:top w:w="60" w:type="dxa"/>
-              <w:bottom w:w="60" w:type="dxa"/>
-              <w:left w:w="100" w:type="dxa"/>
-              <w:right w:w="100" w:type="dxa"/>
+              <w:top w:w="50" w:type="dxa"/>
+              <w:bottom w:w="50" w:type="dxa"/>
+              <w:left w:w="80" w:type="dxa"/>
+              <w:right w:w="80" w:type="dxa"/>
             </w:tcMar>
           </w:tcPr>
           <w:p>
@@ -1961,19 +1957,19 @@
                 <w:i/>
                 <w:sz w:val="19"/>
               </w:rPr>
-              <w:t>TPAM = Integral_{t_break}^T [ I(P_t not in VA_{t-1}) * (V_t / V_total) ] dt</w:t>
+              <w:t>TPAM = Integral_{t_break}^T [ I(P_t not in VA_{t-1}) * (V_t / Total_Volume) ] dt</w:t>
             </w:r>
           </w:p>
         </w:tc>
         <w:tc>
           <w:tcPr>
             <w:tcW w:type="dxa" w:w="1008"/>
-            <w:shd w:fill="F8F9FA"/>
+            <w:shd w:fill="FAFAFA"/>
             <w:tcMar>
-              <w:top w:w="60" w:type="dxa"/>
-              <w:bottom w:w="60" w:type="dxa"/>
-              <w:left w:w="100" w:type="dxa"/>
-              <w:right w:w="100" w:type="dxa"/>
+              <w:top w:w="50" w:type="dxa"/>
+              <w:bottom w:w="50" w:type="dxa"/>
+              <w:left w:w="80" w:type="dxa"/>
+              <w:right w:w="80" w:type="dxa"/>
             </w:tcMar>
           </w:tcPr>
           <w:p>
@@ -1994,7 +1990,7 @@
     </w:tbl>
     <w:p>
       <w:pPr>
-        <w:spacing w:after="80"/>
+        <w:spacing w:after="60"/>
       </w:pPr>
     </w:p>
     <w:p>
@@ -2008,7 +2004,7 @@
           <w:i w:val="0"/>
           <w:sz w:val="20"/>
         </w:rPr>
-        <w:t>where I(.) is an indicator function. TPAM &gt;= 0.40 confirms structural price acceptance, whereas TPAM &lt; 0.15 denotes auction rejection.</w:t>
+        <w:t>If price breaks out on high sustained volume (TPAM &gt;= 0.40), the move represents true price acceptance. If price wanders outside on thin volume (TPAM &lt; 0.15), the move is rejected, signaling a failed auction and a likely rotation back to value.</w:t>
       </w:r>
     </w:p>
     <w:p>
@@ -2022,7 +2018,7 @@
           <w:i w:val="0"/>
           <w:sz w:val="20"/>
         </w:rPr>
-        <w:t>4) Explainable Natural Language Generation (XAI): A deterministic semantic parser maps calculated structural coordinates directly into clear educational diagnostics, entirely avoiding black-box neural opacity.</w:t>
+        <w:t>4) Explainable Natural Language Generator: Instead of outputting cryptic probabilities, a rule-grounded semantic parser generates straightforward diagnostic sentences like: 'Price is auctioning above prior Value Area High; responsive sellers are absorbing aggressive buyers at extreme levels.'</w:t>
       </w:r>
     </w:p>
     <w:p>
@@ -2033,7 +2029,7 @@
       <w:r>
         <w:drawing>
           <wp:inline xmlns:a="http://schemas.openxmlformats.org/drawingml/2006/main" xmlns:pic="http://schemas.openxmlformats.org/drawingml/2006/picture">
-            <wp:extent cx="5669280" cy="2948026"/>
+            <wp:extent cx="5486400" cy="2852928"/>
             <wp:docPr id="2" name="Picture 2"/>
             <wp:cNvGraphicFramePr>
               <a:graphicFrameLocks noChangeAspect="1"/>
@@ -2054,7 +2050,7 @@
                   <pic:spPr>
                     <a:xfrm>
                       <a:off x="0" y="0"/>
-                      <a:ext cx="5669280" cy="2948026"/>
+                      <a:ext cx="5486400" cy="2852928"/>
                     </a:xfrm>
                     <a:prstGeom prst="rect"/>
                   </pic:spPr>
@@ -2074,10 +2070,9 @@
         <w:rPr>
           <w:rFonts w:ascii="Times New Roman" w:hAnsi="Times New Roman"/>
           <w:i/>
-          <w:color w:val="3C3C3C"/>
           <w:sz w:val="18"/>
         </w:rPr>
-        <w:t>Fig. 2. End-to-end modular system architecture and data processing pipeline of the AlphaPulse framework, moving from raw tick streams to explainable natural language diagnostics.</w:t>
+        <w:t>Fig. 2. The four-tier AlphaPulse architecture, showing how raw trade data flows through the profile solver and statistical models into plain-English diagnostics.</w:t>
       </w:r>
     </w:p>
     <w:p>
@@ -2089,10 +2084,10 @@
         <w:rPr>
           <w:rFonts w:ascii="Times New Roman" w:hAnsi="Times New Roman"/>
           <w:b/>
-          <w:color w:val="003366"/>
-          <w:sz w:val="26"/>
+          <w:color w:val="000000"/>
+          <w:sz w:val="24"/>
         </w:rPr>
-        <w:t>V. EMPIRICAL RESULTS &amp; DISCUSSION</w:t>
+        <w:t>V. EXPERIMENTAL FINDINGS &amp; DISCUSSION</w:t>
       </w:r>
     </w:p>
     <w:p>
@@ -2106,22 +2101,22 @@
           <w:i w:val="0"/>
           <w:sz w:val="20"/>
         </w:rPr>
-        <w:t>The framework was empirically evaluated on a five-year dataset of high-frequency intraday records for the NIFTY 50 Index from the National Stock Exchange of India (NSE), comprising 465,000 one-minute observations across 1,240 trading sessions (January 2021 – December 2025).</w:t>
+        <w:t>To verify whether these profile concepts actually hold up in the real world, we evaluated five full years of 1-minute intraday data from the National Stock Exchange of India (NSE NIFTY 50 Index), spanning January 2021 through December 2025 (~465,000 observations across 1,240 trading sessions).</w:t>
       </w:r>
     </w:p>
     <w:p>
       <w:pPr>
         <w:pStyle w:val="Heading2"/>
-        <w:spacing w:before="160" w:after="60"/>
+        <w:spacing w:before="160" w:after="40"/>
       </w:pPr>
       <w:r>
         <w:rPr>
           <w:rFonts w:ascii="Times New Roman" w:hAnsi="Times New Roman"/>
           <w:b/>
-          <w:color w:val="1E508C"/>
-          <w:sz w:val="22"/>
+          <w:color w:val="1E1E1E"/>
+          <w:sz w:val="21"/>
         </w:rPr>
-        <w:t>A. Statistical Validation of Value Area Boundaries</w:t>
+        <w:t>A. Do Value Area Levels Act as Real Support and Resistance?</w:t>
       </w:r>
     </w:p>
     <w:p>
@@ -2135,7 +2130,7 @@
           <w:i w:val="0"/>
           <w:sz w:val="20"/>
         </w:rPr>
-        <w:t>To evaluate the hypothesis that Value Area boundaries act as statistically valid structural inflection levels, price action behavior was audited whenever price rotated into a 0.1% threshold of prior session VAH and VAL levels. Across 1,240 sessions, price exhibited mean-reverting rotational behavior in 71.4% of non-trending tests (Student's t = 4.82, p &lt; 0.001), soundly rejecting the null hypothesis of uniform price dispersion.</w:t>
+        <w:t>We tested what happens when price approaches within 0.1% of the prior session's VAH or VAL levels. Across 1,240 sessions, price rotated back into the Value Area in 71.4% of non-trending tests (Student's t = 4.82, p &lt; 0.001). This confirms that Value Area boundaries act as genuine institutional inflection zones rather than random lines on a chart.</w:t>
       </w:r>
     </w:p>
     <w:p>
@@ -2147,10 +2142,9 @@
         <w:rPr>
           <w:rFonts w:ascii="Times New Roman" w:hAnsi="Times New Roman"/>
           <w:b/>
-          <w:color w:val="003366"/>
           <w:sz w:val="19"/>
         </w:rPr>
-        <w:t>TABLE III: EMPIRICAL HYPOTHESIS TESTING AND STATISTICAL AUDIT</w:t>
+        <w:t>TABLE III: STATISTICAL TEST RESULTS ACROSS 5 YEARS OF NSE DATA</w:t>
       </w:r>
     </w:p>
     <w:tbl>
@@ -2170,13 +2164,13 @@
       <w:tr>
         <w:tc>
           <w:tcPr>
-            <w:tcW w:type="dxa" w:w="2304"/>
-            <w:shd w:fill="003366"/>
+            <w:tcW w:type="dxa" w:w="2160"/>
+            <w:shd w:fill="2C3E50"/>
             <w:tcMar>
-              <w:top w:w="100" w:type="dxa"/>
-              <w:bottom w:w="100" w:type="dxa"/>
-              <w:left w:w="120" w:type="dxa"/>
-              <w:right w:w="120" w:type="dxa"/>
+              <w:top w:w="80" w:type="dxa"/>
+              <w:bottom w:w="80" w:type="dxa"/>
+              <w:left w:w="100" w:type="dxa"/>
+              <w:right w:w="100" w:type="dxa"/>
             </w:tcMar>
           </w:tcPr>
           <w:p>
@@ -2190,19 +2184,19 @@
                 <w:color w:val="FFFFFF"/>
                 <w:sz w:val="18"/>
               </w:rPr>
-              <w:t>Evaluated Metric</w:t>
+              <w:t>Tested Phenomenon</w:t>
             </w:r>
           </w:p>
         </w:tc>
         <w:tc>
           <w:tcPr>
             <w:tcW w:type="dxa" w:w="2016"/>
-            <w:shd w:fill="003366"/>
+            <w:shd w:fill="2C3E50"/>
             <w:tcMar>
-              <w:top w:w="100" w:type="dxa"/>
-              <w:bottom w:w="100" w:type="dxa"/>
-              <w:left w:w="120" w:type="dxa"/>
-              <w:right w:w="120" w:type="dxa"/>
+              <w:top w:w="80" w:type="dxa"/>
+              <w:bottom w:w="80" w:type="dxa"/>
+              <w:left w:w="100" w:type="dxa"/>
+              <w:right w:w="100" w:type="dxa"/>
             </w:tcMar>
           </w:tcPr>
           <w:p>
@@ -2216,19 +2210,19 @@
                 <w:color w:val="FFFFFF"/>
                 <w:sz w:val="18"/>
               </w:rPr>
-              <w:t>Empirical Observation</w:t>
+              <w:t>What We Observed</w:t>
             </w:r>
           </w:p>
         </w:tc>
         <w:tc>
           <w:tcPr>
-            <w:tcW w:type="dxa" w:w="2160"/>
-            <w:shd w:fill="003366"/>
+            <w:tcW w:type="dxa" w:w="2016"/>
+            <w:shd w:fill="2C3E50"/>
             <w:tcMar>
-              <w:top w:w="100" w:type="dxa"/>
-              <w:bottom w:w="100" w:type="dxa"/>
-              <w:left w:w="120" w:type="dxa"/>
-              <w:right w:w="120" w:type="dxa"/>
+              <w:top w:w="80" w:type="dxa"/>
+              <w:bottom w:w="80" w:type="dxa"/>
+              <w:left w:w="100" w:type="dxa"/>
+              <w:right w:w="100" w:type="dxa"/>
             </w:tcMar>
           </w:tcPr>
           <w:p>
@@ -2242,19 +2236,19 @@
                 <w:color w:val="FFFFFF"/>
                 <w:sz w:val="18"/>
               </w:rPr>
-              <w:t>Statistical Test / Value</w:t>
+              <w:t>Statistical Metric</w:t>
             </w:r>
           </w:p>
         </w:tc>
         <w:tc>
           <w:tcPr>
-            <w:tcW w:type="dxa" w:w="1728"/>
-            <w:shd w:fill="003366"/>
+            <w:tcW w:type="dxa" w:w="1584"/>
+            <w:shd w:fill="2C3E50"/>
             <w:tcMar>
-              <w:top w:w="100" w:type="dxa"/>
-              <w:bottom w:w="100" w:type="dxa"/>
-              <w:left w:w="120" w:type="dxa"/>
-              <w:right w:w="120" w:type="dxa"/>
+              <w:top w:w="80" w:type="dxa"/>
+              <w:bottom w:w="80" w:type="dxa"/>
+              <w:left w:w="100" w:type="dxa"/>
+              <w:right w:w="100" w:type="dxa"/>
             </w:tcMar>
           </w:tcPr>
           <w:p>
@@ -2268,19 +2262,19 @@
                 <w:color w:val="FFFFFF"/>
                 <w:sz w:val="18"/>
               </w:rPr>
-              <w:t>Significance Level</w:t>
+              <w:t>p-value</w:t>
             </w:r>
           </w:p>
         </w:tc>
         <w:tc>
           <w:tcPr>
-            <w:tcW w:type="dxa" w:w="1584"/>
-            <w:shd w:fill="003366"/>
+            <w:tcW w:type="dxa" w:w="2016"/>
+            <w:shd w:fill="2C3E50"/>
             <w:tcMar>
-              <w:top w:w="100" w:type="dxa"/>
-              <w:bottom w:w="100" w:type="dxa"/>
-              <w:left w:w="120" w:type="dxa"/>
-              <w:right w:w="120" w:type="dxa"/>
+              <w:top w:w="80" w:type="dxa"/>
+              <w:bottom w:w="80" w:type="dxa"/>
+              <w:left w:w="100" w:type="dxa"/>
+              <w:right w:w="100" w:type="dxa"/>
             </w:tcMar>
           </w:tcPr>
           <w:p>
@@ -2294,7 +2288,7 @@
                 <w:color w:val="FFFFFF"/>
                 <w:sz w:val="18"/>
               </w:rPr>
-              <w:t>Result</w:t>
+              <w:t>Practical Conclusion</w:t>
             </w:r>
           </w:p>
         </w:tc>
@@ -2302,13 +2296,13 @@
       <w:tr>
         <w:tc>
           <w:tcPr>
-            <w:tcW w:type="dxa" w:w="2304"/>
+            <w:tcW w:type="dxa" w:w="2160"/>
             <w:shd w:fill="FFFFFF"/>
             <w:tcMar>
-              <w:top w:w="70" w:type="dxa"/>
-              <w:bottom w:w="70" w:type="dxa"/>
-              <w:left w:w="100" w:type="dxa"/>
-              <w:right w:w="100" w:type="dxa"/>
+              <w:top w:w="60" w:type="dxa"/>
+              <w:bottom w:w="60" w:type="dxa"/>
+              <w:left w:w="80" w:type="dxa"/>
+              <w:right w:w="80" w:type="dxa"/>
             </w:tcMar>
           </w:tcPr>
           <w:p>
@@ -2317,7 +2311,7 @@
                 <w:rFonts w:ascii="Times New Roman" w:hAnsi="Times New Roman"/>
                 <w:sz w:val="17"/>
               </w:rPr>
-              <w:t>VAH/VAL Mean-Reversion</w:t>
+              <w:t>VAH/VAL Reversal</w:t>
             </w:r>
           </w:p>
         </w:tc>
@@ -2326,10 +2320,10 @@
             <w:tcW w:type="dxa" w:w="2016"/>
             <w:shd w:fill="FFFFFF"/>
             <w:tcMar>
-              <w:top w:w="70" w:type="dxa"/>
-              <w:bottom w:w="70" w:type="dxa"/>
-              <w:left w:w="100" w:type="dxa"/>
-              <w:right w:w="100" w:type="dxa"/>
+              <w:top w:w="60" w:type="dxa"/>
+              <w:bottom w:w="60" w:type="dxa"/>
+              <w:left w:w="80" w:type="dxa"/>
+              <w:right w:w="80" w:type="dxa"/>
             </w:tcMar>
           </w:tcPr>
           <w:p>
@@ -2338,19 +2332,19 @@
                 <w:rFonts w:ascii="Times New Roman" w:hAnsi="Times New Roman"/>
                 <w:sz w:val="17"/>
               </w:rPr>
-              <w:t>71.4% Reversal Rate</w:t>
+              <w:t>71.4% Mean-Reversion</w:t>
             </w:r>
           </w:p>
         </w:tc>
         <w:tc>
           <w:tcPr>
-            <w:tcW w:type="dxa" w:w="2160"/>
+            <w:tcW w:type="dxa" w:w="2016"/>
             <w:shd w:fill="FFFFFF"/>
             <w:tcMar>
-              <w:top w:w="70" w:type="dxa"/>
-              <w:bottom w:w="70" w:type="dxa"/>
-              <w:left w:w="100" w:type="dxa"/>
-              <w:right w:w="100" w:type="dxa"/>
+              <w:top w:w="60" w:type="dxa"/>
+              <w:bottom w:w="60" w:type="dxa"/>
+              <w:left w:w="80" w:type="dxa"/>
+              <w:right w:w="80" w:type="dxa"/>
             </w:tcMar>
           </w:tcPr>
           <w:p>
@@ -2365,13 +2359,13 @@
         </w:tc>
         <w:tc>
           <w:tcPr>
-            <w:tcW w:type="dxa" w:w="1728"/>
+            <w:tcW w:type="dxa" w:w="1584"/>
             <w:shd w:fill="FFFFFF"/>
             <w:tcMar>
-              <w:top w:w="70" w:type="dxa"/>
-              <w:bottom w:w="70" w:type="dxa"/>
-              <w:left w:w="100" w:type="dxa"/>
-              <w:right w:w="100" w:type="dxa"/>
+              <w:top w:w="60" w:type="dxa"/>
+              <w:bottom w:w="60" w:type="dxa"/>
+              <w:left w:w="80" w:type="dxa"/>
+              <w:right w:w="80" w:type="dxa"/>
             </w:tcMar>
           </w:tcPr>
           <w:p>
@@ -2386,13 +2380,13 @@
         </w:tc>
         <w:tc>
           <w:tcPr>
-            <w:tcW w:type="dxa" w:w="1584"/>
+            <w:tcW w:type="dxa" w:w="2016"/>
             <w:shd w:fill="FFFFFF"/>
             <w:tcMar>
-              <w:top w:w="70" w:type="dxa"/>
-              <w:bottom w:w="70" w:type="dxa"/>
-              <w:left w:w="100" w:type="dxa"/>
-              <w:right w:w="100" w:type="dxa"/>
+              <w:top w:w="60" w:type="dxa"/>
+              <w:bottom w:w="60" w:type="dxa"/>
+              <w:left w:w="80" w:type="dxa"/>
+              <w:right w:w="80" w:type="dxa"/>
             </w:tcMar>
           </w:tcPr>
           <w:p>
@@ -2401,7 +2395,7 @@
                 <w:rFonts w:ascii="Times New Roman" w:hAnsi="Times New Roman"/>
                 <w:sz w:val="17"/>
               </w:rPr>
-              <w:t>H0 Rejected (Significant)</w:t>
+              <w:t>Levels act as real inflection zones.</w:t>
             </w:r>
           </w:p>
         </w:tc>
@@ -2409,13 +2403,13 @@
       <w:tr>
         <w:tc>
           <w:tcPr>
-            <w:tcW w:type="dxa" w:w="2304"/>
-            <w:shd w:fill="F4F6F9"/>
+            <w:tcW w:type="dxa" w:w="2160"/>
+            <w:shd w:fill="F5F7FA"/>
             <w:tcMar>
-              <w:top w:w="70" w:type="dxa"/>
-              <w:bottom w:w="70" w:type="dxa"/>
-              <w:left w:w="100" w:type="dxa"/>
-              <w:right w:w="100" w:type="dxa"/>
+              <w:top w:w="60" w:type="dxa"/>
+              <w:bottom w:w="60" w:type="dxa"/>
+              <w:left w:w="80" w:type="dxa"/>
+              <w:right w:w="80" w:type="dxa"/>
             </w:tcMar>
           </w:tcPr>
           <w:p>
@@ -2424,19 +2418,19 @@
                 <w:rFonts w:ascii="Times New Roman" w:hAnsi="Times New Roman"/>
                 <w:sz w:val="17"/>
               </w:rPr>
-              <w:t>GMM Archetype Concordance</w:t>
+              <w:t>GMM Cluster Match</w:t>
             </w:r>
           </w:p>
         </w:tc>
         <w:tc>
           <w:tcPr>
             <w:tcW w:type="dxa" w:w="2016"/>
-            <w:shd w:fill="F4F6F9"/>
+            <w:shd w:fill="F5F7FA"/>
             <w:tcMar>
-              <w:top w:w="70" w:type="dxa"/>
-              <w:bottom w:w="70" w:type="dxa"/>
-              <w:left w:w="100" w:type="dxa"/>
-              <w:right w:w="100" w:type="dxa"/>
+              <w:top w:w="60" w:type="dxa"/>
+              <w:bottom w:w="60" w:type="dxa"/>
+              <w:left w:w="80" w:type="dxa"/>
+              <w:right w:w="80" w:type="dxa"/>
             </w:tcMar>
           </w:tcPr>
           <w:p>
@@ -2445,19 +2439,19 @@
                 <w:rFonts w:ascii="Times New Roman" w:hAnsi="Times New Roman"/>
                 <w:sz w:val="17"/>
               </w:rPr>
-              <w:t>91.2% Day-Type Match</w:t>
+              <w:t>91.2% Match with Expert Tags</w:t>
             </w:r>
           </w:p>
         </w:tc>
         <w:tc>
           <w:tcPr>
-            <w:tcW w:type="dxa" w:w="2160"/>
-            <w:shd w:fill="F4F6F9"/>
+            <w:tcW w:type="dxa" w:w="2016"/>
+            <w:shd w:fill="F5F7FA"/>
             <w:tcMar>
-              <w:top w:w="70" w:type="dxa"/>
-              <w:bottom w:w="70" w:type="dxa"/>
-              <w:left w:w="100" w:type="dxa"/>
-              <w:right w:w="100" w:type="dxa"/>
+              <w:top w:w="60" w:type="dxa"/>
+              <w:bottom w:w="60" w:type="dxa"/>
+              <w:left w:w="80" w:type="dxa"/>
+              <w:right w:w="80" w:type="dxa"/>
             </w:tcMar>
           </w:tcPr>
           <w:p>
@@ -2472,13 +2466,13 @@
         </w:tc>
         <w:tc>
           <w:tcPr>
-            <w:tcW w:type="dxa" w:w="1728"/>
-            <w:shd w:fill="F4F6F9"/>
+            <w:tcW w:type="dxa" w:w="1584"/>
+            <w:shd w:fill="F5F7FA"/>
             <w:tcMar>
-              <w:top w:w="70" w:type="dxa"/>
-              <w:bottom w:w="70" w:type="dxa"/>
-              <w:left w:w="100" w:type="dxa"/>
-              <w:right w:w="100" w:type="dxa"/>
+              <w:top w:w="60" w:type="dxa"/>
+              <w:bottom w:w="60" w:type="dxa"/>
+              <w:left w:w="80" w:type="dxa"/>
+              <w:right w:w="80" w:type="dxa"/>
             </w:tcMar>
           </w:tcPr>
           <w:p>
@@ -2493,13 +2487,13 @@
         </w:tc>
         <w:tc>
           <w:tcPr>
-            <w:tcW w:type="dxa" w:w="1584"/>
-            <w:shd w:fill="F4F6F9"/>
+            <w:tcW w:type="dxa" w:w="2016"/>
+            <w:shd w:fill="F5F7FA"/>
             <w:tcMar>
-              <w:top w:w="70" w:type="dxa"/>
-              <w:bottom w:w="70" w:type="dxa"/>
-              <w:left w:w="100" w:type="dxa"/>
-              <w:right w:w="100" w:type="dxa"/>
+              <w:top w:w="60" w:type="dxa"/>
+              <w:bottom w:w="60" w:type="dxa"/>
+              <w:left w:w="80" w:type="dxa"/>
+              <w:right w:w="80" w:type="dxa"/>
             </w:tcMar>
           </w:tcPr>
           <w:p>
@@ -2508,7 +2502,7 @@
                 <w:rFonts w:ascii="Times New Roman" w:hAnsi="Times New Roman"/>
                 <w:sz w:val="17"/>
               </w:rPr>
-              <w:t>Strong Agreement</w:t>
+              <w:t>GMM reliably identifies day types.</w:t>
             </w:r>
           </w:p>
         </w:tc>
@@ -2516,13 +2510,13 @@
       <w:tr>
         <w:tc>
           <w:tcPr>
-            <w:tcW w:type="dxa" w:w="2304"/>
+            <w:tcW w:type="dxa" w:w="2160"/>
             <w:shd w:fill="FFFFFF"/>
             <w:tcMar>
-              <w:top w:w="70" w:type="dxa"/>
-              <w:bottom w:w="70" w:type="dxa"/>
-              <w:left w:w="100" w:type="dxa"/>
-              <w:right w:w="100" w:type="dxa"/>
+              <w:top w:w="60" w:type="dxa"/>
+              <w:bottom w:w="60" w:type="dxa"/>
+              <w:left w:w="80" w:type="dxa"/>
+              <w:right w:w="80" w:type="dxa"/>
             </w:tcMar>
           </w:tcPr>
           <w:p>
@@ -2531,7 +2525,7 @@
                 <w:rFonts w:ascii="Times New Roman" w:hAnsi="Times New Roman"/>
                 <w:sz w:val="17"/>
               </w:rPr>
-              <w:t>TPAM &lt; 0.15 Rejection</w:t>
+              <w:t>Failed Auction (TPAM &lt; 0.15)</w:t>
             </w:r>
           </w:p>
         </w:tc>
@@ -2540,10 +2534,10 @@
             <w:tcW w:type="dxa" w:w="2016"/>
             <w:shd w:fill="FFFFFF"/>
             <w:tcMar>
-              <w:top w:w="70" w:type="dxa"/>
-              <w:bottom w:w="70" w:type="dxa"/>
-              <w:left w:w="100" w:type="dxa"/>
-              <w:right w:w="100" w:type="dxa"/>
+              <w:top w:w="60" w:type="dxa"/>
+              <w:bottom w:w="60" w:type="dxa"/>
+              <w:left w:w="80" w:type="dxa"/>
+              <w:right w:w="80" w:type="dxa"/>
             </w:tcMar>
           </w:tcPr>
           <w:p>
@@ -2552,19 +2546,19 @@
                 <w:rFonts w:ascii="Times New Roman" w:hAnsi="Times New Roman"/>
                 <w:sz w:val="17"/>
               </w:rPr>
-              <w:t>82.4% Return to Value</w:t>
+              <w:t>82.4% Returned into Value</w:t>
             </w:r>
           </w:p>
         </w:tc>
         <w:tc>
           <w:tcPr>
-            <w:tcW w:type="dxa" w:w="2160"/>
+            <w:tcW w:type="dxa" w:w="2016"/>
             <w:shd w:fill="FFFFFF"/>
             <w:tcMar>
-              <w:top w:w="70" w:type="dxa"/>
-              <w:bottom w:w="70" w:type="dxa"/>
-              <w:left w:w="100" w:type="dxa"/>
-              <w:right w:w="100" w:type="dxa"/>
+              <w:top w:w="60" w:type="dxa"/>
+              <w:bottom w:w="60" w:type="dxa"/>
+              <w:left w:w="80" w:type="dxa"/>
+              <w:right w:w="80" w:type="dxa"/>
             </w:tcMar>
           </w:tcPr>
           <w:p>
@@ -2579,13 +2573,13 @@
         </w:tc>
         <w:tc>
           <w:tcPr>
-            <w:tcW w:type="dxa" w:w="1728"/>
+            <w:tcW w:type="dxa" w:w="1584"/>
             <w:shd w:fill="FFFFFF"/>
             <w:tcMar>
-              <w:top w:w="70" w:type="dxa"/>
-              <w:bottom w:w="70" w:type="dxa"/>
-              <w:left w:w="100" w:type="dxa"/>
-              <w:right w:w="100" w:type="dxa"/>
+              <w:top w:w="60" w:type="dxa"/>
+              <w:bottom w:w="60" w:type="dxa"/>
+              <w:left w:w="80" w:type="dxa"/>
+              <w:right w:w="80" w:type="dxa"/>
             </w:tcMar>
           </w:tcPr>
           <w:p>
@@ -2600,13 +2594,13 @@
         </w:tc>
         <w:tc>
           <w:tcPr>
-            <w:tcW w:type="dxa" w:w="1584"/>
+            <w:tcW w:type="dxa" w:w="2016"/>
             <w:shd w:fill="FFFFFF"/>
             <w:tcMar>
-              <w:top w:w="70" w:type="dxa"/>
-              <w:bottom w:w="70" w:type="dxa"/>
-              <w:left w:w="100" w:type="dxa"/>
-              <w:right w:w="100" w:type="dxa"/>
+              <w:top w:w="60" w:type="dxa"/>
+              <w:bottom w:w="60" w:type="dxa"/>
+              <w:left w:w="80" w:type="dxa"/>
+              <w:right w:w="80" w:type="dxa"/>
             </w:tcMar>
           </w:tcPr>
           <w:p>
@@ -2615,7 +2609,7 @@
                 <w:rFonts w:ascii="Times New Roman" w:hAnsi="Times New Roman"/>
                 <w:sz w:val="17"/>
               </w:rPr>
-              <w:t>Highly Predictive Reversal</w:t>
+              <w:t>Reliably flags false breakouts.</w:t>
             </w:r>
           </w:p>
         </w:tc>
@@ -2623,13 +2617,13 @@
       <w:tr>
         <w:tc>
           <w:tcPr>
-            <w:tcW w:type="dxa" w:w="2304"/>
-            <w:shd w:fill="F4F6F9"/>
+            <w:tcW w:type="dxa" w:w="2160"/>
+            <w:shd w:fill="F5F7FA"/>
             <w:tcMar>
-              <w:top w:w="70" w:type="dxa"/>
-              <w:bottom w:w="70" w:type="dxa"/>
-              <w:left w:w="100" w:type="dxa"/>
-              <w:right w:w="100" w:type="dxa"/>
+              <w:top w:w="60" w:type="dxa"/>
+              <w:bottom w:w="60" w:type="dxa"/>
+              <w:left w:w="80" w:type="dxa"/>
+              <w:right w:w="80" w:type="dxa"/>
             </w:tcMar>
           </w:tcPr>
           <w:p>
@@ -2638,19 +2632,19 @@
                 <w:rFonts w:ascii="Times New Roman" w:hAnsi="Times New Roman"/>
                 <w:sz w:val="17"/>
               </w:rPr>
-              <w:t>Initial Balance Expansion</w:t>
+              <w:t>Initial Balance Extension</w:t>
             </w:r>
           </w:p>
         </w:tc>
         <w:tc>
           <w:tcPr>
             <w:tcW w:type="dxa" w:w="2016"/>
-            <w:shd w:fill="F4F6F9"/>
+            <w:shd w:fill="F5F7FA"/>
             <w:tcMar>
-              <w:top w:w="70" w:type="dxa"/>
-              <w:bottom w:w="70" w:type="dxa"/>
-              <w:left w:w="100" w:type="dxa"/>
-              <w:right w:w="100" w:type="dxa"/>
+              <w:top w:w="60" w:type="dxa"/>
+              <w:bottom w:w="60" w:type="dxa"/>
+              <w:left w:w="80" w:type="dxa"/>
+              <w:right w:w="80" w:type="dxa"/>
             </w:tcMar>
           </w:tcPr>
           <w:p>
@@ -2659,19 +2653,19 @@
                 <w:rFonts w:ascii="Times New Roman" w:hAnsi="Times New Roman"/>
                 <w:sz w:val="17"/>
               </w:rPr>
-              <w:t>81.6% Session Extension</w:t>
+              <w:t>81.6% Days Broke the Range</w:t>
             </w:r>
           </w:p>
         </w:tc>
         <w:tc>
           <w:tcPr>
-            <w:tcW w:type="dxa" w:w="2160"/>
-            <w:shd w:fill="F4F6F9"/>
+            <w:tcW w:type="dxa" w:w="2016"/>
+            <w:shd w:fill="F5F7FA"/>
             <w:tcMar>
-              <w:top w:w="70" w:type="dxa"/>
-              <w:bottom w:w="70" w:type="dxa"/>
-              <w:left w:w="100" w:type="dxa"/>
-              <w:right w:w="100" w:type="dxa"/>
+              <w:top w:w="60" w:type="dxa"/>
+              <w:bottom w:w="60" w:type="dxa"/>
+              <w:left w:w="80" w:type="dxa"/>
+              <w:right w:w="80" w:type="dxa"/>
             </w:tcMar>
           </w:tcPr>
           <w:p>
@@ -2686,13 +2680,13 @@
         </w:tc>
         <w:tc>
           <w:tcPr>
-            <w:tcW w:type="dxa" w:w="1728"/>
-            <w:shd w:fill="F4F6F9"/>
+            <w:tcW w:type="dxa" w:w="1584"/>
+            <w:shd w:fill="F5F7FA"/>
             <w:tcMar>
-              <w:top w:w="70" w:type="dxa"/>
-              <w:bottom w:w="70" w:type="dxa"/>
-              <w:left w:w="100" w:type="dxa"/>
-              <w:right w:w="100" w:type="dxa"/>
+              <w:top w:w="60" w:type="dxa"/>
+              <w:bottom w:w="60" w:type="dxa"/>
+              <w:left w:w="80" w:type="dxa"/>
+              <w:right w:w="80" w:type="dxa"/>
             </w:tcMar>
           </w:tcPr>
           <w:p>
@@ -2707,13 +2701,13 @@
         </w:tc>
         <w:tc>
           <w:tcPr>
-            <w:tcW w:type="dxa" w:w="1584"/>
-            <w:shd w:fill="F4F6F9"/>
+            <w:tcW w:type="dxa" w:w="2016"/>
+            <w:shd w:fill="F5F7FA"/>
             <w:tcMar>
-              <w:top w:w="70" w:type="dxa"/>
-              <w:bottom w:w="70" w:type="dxa"/>
-              <w:left w:w="100" w:type="dxa"/>
-              <w:right w:w="100" w:type="dxa"/>
+              <w:top w:w="60" w:type="dxa"/>
+              <w:bottom w:w="60" w:type="dxa"/>
+              <w:left w:w="80" w:type="dxa"/>
+              <w:right w:w="80" w:type="dxa"/>
             </w:tcMar>
           </w:tcPr>
           <w:p>
@@ -2722,7 +2716,7 @@
                 <w:rFonts w:ascii="Times New Roman" w:hAnsi="Times New Roman"/>
                 <w:sz w:val="17"/>
               </w:rPr>
-              <w:t>Confirms Higher Timeframe</w:t>
+              <w:t>Higher timeframe traders dominate.</w:t>
             </w:r>
           </w:p>
         </w:tc>
@@ -2730,22 +2724,22 @@
     </w:tbl>
     <w:p>
       <w:pPr>
-        <w:spacing w:after="120"/>
+        <w:spacing w:after="80"/>
       </w:pPr>
     </w:p>
     <w:p>
       <w:pPr>
         <w:pStyle w:val="Heading2"/>
-        <w:spacing w:before="160" w:after="60"/>
+        <w:spacing w:before="160" w:after="40"/>
       </w:pPr>
       <w:r>
         <w:rPr>
           <w:rFonts w:ascii="Times New Roman" w:hAnsi="Times New Roman"/>
           <w:b/>
-          <w:color w:val="1E508C"/>
-          <w:sz w:val="22"/>
+          <w:color w:val="1E1E1E"/>
+          <w:sz w:val="21"/>
         </w:rPr>
-        <w:t>B. Unsupervised Regime Classification via GMM</w:t>
+        <w:t>B. Unsupervised Market Regime Clustering</w:t>
       </w:r>
     </w:p>
     <w:p>
@@ -2759,7 +2753,7 @@
           <w:i w:val="0"/>
           <w:sz w:val="20"/>
         </w:rPr>
-        <w:t>A Gaussian Mixture Model (GMM) trained on DDAI, Volume Kurtosis, and Initial Balance Extension Ratios (IBER) separated trading sessions into distinct structural clusters with a Cohen's kappa coefficient of kappa = 0.82 relative to expert annotations. Rotational balance sessions exhibited sharp positive excess kurtosis (gamma_2 &gt; 1.2), while trending sessions exhibited negative excess kurtosis (gamma_2 &lt; -0.8).</w:t>
+        <w:t>Using a Gaussian Mixture Model (GMM) trained on DDAI, volume kurtosis, and opening range extension ratios, the engine automatically categorized sessions into Rotational Days and Trend Days. As shown in Fig. 3, balanced days consistently display high positive excess kurtosis (gamma_2 &gt; 1.2), reflecting tight volume clustering around the VPOC. Trending days show negative kurtosis (gamma_2 &lt; -0.8), indicating volume was dragged across a wide price range.</w:t>
       </w:r>
     </w:p>
     <w:p>
@@ -2770,7 +2764,7 @@
       <w:r>
         <w:drawing>
           <wp:inline xmlns:a="http://schemas.openxmlformats.org/drawingml/2006/main" xmlns:pic="http://schemas.openxmlformats.org/drawingml/2006/picture">
-            <wp:extent cx="5669280" cy="3644537"/>
+            <wp:extent cx="5486400" cy="3526971"/>
             <wp:docPr id="3" name="Picture 3"/>
             <wp:cNvGraphicFramePr>
               <a:graphicFrameLocks noChangeAspect="1"/>
@@ -2791,7 +2785,7 @@
                   <pic:spPr>
                     <a:xfrm>
                       <a:off x="0" y="0"/>
-                      <a:ext cx="5669280" cy="3644537"/>
+                      <a:ext cx="5486400" cy="3526971"/>
                     </a:xfrm>
                     <a:prstGeom prst="rect"/>
                   </pic:spPr>
@@ -2811,25 +2805,24 @@
         <w:rPr>
           <w:rFonts w:ascii="Times New Roman" w:hAnsi="Times New Roman"/>
           <w:i/>
-          <w:color w:val="3C3C3C"/>
           <w:sz w:val="18"/>
         </w:rPr>
-        <w:t>Fig. 3. Unsupervised Gaussian Mixture Model clustering across the Dual-Distribution Asymmetry Index (DDAI) and Volume Excess Kurtosis (gamma_2), demonstrating distinct separation between Rotational Balance and Initiative Trend regimes.</w:t>
+        <w:t>Fig. 3. GMM clustering across DDAI and Volume Kurtosis, showing clear separation between balanced rotational days and aggressive trending days.</w:t>
       </w:r>
     </w:p>
     <w:p>
       <w:pPr>
         <w:pStyle w:val="Heading2"/>
-        <w:spacing w:before="160" w:after="60"/>
+        <w:spacing w:before="160" w:after="40"/>
       </w:pPr>
       <w:r>
         <w:rPr>
           <w:rFonts w:ascii="Times New Roman" w:hAnsi="Times New Roman"/>
           <w:b/>
-          <w:color w:val="1E508C"/>
-          <w:sz w:val="22"/>
+          <w:color w:val="1E1E1E"/>
+          <w:sz w:val="21"/>
         </w:rPr>
-        <w:t>C. Acceptance vs. Rejection Dynamics (TPAM)</w:t>
+        <w:t>C. Catching False Breakouts with TPAM</w:t>
       </w:r>
     </w:p>
     <w:p>
@@ -2843,7 +2836,7 @@
           <w:i w:val="0"/>
           <w:sz w:val="20"/>
         </w:rPr>
-        <w:t>As illustrated in Fig. 4, price excursions outside the prior Value Area with TPAM &lt; 0.15 displayed an 82.4% empirical probability of mean-reverting into the Value Area. In contrast, excursions maintaining TPAM &gt;= 0.40 established sustained directional trends 78.9% of the time, validating TPAM's efficacy in eliminating false breakout traps.</w:t>
+        <w:t>One of the biggest headaches for traders is buying a breakout only to have it immediately reverse. Our findings with TPAM highlight why this happens. When price pushed outside the prior Value Area but generated a TPAM of less than 0.15, price mean-reverted back inside the Value Area 82.4% of the time. However, when TPAM crossed 0.40, price went on to establish a sustained trend in 78.9% of cases (Fig. 4).</w:t>
       </w:r>
     </w:p>
     <w:p>
@@ -2854,7 +2847,7 @@
       <w:r>
         <w:drawing>
           <wp:inline xmlns:a="http://schemas.openxmlformats.org/drawingml/2006/main" xmlns:pic="http://schemas.openxmlformats.org/drawingml/2006/picture">
-            <wp:extent cx="5669280" cy="3401568"/>
+            <wp:extent cx="5486400" cy="3291840"/>
             <wp:docPr id="4" name="Picture 4"/>
             <wp:cNvGraphicFramePr>
               <a:graphicFrameLocks noChangeAspect="1"/>
@@ -2875,7 +2868,7 @@
                   <pic:spPr>
                     <a:xfrm>
                       <a:off x="0" y="0"/>
-                      <a:ext cx="5669280" cy="3401568"/>
+                      <a:ext cx="5486400" cy="3291840"/>
                     </a:xfrm>
                     <a:prstGeom prst="rect"/>
                   </pic:spPr>
@@ -2895,10 +2888,9 @@
         <w:rPr>
           <w:rFonts w:ascii="Times New Roman" w:hAnsi="Times New Roman"/>
           <w:i/>
-          <w:color w:val="3C3C3C"/>
           <w:sz w:val="18"/>
         </w:rPr>
-        <w:t>Fig. 4. Empirical probability of price mean-reverting back into the prior Value Area as a function of the Thermodynamic Price Acceptance Metric (TPAM), confirming a sharp transition from auction rejection to sustained trend discovery.</w:t>
+        <w:t>Fig. 4. Probability of price reversing back into the Value Area plotted against TPAM, showing a sharp drop once continuous volume confirms acceptance.</w:t>
       </w:r>
     </w:p>
     <w:p>
@@ -2910,10 +2902,10 @@
         <w:rPr>
           <w:rFonts w:ascii="Times New Roman" w:hAnsi="Times New Roman"/>
           <w:b/>
-          <w:color w:val="003366"/>
-          <w:sz w:val="26"/>
+          <w:color w:val="000000"/>
+          <w:sz w:val="24"/>
         </w:rPr>
-        <w:t>VI. NOVELTY BENCHMARKING &amp; SYSTEM READINESS</w:t>
+        <w:t>VI. HOW ALPHAPULSE COMPARES TO EXISTING TOOLS</w:t>
       </w:r>
     </w:p>
     <w:p>
@@ -2927,7 +2919,7 @@
           <w:i w:val="0"/>
           <w:sz w:val="20"/>
         </w:rPr>
-        <w:t>Table IV benchmarks the AlphaPulse platform against prominent commercial trading platforms, screeners, and academic machine learning bots.</w:t>
+        <w:t>Table IV compares AlphaPulse with popular commercial charting software, retail screeners, and academic deep learning bots.</w:t>
       </w:r>
     </w:p>
     <w:p>
@@ -2939,10 +2931,9 @@
         <w:rPr>
           <w:rFonts w:ascii="Times New Roman" w:hAnsi="Times New Roman"/>
           <w:b/>
-          <w:color w:val="003366"/>
           <w:sz w:val="19"/>
         </w:rPr>
-        <w:t>TABLE IV: COMPREHENSIVE NOVELTY AND BENCHMARKING MATRIX</w:t>
+        <w:t>TABLE IV: BENCHMARKING ALPHAPULSE AGAINST CURRENT PLATFORMS</w:t>
       </w:r>
     </w:p>
     <w:tbl>
@@ -2963,12 +2954,12 @@
         <w:tc>
           <w:tcPr>
             <w:tcW w:type="dxa" w:w="2160"/>
-            <w:shd w:fill="003366"/>
+            <w:shd w:fill="2C3E50"/>
             <w:tcMar>
-              <w:top w:w="100" w:type="dxa"/>
-              <w:bottom w:w="100" w:type="dxa"/>
-              <w:left w:w="120" w:type="dxa"/>
-              <w:right w:w="120" w:type="dxa"/>
+              <w:top w:w="80" w:type="dxa"/>
+              <w:bottom w:w="80" w:type="dxa"/>
+              <w:left w:w="100" w:type="dxa"/>
+              <w:right w:w="100" w:type="dxa"/>
             </w:tcMar>
           </w:tcPr>
           <w:p>
@@ -2982,19 +2973,19 @@
                 <w:color w:val="FFFFFF"/>
                 <w:sz w:val="18"/>
               </w:rPr>
-              <w:t>Evaluation Dimension</w:t>
+              <w:t>Feature / Dimension</w:t>
             </w:r>
           </w:p>
         </w:tc>
         <w:tc>
           <w:tcPr>
             <w:tcW w:type="dxa" w:w="1872"/>
-            <w:shd w:fill="003366"/>
+            <w:shd w:fill="2C3E50"/>
             <w:tcMar>
-              <w:top w:w="100" w:type="dxa"/>
-              <w:bottom w:w="100" w:type="dxa"/>
-              <w:left w:w="120" w:type="dxa"/>
-              <w:right w:w="120" w:type="dxa"/>
+              <w:top w:w="80" w:type="dxa"/>
+              <w:bottom w:w="80" w:type="dxa"/>
+              <w:left w:w="100" w:type="dxa"/>
+              <w:right w:w="100" w:type="dxa"/>
             </w:tcMar>
           </w:tcPr>
           <w:p>
@@ -3015,12 +3006,12 @@
         <w:tc>
           <w:tcPr>
             <w:tcW w:type="dxa" w:w="1872"/>
-            <w:shd w:fill="003366"/>
+            <w:shd w:fill="2C3E50"/>
             <w:tcMar>
-              <w:top w:w="100" w:type="dxa"/>
-              <w:bottom w:w="100" w:type="dxa"/>
-              <w:left w:w="120" w:type="dxa"/>
-              <w:right w:w="120" w:type="dxa"/>
+              <w:top w:w="80" w:type="dxa"/>
+              <w:bottom w:w="80" w:type="dxa"/>
+              <w:left w:w="100" w:type="dxa"/>
+              <w:right w:w="100" w:type="dxa"/>
             </w:tcMar>
           </w:tcPr>
           <w:p>
@@ -3040,13 +3031,13 @@
         </w:tc>
         <w:tc>
           <w:tcPr>
-            <w:tcW w:type="dxa" w:w="2016"/>
-            <w:shd w:fill="003366"/>
+            <w:tcW w:type="dxa" w:w="1872"/>
+            <w:shd w:fill="2C3E50"/>
             <w:tcMar>
-              <w:top w:w="100" w:type="dxa"/>
-              <w:bottom w:w="100" w:type="dxa"/>
-              <w:left w:w="120" w:type="dxa"/>
-              <w:right w:w="120" w:type="dxa"/>
+              <w:top w:w="80" w:type="dxa"/>
+              <w:bottom w:w="80" w:type="dxa"/>
+              <w:left w:w="100" w:type="dxa"/>
+              <w:right w:w="100" w:type="dxa"/>
             </w:tcMar>
           </w:tcPr>
           <w:p>
@@ -3060,19 +3051,19 @@
                 <w:color w:val="FFFFFF"/>
                 <w:sz w:val="18"/>
               </w:rPr>
-              <w:t>Black-Box ML Bots</w:t>
+              <w:t>Deep ML Bots</w:t>
             </w:r>
           </w:p>
         </w:tc>
         <w:tc>
           <w:tcPr>
-            <w:tcW w:type="dxa" w:w="1872"/>
-            <w:shd w:fill="003366"/>
+            <w:tcW w:type="dxa" w:w="2016"/>
+            <w:shd w:fill="2C3E50"/>
             <w:tcMar>
-              <w:top w:w="100" w:type="dxa"/>
-              <w:bottom w:w="100" w:type="dxa"/>
-              <w:left w:w="120" w:type="dxa"/>
-              <w:right w:w="120" w:type="dxa"/>
+              <w:top w:w="80" w:type="dxa"/>
+              <w:bottom w:w="80" w:type="dxa"/>
+              <w:left w:w="100" w:type="dxa"/>
+              <w:right w:w="100" w:type="dxa"/>
             </w:tcMar>
           </w:tcPr>
           <w:p>
@@ -3097,10 +3088,10 @@
             <w:tcW w:type="dxa" w:w="2160"/>
             <w:shd w:fill="FFFFFF"/>
             <w:tcMar>
-              <w:top w:w="70" w:type="dxa"/>
-              <w:bottom w:w="70" w:type="dxa"/>
-              <w:left w:w="100" w:type="dxa"/>
-              <w:right w:w="100" w:type="dxa"/>
+              <w:top w:w="60" w:type="dxa"/>
+              <w:bottom w:w="60" w:type="dxa"/>
+              <w:left w:w="80" w:type="dxa"/>
+              <w:right w:w="80" w:type="dxa"/>
             </w:tcMar>
           </w:tcPr>
           <w:p>
@@ -3109,7 +3100,7 @@
                 <w:rFonts w:ascii="Times New Roman" w:hAnsi="Times New Roman"/>
                 <w:sz w:val="17"/>
               </w:rPr>
-              <w:t>Core Architecture</w:t>
+              <w:t>Core Method</w:t>
             </w:r>
           </w:p>
         </w:tc>
@@ -3118,10 +3109,10 @@
             <w:tcW w:type="dxa" w:w="1872"/>
             <w:shd w:fill="FFFFFF"/>
             <w:tcMar>
-              <w:top w:w="70" w:type="dxa"/>
-              <w:bottom w:w="70" w:type="dxa"/>
-              <w:left w:w="100" w:type="dxa"/>
-              <w:right w:w="100" w:type="dxa"/>
+              <w:top w:w="60" w:type="dxa"/>
+              <w:bottom w:w="60" w:type="dxa"/>
+              <w:left w:w="80" w:type="dxa"/>
+              <w:right w:w="80" w:type="dxa"/>
             </w:tcMar>
           </w:tcPr>
           <w:p>
@@ -3130,7 +3121,7 @@
                 <w:rFonts w:ascii="Times New Roman" w:hAnsi="Times New Roman"/>
                 <w:sz w:val="17"/>
               </w:rPr>
-              <w:t>Price Indicators</w:t>
+              <w:t>Price-based indicators</w:t>
             </w:r>
           </w:p>
         </w:tc>
@@ -3139,10 +3130,10 @@
             <w:tcW w:type="dxa" w:w="1872"/>
             <w:shd w:fill="FFFFFF"/>
             <w:tcMar>
-              <w:top w:w="70" w:type="dxa"/>
-              <w:bottom w:w="70" w:type="dxa"/>
-              <w:left w:w="100" w:type="dxa"/>
-              <w:right w:w="100" w:type="dxa"/>
+              <w:top w:w="60" w:type="dxa"/>
+              <w:bottom w:w="60" w:type="dxa"/>
+              <w:left w:w="80" w:type="dxa"/>
+              <w:right w:w="80" w:type="dxa"/>
             </w:tcMar>
           </w:tcPr>
           <w:p>
@@ -3151,7 +3142,28 @@
                 <w:rFonts w:ascii="Times New Roman" w:hAnsi="Times New Roman"/>
                 <w:sz w:val="17"/>
               </w:rPr>
-              <w:t>Automated Heuristics</w:t>
+              <w:t>Automated chart heuristics</w:t>
+            </w:r>
+          </w:p>
+        </w:tc>
+        <w:tc>
+          <w:tcPr>
+            <w:tcW w:type="dxa" w:w="1872"/>
+            <w:shd w:fill="FFFFFF"/>
+            <w:tcMar>
+              <w:top w:w="60" w:type="dxa"/>
+              <w:bottom w:w="60" w:type="dxa"/>
+              <w:left w:w="80" w:type="dxa"/>
+              <w:right w:w="80" w:type="dxa"/>
+            </w:tcMar>
+          </w:tcPr>
+          <w:p>
+            <w:r>
+              <w:rPr>
+                <w:rFonts w:ascii="Times New Roman" w:hAnsi="Times New Roman"/>
+                <w:sz w:val="17"/>
+              </w:rPr>
+              <w:t>Deep neural networks</w:t>
             </w:r>
           </w:p>
         </w:tc>
@@ -3160,31 +3172,10 @@
             <w:tcW w:type="dxa" w:w="2016"/>
             <w:shd w:fill="FFFFFF"/>
             <w:tcMar>
-              <w:top w:w="70" w:type="dxa"/>
-              <w:bottom w:w="70" w:type="dxa"/>
-              <w:left w:w="100" w:type="dxa"/>
-              <w:right w:w="100" w:type="dxa"/>
-            </w:tcMar>
-          </w:tcPr>
-          <w:p>
-            <w:r>
-              <w:rPr>
-                <w:rFonts w:ascii="Times New Roman" w:hAnsi="Times New Roman"/>
-                <w:sz w:val="17"/>
-              </w:rPr>
-              <w:t>Deep Neural Networks</w:t>
-            </w:r>
-          </w:p>
-        </w:tc>
-        <w:tc>
-          <w:tcPr>
-            <w:tcW w:type="dxa" w:w="1872"/>
-            <w:shd w:fill="FFFFFF"/>
-            <w:tcMar>
-              <w:top w:w="70" w:type="dxa"/>
-              <w:bottom w:w="70" w:type="dxa"/>
-              <w:left w:w="100" w:type="dxa"/>
-              <w:right w:w="100" w:type="dxa"/>
+              <w:top w:w="60" w:type="dxa"/>
+              <w:bottom w:w="60" w:type="dxa"/>
+              <w:left w:w="80" w:type="dxa"/>
+              <w:right w:w="80" w:type="dxa"/>
             </w:tcMar>
           </w:tcPr>
           <w:p>
@@ -3202,12 +3193,12 @@
         <w:tc>
           <w:tcPr>
             <w:tcW w:type="dxa" w:w="2160"/>
-            <w:shd w:fill="F4F6F9"/>
+            <w:shd w:fill="F5F7FA"/>
             <w:tcMar>
-              <w:top w:w="70" w:type="dxa"/>
-              <w:bottom w:w="70" w:type="dxa"/>
-              <w:left w:w="100" w:type="dxa"/>
-              <w:right w:w="100" w:type="dxa"/>
+              <w:top w:w="60" w:type="dxa"/>
+              <w:bottom w:w="60" w:type="dxa"/>
+              <w:left w:w="80" w:type="dxa"/>
+              <w:right w:w="80" w:type="dxa"/>
             </w:tcMar>
           </w:tcPr>
           <w:p>
@@ -3216,19 +3207,19 @@
                 <w:rFonts w:ascii="Times New Roman" w:hAnsi="Times New Roman"/>
                 <w:sz w:val="17"/>
               </w:rPr>
-              <w:t>Volume Profile Automation</w:t>
+              <w:t>Volume Profile</w:t>
             </w:r>
           </w:p>
         </w:tc>
         <w:tc>
           <w:tcPr>
             <w:tcW w:type="dxa" w:w="1872"/>
-            <w:shd w:fill="F4F6F9"/>
+            <w:shd w:fill="F5F7FA"/>
             <w:tcMar>
-              <w:top w:w="70" w:type="dxa"/>
-              <w:bottom w:w="70" w:type="dxa"/>
-              <w:left w:w="100" w:type="dxa"/>
-              <w:right w:w="100" w:type="dxa"/>
+              <w:top w:w="60" w:type="dxa"/>
+              <w:bottom w:w="60" w:type="dxa"/>
+              <w:left w:w="80" w:type="dxa"/>
+              <w:right w:w="80" w:type="dxa"/>
             </w:tcMar>
           </w:tcPr>
           <w:p>
@@ -3237,19 +3228,19 @@
                 <w:rFonts w:ascii="Times New Roman" w:hAnsi="Times New Roman"/>
                 <w:sz w:val="17"/>
               </w:rPr>
-              <w:t>Manual / Script Add-on</w:t>
+              <w:t>Paid add-on script</w:t>
             </w:r>
           </w:p>
         </w:tc>
         <w:tc>
           <w:tcPr>
             <w:tcW w:type="dxa" w:w="1872"/>
-            <w:shd w:fill="F4F6F9"/>
+            <w:shd w:fill="F5F7FA"/>
             <w:tcMar>
-              <w:top w:w="70" w:type="dxa"/>
-              <w:bottom w:w="70" w:type="dxa"/>
-              <w:left w:w="100" w:type="dxa"/>
-              <w:right w:w="100" w:type="dxa"/>
+              <w:top w:w="60" w:type="dxa"/>
+              <w:bottom w:w="60" w:type="dxa"/>
+              <w:left w:w="80" w:type="dxa"/>
+              <w:right w:w="80" w:type="dxa"/>
             </w:tcMar>
           </w:tcPr>
           <w:p>
@@ -3258,19 +3249,19 @@
                 <w:rFonts w:ascii="Times New Roman" w:hAnsi="Times New Roman"/>
                 <w:sz w:val="17"/>
               </w:rPr>
-              <w:t>Automated Charts</w:t>
+              <w:t>Basic automated overlays</w:t>
             </w:r>
           </w:p>
         </w:tc>
         <w:tc>
           <w:tcPr>
-            <w:tcW w:type="dxa" w:w="2016"/>
-            <w:shd w:fill="F4F6F9"/>
+            <w:tcW w:type="dxa" w:w="1872"/>
+            <w:shd w:fill="F5F7FA"/>
             <w:tcMar>
-              <w:top w:w="70" w:type="dxa"/>
-              <w:bottom w:w="70" w:type="dxa"/>
-              <w:left w:w="100" w:type="dxa"/>
-              <w:right w:w="100" w:type="dxa"/>
+              <w:top w:w="60" w:type="dxa"/>
+              <w:bottom w:w="60" w:type="dxa"/>
+              <w:left w:w="80" w:type="dxa"/>
+              <w:right w:w="80" w:type="dxa"/>
             </w:tcMar>
           </w:tcPr>
           <w:p>
@@ -3279,19 +3270,19 @@
                 <w:rFonts w:ascii="Times New Roman" w:hAnsi="Times New Roman"/>
                 <w:sz w:val="17"/>
               </w:rPr>
-              <w:t>Not Supported</w:t>
+              <w:t>Not supported</w:t>
             </w:r>
           </w:p>
         </w:tc>
         <w:tc>
           <w:tcPr>
-            <w:tcW w:type="dxa" w:w="1872"/>
-            <w:shd w:fill="F4F6F9"/>
+            <w:tcW w:type="dxa" w:w="2016"/>
+            <w:shd w:fill="F5F7FA"/>
             <w:tcMar>
-              <w:top w:w="70" w:type="dxa"/>
-              <w:bottom w:w="70" w:type="dxa"/>
-              <w:left w:w="100" w:type="dxa"/>
-              <w:right w:w="100" w:type="dxa"/>
+              <w:top w:w="60" w:type="dxa"/>
+              <w:bottom w:w="60" w:type="dxa"/>
+              <w:left w:w="80" w:type="dxa"/>
+              <w:right w:w="80" w:type="dxa"/>
             </w:tcMar>
           </w:tcPr>
           <w:p>
@@ -3300,7 +3291,7 @@
                 <w:rFonts w:ascii="Times New Roman" w:hAnsi="Times New Roman"/>
                 <w:sz w:val="17"/>
               </w:rPr>
-              <w:t>Native Vectorized Core</w:t>
+              <w:t>Native, open mathematical core</w:t>
             </w:r>
           </w:p>
         </w:tc>
@@ -3311,10 +3302,10 @@
             <w:tcW w:type="dxa" w:w="2160"/>
             <w:shd w:fill="FFFFFF"/>
             <w:tcMar>
-              <w:top w:w="70" w:type="dxa"/>
-              <w:bottom w:w="70" w:type="dxa"/>
-              <w:left w:w="100" w:type="dxa"/>
-              <w:right w:w="100" w:type="dxa"/>
+              <w:top w:w="60" w:type="dxa"/>
+              <w:bottom w:w="60" w:type="dxa"/>
+              <w:left w:w="80" w:type="dxa"/>
+              <w:right w:w="80" w:type="dxa"/>
             </w:tcMar>
           </w:tcPr>
           <w:p>
@@ -3323,7 +3314,7 @@
                 <w:rFonts w:ascii="Times New Roman" w:hAnsi="Times New Roman"/>
                 <w:sz w:val="17"/>
               </w:rPr>
-              <w:t>Novel Microstructure Metrics</w:t>
+              <w:t>New Microstructure Metrics</w:t>
             </w:r>
           </w:p>
         </w:tc>
@@ -3332,10 +3323,10 @@
             <w:tcW w:type="dxa" w:w="1872"/>
             <w:shd w:fill="FFFFFF"/>
             <w:tcMar>
-              <w:top w:w="70" w:type="dxa"/>
-              <w:bottom w:w="70" w:type="dxa"/>
-              <w:left w:w="100" w:type="dxa"/>
-              <w:right w:w="100" w:type="dxa"/>
+              <w:top w:w="60" w:type="dxa"/>
+              <w:bottom w:w="60" w:type="dxa"/>
+              <w:left w:w="80" w:type="dxa"/>
+              <w:right w:w="80" w:type="dxa"/>
             </w:tcMar>
           </w:tcPr>
           <w:p>
@@ -3344,7 +3335,7 @@
                 <w:rFonts w:ascii="Times New Roman" w:hAnsi="Times New Roman"/>
                 <w:sz w:val="17"/>
               </w:rPr>
-              <w:t>Absent</w:t>
+              <w:t>None</w:t>
             </w:r>
           </w:p>
         </w:tc>
@@ -3353,10 +3344,10 @@
             <w:tcW w:type="dxa" w:w="1872"/>
             <w:shd w:fill="FFFFFF"/>
             <w:tcMar>
-              <w:top w:w="70" w:type="dxa"/>
-              <w:bottom w:w="70" w:type="dxa"/>
-              <w:left w:w="100" w:type="dxa"/>
-              <w:right w:w="100" w:type="dxa"/>
+              <w:top w:w="60" w:type="dxa"/>
+              <w:bottom w:w="60" w:type="dxa"/>
+              <w:left w:w="80" w:type="dxa"/>
+              <w:right w:w="80" w:type="dxa"/>
             </w:tcMar>
           </w:tcPr>
           <w:p>
@@ -3365,7 +3356,28 @@
                 <w:rFonts w:ascii="Times New Roman" w:hAnsi="Times New Roman"/>
                 <w:sz w:val="17"/>
               </w:rPr>
-              <w:t>Absent</w:t>
+              <w:t>None</w:t>
+            </w:r>
+          </w:p>
+        </w:tc>
+        <w:tc>
+          <w:tcPr>
+            <w:tcW w:type="dxa" w:w="1872"/>
+            <w:shd w:fill="FFFFFF"/>
+            <w:tcMar>
+              <w:top w:w="60" w:type="dxa"/>
+              <w:bottom w:w="60" w:type="dxa"/>
+              <w:left w:w="80" w:type="dxa"/>
+              <w:right w:w="80" w:type="dxa"/>
+            </w:tcMar>
+          </w:tcPr>
+          <w:p>
+            <w:r>
+              <w:rPr>
+                <w:rFonts w:ascii="Times New Roman" w:hAnsi="Times New Roman"/>
+                <w:sz w:val="17"/>
+              </w:rPr>
+              <w:t>None</w:t>
             </w:r>
           </w:p>
         </w:tc>
@@ -3374,31 +3386,10 @@
             <w:tcW w:type="dxa" w:w="2016"/>
             <w:shd w:fill="FFFFFF"/>
             <w:tcMar>
-              <w:top w:w="70" w:type="dxa"/>
-              <w:bottom w:w="70" w:type="dxa"/>
-              <w:left w:w="100" w:type="dxa"/>
-              <w:right w:w="100" w:type="dxa"/>
-            </w:tcMar>
-          </w:tcPr>
-          <w:p>
-            <w:r>
-              <w:rPr>
-                <w:rFonts w:ascii="Times New Roman" w:hAnsi="Times New Roman"/>
-                <w:sz w:val="17"/>
-              </w:rPr>
-              <w:t>Absent</w:t>
-            </w:r>
-          </w:p>
-        </w:tc>
-        <w:tc>
-          <w:tcPr>
-            <w:tcW w:type="dxa" w:w="1872"/>
-            <w:shd w:fill="FFFFFF"/>
-            <w:tcMar>
-              <w:top w:w="70" w:type="dxa"/>
-              <w:bottom w:w="70" w:type="dxa"/>
-              <w:left w:w="100" w:type="dxa"/>
-              <w:right w:w="100" w:type="dxa"/>
+              <w:top w:w="60" w:type="dxa"/>
+              <w:bottom w:w="60" w:type="dxa"/>
+              <w:left w:w="80" w:type="dxa"/>
+              <w:right w:w="80" w:type="dxa"/>
             </w:tcMar>
           </w:tcPr>
           <w:p>
@@ -3416,12 +3407,12 @@
         <w:tc>
           <w:tcPr>
             <w:tcW w:type="dxa" w:w="2160"/>
-            <w:shd w:fill="F4F6F9"/>
+            <w:shd w:fill="F5F7FA"/>
             <w:tcMar>
-              <w:top w:w="70" w:type="dxa"/>
-              <w:bottom w:w="70" w:type="dxa"/>
-              <w:left w:w="100" w:type="dxa"/>
-              <w:right w:w="100" w:type="dxa"/>
+              <w:top w:w="60" w:type="dxa"/>
+              <w:bottom w:w="60" w:type="dxa"/>
+              <w:left w:w="80" w:type="dxa"/>
+              <w:right w:w="80" w:type="dxa"/>
             </w:tcMar>
           </w:tcPr>
           <w:p>
@@ -3430,19 +3421,19 @@
                 <w:rFonts w:ascii="Times New Roman" w:hAnsi="Times New Roman"/>
                 <w:sz w:val="17"/>
               </w:rPr>
-              <w:t>Explainable AI Layer (NLP)</w:t>
+              <w:t>Explainability (XAI)</w:t>
             </w:r>
           </w:p>
         </w:tc>
         <w:tc>
           <w:tcPr>
             <w:tcW w:type="dxa" w:w="1872"/>
-            <w:shd w:fill="F4F6F9"/>
+            <w:shd w:fill="F5F7FA"/>
             <w:tcMar>
-              <w:top w:w="70" w:type="dxa"/>
-              <w:bottom w:w="70" w:type="dxa"/>
-              <w:left w:w="100" w:type="dxa"/>
-              <w:right w:w="100" w:type="dxa"/>
+              <w:top w:w="60" w:type="dxa"/>
+              <w:bottom w:w="60" w:type="dxa"/>
+              <w:left w:w="80" w:type="dxa"/>
+              <w:right w:w="80" w:type="dxa"/>
             </w:tcMar>
           </w:tcPr>
           <w:p>
@@ -3451,19 +3442,19 @@
                 <w:rFonts w:ascii="Times New Roman" w:hAnsi="Times New Roman"/>
                 <w:sz w:val="17"/>
               </w:rPr>
-              <w:t>Absent</w:t>
+              <w:t>None</w:t>
             </w:r>
           </w:p>
         </w:tc>
         <w:tc>
           <w:tcPr>
             <w:tcW w:type="dxa" w:w="1872"/>
-            <w:shd w:fill="F4F6F9"/>
+            <w:shd w:fill="F5F7FA"/>
             <w:tcMar>
-              <w:top w:w="70" w:type="dxa"/>
-              <w:bottom w:w="70" w:type="dxa"/>
-              <w:left w:w="100" w:type="dxa"/>
-              <w:right w:w="100" w:type="dxa"/>
+              <w:top w:w="60" w:type="dxa"/>
+              <w:bottom w:w="60" w:type="dxa"/>
+              <w:left w:w="80" w:type="dxa"/>
+              <w:right w:w="80" w:type="dxa"/>
             </w:tcMar>
           </w:tcPr>
           <w:p>
@@ -3472,19 +3463,19 @@
                 <w:rFonts w:ascii="Times New Roman" w:hAnsi="Times New Roman"/>
                 <w:sz w:val="17"/>
               </w:rPr>
-              <w:t>Absent</w:t>
+              <w:t>None</w:t>
             </w:r>
           </w:p>
         </w:tc>
         <w:tc>
           <w:tcPr>
-            <w:tcW w:type="dxa" w:w="2016"/>
-            <w:shd w:fill="F4F6F9"/>
+            <w:tcW w:type="dxa" w:w="1872"/>
+            <w:shd w:fill="F5F7FA"/>
             <w:tcMar>
-              <w:top w:w="70" w:type="dxa"/>
-              <w:bottom w:w="70" w:type="dxa"/>
-              <w:left w:w="100" w:type="dxa"/>
-              <w:right w:w="100" w:type="dxa"/>
+              <w:top w:w="60" w:type="dxa"/>
+              <w:bottom w:w="60" w:type="dxa"/>
+              <w:left w:w="80" w:type="dxa"/>
+              <w:right w:w="80" w:type="dxa"/>
             </w:tcMar>
           </w:tcPr>
           <w:p>
@@ -3493,19 +3484,19 @@
                 <w:rFonts w:ascii="Times New Roman" w:hAnsi="Times New Roman"/>
                 <w:sz w:val="17"/>
               </w:rPr>
-              <w:t>Opaque Weights</w:t>
+              <w:t>Opaque neural weights</w:t>
             </w:r>
           </w:p>
         </w:tc>
         <w:tc>
           <w:tcPr>
-            <w:tcW w:type="dxa" w:w="1872"/>
-            <w:shd w:fill="F4F6F9"/>
+            <w:tcW w:type="dxa" w:w="2016"/>
+            <w:shd w:fill="F5F7FA"/>
             <w:tcMar>
-              <w:top w:w="70" w:type="dxa"/>
-              <w:bottom w:w="70" w:type="dxa"/>
-              <w:left w:w="100" w:type="dxa"/>
-              <w:right w:w="100" w:type="dxa"/>
+              <w:top w:w="60" w:type="dxa"/>
+              <w:bottom w:w="60" w:type="dxa"/>
+              <w:left w:w="80" w:type="dxa"/>
+              <w:right w:w="80" w:type="dxa"/>
             </w:tcMar>
           </w:tcPr>
           <w:p>
@@ -3514,7 +3505,7 @@
                 <w:rFonts w:ascii="Times New Roman" w:hAnsi="Times New Roman"/>
                 <w:sz w:val="17"/>
               </w:rPr>
-              <w:t>Native Deterministic XAI</w:t>
+              <w:t>Deterministic plain English</w:t>
             </w:r>
           </w:p>
         </w:tc>
@@ -3525,10 +3516,10 @@
             <w:tcW w:type="dxa" w:w="2160"/>
             <w:shd w:fill="FFFFFF"/>
             <w:tcMar>
-              <w:top w:w="70" w:type="dxa"/>
-              <w:bottom w:w="70" w:type="dxa"/>
-              <w:left w:w="100" w:type="dxa"/>
-              <w:right w:w="100" w:type="dxa"/>
+              <w:top w:w="60" w:type="dxa"/>
+              <w:bottom w:w="60" w:type="dxa"/>
+              <w:left w:w="80" w:type="dxa"/>
+              <w:right w:w="80" w:type="dxa"/>
             </w:tcMar>
           </w:tcPr>
           <w:p>
@@ -3537,7 +3528,7 @@
                 <w:rFonts w:ascii="Times New Roman" w:hAnsi="Times New Roman"/>
                 <w:sz w:val="17"/>
               </w:rPr>
-              <w:t>Regulatory Compliance</w:t>
+              <w:t>Regulatory Position</w:t>
             </w:r>
           </w:p>
         </w:tc>
@@ -3546,10 +3537,10 @@
             <w:tcW w:type="dxa" w:w="1872"/>
             <w:shd w:fill="FFFFFF"/>
             <w:tcMar>
-              <w:top w:w="70" w:type="dxa"/>
-              <w:bottom w:w="70" w:type="dxa"/>
-              <w:left w:w="100" w:type="dxa"/>
-              <w:right w:w="100" w:type="dxa"/>
+              <w:top w:w="60" w:type="dxa"/>
+              <w:bottom w:w="60" w:type="dxa"/>
+              <w:left w:w="80" w:type="dxa"/>
+              <w:right w:w="80" w:type="dxa"/>
             </w:tcMar>
           </w:tcPr>
           <w:p>
@@ -3558,7 +3549,7 @@
                 <w:rFonts w:ascii="Times New Roman" w:hAnsi="Times New Roman"/>
                 <w:sz w:val="17"/>
               </w:rPr>
-              <w:t>Sell Signals</w:t>
+              <w:t>Disseminates trade signals</w:t>
             </w:r>
           </w:p>
         </w:tc>
@@ -3567,10 +3558,10 @@
             <w:tcW w:type="dxa" w:w="1872"/>
             <w:shd w:fill="FFFFFF"/>
             <w:tcMar>
-              <w:top w:w="70" w:type="dxa"/>
-              <w:bottom w:w="70" w:type="dxa"/>
-              <w:left w:w="100" w:type="dxa"/>
-              <w:right w:w="100" w:type="dxa"/>
+              <w:top w:w="60" w:type="dxa"/>
+              <w:bottom w:w="60" w:type="dxa"/>
+              <w:left w:w="80" w:type="dxa"/>
+              <w:right w:w="80" w:type="dxa"/>
             </w:tcMar>
           </w:tcPr>
           <w:p>
@@ -3579,7 +3570,28 @@
                 <w:rFonts w:ascii="Times New Roman" w:hAnsi="Times New Roman"/>
                 <w:sz w:val="17"/>
               </w:rPr>
-              <w:t>Breakout Alerts</w:t>
+              <w:t>Breakout alerts</w:t>
+            </w:r>
+          </w:p>
+        </w:tc>
+        <w:tc>
+          <w:tcPr>
+            <w:tcW w:type="dxa" w:w="1872"/>
+            <w:shd w:fill="FFFFFF"/>
+            <w:tcMar>
+              <w:top w:w="60" w:type="dxa"/>
+              <w:bottom w:w="60" w:type="dxa"/>
+              <w:left w:w="80" w:type="dxa"/>
+              <w:right w:w="80" w:type="dxa"/>
+            </w:tcMar>
+          </w:tcPr>
+          <w:p>
+            <w:r>
+              <w:rPr>
+                <w:rFonts w:ascii="Times New Roman" w:hAnsi="Times New Roman"/>
+                <w:sz w:val="17"/>
+              </w:rPr>
+              <w:t>Automated trade flags</w:t>
             </w:r>
           </w:p>
         </w:tc>
@@ -3588,10 +3600,10 @@
             <w:tcW w:type="dxa" w:w="2016"/>
             <w:shd w:fill="FFFFFF"/>
             <w:tcMar>
-              <w:top w:w="70" w:type="dxa"/>
-              <w:bottom w:w="70" w:type="dxa"/>
-              <w:left w:w="100" w:type="dxa"/>
-              <w:right w:w="100" w:type="dxa"/>
+              <w:top w:w="60" w:type="dxa"/>
+              <w:bottom w:w="60" w:type="dxa"/>
+              <w:left w:w="80" w:type="dxa"/>
+              <w:right w:w="80" w:type="dxa"/>
             </w:tcMar>
           </w:tcPr>
           <w:p>
@@ -3600,19 +3612,21 @@
                 <w:rFonts w:ascii="Times New Roman" w:hAnsi="Times New Roman"/>
                 <w:sz w:val="17"/>
               </w:rPr>
-              <w:t>Black-Box Trade Flags</w:t>
+              <w:t>Strictly educational diagnostics</w:t>
             </w:r>
           </w:p>
         </w:tc>
+      </w:tr>
+      <w:tr>
         <w:tc>
           <w:tcPr>
-            <w:tcW w:type="dxa" w:w="1872"/>
-            <w:shd w:fill="FFFFFF"/>
+            <w:tcW w:type="dxa" w:w="2160"/>
+            <w:shd w:fill="F5F7FA"/>
             <w:tcMar>
-              <w:top w:w="70" w:type="dxa"/>
-              <w:bottom w:w="70" w:type="dxa"/>
-              <w:left w:w="100" w:type="dxa"/>
-              <w:right w:w="100" w:type="dxa"/>
+              <w:top w:w="60" w:type="dxa"/>
+              <w:bottom w:w="60" w:type="dxa"/>
+              <w:left w:w="80" w:type="dxa"/>
+              <w:right w:w="80" w:type="dxa"/>
             </w:tcMar>
           </w:tcPr>
           <w:p>
@@ -3621,42 +3635,19 @@
                 <w:rFonts w:ascii="Times New Roman" w:hAnsi="Times New Roman"/>
                 <w:sz w:val="17"/>
               </w:rPr>
-              <w:t>Strictly Educational (Compliant)</w:t>
-            </w:r>
-          </w:p>
-        </w:tc>
-      </w:tr>
-      <w:tr>
-        <w:tc>
-          <w:tcPr>
-            <w:tcW w:type="dxa" w:w="2160"/>
-            <w:shd w:fill="F4F6F9"/>
-            <w:tcMar>
-              <w:top w:w="70" w:type="dxa"/>
-              <w:bottom w:w="70" w:type="dxa"/>
-              <w:left w:w="100" w:type="dxa"/>
-              <w:right w:w="100" w:type="dxa"/>
-            </w:tcMar>
-          </w:tcPr>
-          <w:p>
-            <w:r>
-              <w:rPr>
-                <w:rFonts w:ascii="Times New Roman" w:hAnsi="Times New Roman"/>
-                <w:sz w:val="17"/>
-              </w:rPr>
-              <w:t>Technology Readiness Level</w:t>
+              <w:t>Implementation Stage</w:t>
             </w:r>
           </w:p>
         </w:tc>
         <w:tc>
           <w:tcPr>
             <w:tcW w:type="dxa" w:w="1872"/>
-            <w:shd w:fill="F4F6F9"/>
+            <w:shd w:fill="F5F7FA"/>
             <w:tcMar>
-              <w:top w:w="70" w:type="dxa"/>
-              <w:bottom w:w="70" w:type="dxa"/>
-              <w:left w:w="100" w:type="dxa"/>
-              <w:right w:w="100" w:type="dxa"/>
+              <w:top w:w="60" w:type="dxa"/>
+              <w:bottom w:w="60" w:type="dxa"/>
+              <w:left w:w="80" w:type="dxa"/>
+              <w:right w:w="80" w:type="dxa"/>
             </w:tcMar>
           </w:tcPr>
           <w:p>
@@ -3672,12 +3663,12 @@
         <w:tc>
           <w:tcPr>
             <w:tcW w:type="dxa" w:w="1872"/>
-            <w:shd w:fill="F4F6F9"/>
+            <w:shd w:fill="F5F7FA"/>
             <w:tcMar>
-              <w:top w:w="70" w:type="dxa"/>
-              <w:bottom w:w="70" w:type="dxa"/>
-              <w:left w:w="100" w:type="dxa"/>
-              <w:right w:w="100" w:type="dxa"/>
+              <w:top w:w="60" w:type="dxa"/>
+              <w:bottom w:w="60" w:type="dxa"/>
+              <w:left w:w="80" w:type="dxa"/>
+              <w:right w:w="80" w:type="dxa"/>
             </w:tcMar>
           </w:tcPr>
           <w:p>
@@ -3692,13 +3683,13 @@
         </w:tc>
         <w:tc>
           <w:tcPr>
-            <w:tcW w:type="dxa" w:w="2016"/>
-            <w:shd w:fill="F4F6F9"/>
+            <w:tcW w:type="dxa" w:w="1872"/>
+            <w:shd w:fill="F5F7FA"/>
             <w:tcMar>
-              <w:top w:w="70" w:type="dxa"/>
-              <w:bottom w:w="70" w:type="dxa"/>
-              <w:left w:w="100" w:type="dxa"/>
-              <w:right w:w="100" w:type="dxa"/>
+              <w:top w:w="60" w:type="dxa"/>
+              <w:bottom w:w="60" w:type="dxa"/>
+              <w:left w:w="80" w:type="dxa"/>
+              <w:right w:w="80" w:type="dxa"/>
             </w:tcMar>
           </w:tcPr>
           <w:p>
@@ -3707,19 +3698,19 @@
                 <w:rFonts w:ascii="Times New Roman" w:hAnsi="Times New Roman"/>
                 <w:sz w:val="17"/>
               </w:rPr>
-              <w:t>TRL-3 (Research Prototype)</w:t>
+              <w:t>Academic prototype</w:t>
             </w:r>
           </w:p>
         </w:tc>
         <w:tc>
           <w:tcPr>
-            <w:tcW w:type="dxa" w:w="1872"/>
-            <w:shd w:fill="F4F6F9"/>
+            <w:tcW w:type="dxa" w:w="2016"/>
+            <w:shd w:fill="F5F7FA"/>
             <w:tcMar>
-              <w:top w:w="70" w:type="dxa"/>
-              <w:bottom w:w="70" w:type="dxa"/>
-              <w:left w:w="100" w:type="dxa"/>
-              <w:right w:w="100" w:type="dxa"/>
+              <w:top w:w="60" w:type="dxa"/>
+              <w:bottom w:w="60" w:type="dxa"/>
+              <w:left w:w="80" w:type="dxa"/>
+              <w:right w:w="80" w:type="dxa"/>
             </w:tcMar>
           </w:tcPr>
           <w:p>
@@ -3728,7 +3719,7 @@
                 <w:rFonts w:ascii="Times New Roman" w:hAnsi="Times New Roman"/>
                 <w:sz w:val="17"/>
               </w:rPr>
-              <w:t>TRL-6 (Operational Prototype)</w:t>
+              <w:t>TRL-6 operational system</w:t>
             </w:r>
           </w:p>
         </w:tc>
@@ -3739,10 +3730,10 @@
             <w:tcW w:type="dxa" w:w="2160"/>
             <w:shd w:fill="FFFFFF"/>
             <w:tcMar>
-              <w:top w:w="70" w:type="dxa"/>
-              <w:bottom w:w="70" w:type="dxa"/>
-              <w:left w:w="100" w:type="dxa"/>
-              <w:right w:w="100" w:type="dxa"/>
+              <w:top w:w="60" w:type="dxa"/>
+              <w:bottom w:w="60" w:type="dxa"/>
+              <w:left w:w="80" w:type="dxa"/>
+              <w:right w:w="80" w:type="dxa"/>
             </w:tcMar>
           </w:tcPr>
           <w:p>
@@ -3751,7 +3742,7 @@
                 <w:rFonts w:ascii="Times New Roman" w:hAnsi="Times New Roman"/>
                 <w:sz w:val="17"/>
               </w:rPr>
-              <w:t>Innovation Score (/10)</w:t>
+              <w:t>Overall Innovation</w:t>
             </w:r>
           </w:p>
         </w:tc>
@@ -3760,10 +3751,10 @@
             <w:tcW w:type="dxa" w:w="1872"/>
             <w:shd w:fill="FFFFFF"/>
             <w:tcMar>
-              <w:top w:w="70" w:type="dxa"/>
-              <w:bottom w:w="70" w:type="dxa"/>
-              <w:left w:w="100" w:type="dxa"/>
-              <w:right w:w="100" w:type="dxa"/>
+              <w:top w:w="60" w:type="dxa"/>
+              <w:bottom w:w="60" w:type="dxa"/>
+              <w:left w:w="80" w:type="dxa"/>
+              <w:right w:w="80" w:type="dxa"/>
             </w:tcMar>
           </w:tcPr>
           <w:p>
@@ -3781,10 +3772,10 @@
             <w:tcW w:type="dxa" w:w="1872"/>
             <w:shd w:fill="FFFFFF"/>
             <w:tcMar>
-              <w:top w:w="70" w:type="dxa"/>
-              <w:bottom w:w="70" w:type="dxa"/>
-              <w:left w:w="100" w:type="dxa"/>
-              <w:right w:w="100" w:type="dxa"/>
+              <w:top w:w="60" w:type="dxa"/>
+              <w:bottom w:w="60" w:type="dxa"/>
+              <w:left w:w="80" w:type="dxa"/>
+              <w:right w:w="80" w:type="dxa"/>
             </w:tcMar>
           </w:tcPr>
           <w:p>
@@ -3799,13 +3790,13 @@
         </w:tc>
         <w:tc>
           <w:tcPr>
-            <w:tcW w:type="dxa" w:w="2016"/>
+            <w:tcW w:type="dxa" w:w="1872"/>
             <w:shd w:fill="FFFFFF"/>
             <w:tcMar>
-              <w:top w:w="70" w:type="dxa"/>
-              <w:bottom w:w="70" w:type="dxa"/>
-              <w:left w:w="100" w:type="dxa"/>
-              <w:right w:w="100" w:type="dxa"/>
+              <w:top w:w="60" w:type="dxa"/>
+              <w:bottom w:w="60" w:type="dxa"/>
+              <w:left w:w="80" w:type="dxa"/>
+              <w:right w:w="80" w:type="dxa"/>
             </w:tcMar>
           </w:tcPr>
           <w:p>
@@ -3820,13 +3811,13 @@
         </w:tc>
         <w:tc>
           <w:tcPr>
-            <w:tcW w:type="dxa" w:w="1872"/>
+            <w:tcW w:type="dxa" w:w="2016"/>
             <w:shd w:fill="FFFFFF"/>
             <w:tcMar>
-              <w:top w:w="70" w:type="dxa"/>
-              <w:bottom w:w="70" w:type="dxa"/>
-              <w:left w:w="100" w:type="dxa"/>
-              <w:right w:w="100" w:type="dxa"/>
+              <w:top w:w="60" w:type="dxa"/>
+              <w:bottom w:w="60" w:type="dxa"/>
+              <w:left w:w="80" w:type="dxa"/>
+              <w:right w:w="80" w:type="dxa"/>
             </w:tcMar>
           </w:tcPr>
           <w:p>
@@ -3843,7 +3834,7 @@
     </w:tbl>
     <w:p>
       <w:pPr>
-        <w:spacing w:after="120"/>
+        <w:spacing w:after="80"/>
       </w:pPr>
     </w:p>
     <w:p>
@@ -3855,10 +3846,10 @@
         <w:rPr>
           <w:rFonts w:ascii="Times New Roman" w:hAnsi="Times New Roman"/>
           <w:b/>
-          <w:color w:val="003366"/>
-          <w:sz w:val="26"/>
+          <w:color w:val="000000"/>
+          <w:sz w:val="24"/>
         </w:rPr>
-        <w:t>VII. CONCLUSION &amp; FUTURE DIRECTIONS</w:t>
+        <w:t>VII. CONCLUSION &amp; NEXT STEPS</w:t>
       </w:r>
     </w:p>
     <w:p>
@@ -3872,7 +3863,7 @@
           <w:i w:val="0"/>
           <w:sz w:val="20"/>
         </w:rPr>
-        <w:t>This paper presented a systematic review of explainable market microstructure analytics and evaluated the AlphaPulse framework. Grounded in Auction Market Theory, AlphaPulse demonstrates that volume-at-price analytics provide statistically robust structural intelligence without relying on opaque black-box neural networks or lagging price-only indicators.</w:t>
+        <w:t>In this paper, we presented a practical, explainable alternative to traditional lagging indicators and black-box neural networks. By formalizing Auction Market Theory into discrete algorithms, AlphaPulse provides an objective way to track institutional value, measure order flow asymmetry, and verify whether breakouts are real or false.</w:t>
       </w:r>
     </w:p>
     <w:p>
@@ -3886,7 +3877,7 @@
           <w:i w:val="0"/>
           <w:sz w:val="20"/>
         </w:rPr>
-        <w:t>By calculating empirical Value Areas, introducing novel asymmetry metrics (DDAI, TPAM), and integrating a deterministic natural language explanation layer, AlphaPulse provides a transparent, compliant, and academically sound foundation for market analysis, institutional education, and computational finance research. Future research will focus on integrating Level 3 (L3) limit order book queue dynamics and cross-asset liquidity diffusion models.</w:t>
+        <w:t>Our empirical tests on five years of NIFTY 50 intraday data demonstrate that volume-at-price levels provide statistically meaningful structural support and resistance (p &lt; 0.001). Because the system produces transparent educational explanations rather than speculative buy/sell signals, it avoids regulatory pitfalls and offers a reliable foundation for market education, risk auditing, and transaction cost analysis. In future work, we plan to incorporate resting limit order book depth (Level 3 queue tracking) to analyze passive liquidity before trades are executed.</w:t>
       </w:r>
     </w:p>
     <w:p>
@@ -3898,8 +3889,8 @@
         <w:rPr>
           <w:rFonts w:ascii="Times New Roman" w:hAnsi="Times New Roman"/>
           <w:b/>
-          <w:color w:val="003366"/>
-          <w:sz w:val="26"/>
+          <w:color w:val="000000"/>
+          <w:sz w:val="24"/>
         </w:rPr>
         <w:t>REFERENCES</w:t>
       </w:r>
@@ -4117,7 +4108,7 @@
           <w:rFonts w:ascii="Times New Roman" w:hAnsi="Times New Roman"/>
           <w:sz w:val="17"/>
         </w:rPr>
-        <w:t>[18] Á. Cartea and S. Jaimungal, 'Risk metrics and fine tuning of high-frequency trading strategies,' Math. Finance, vol. 24, no. 3, pp. 577–602, 2014.</w:t>
+        <w:t>[18] B. Mandelbrot, 'The variation of certain speculative prices,' J. Bus., vol. 36, no. 4, pp. 394–419, 1963.</w:t>
       </w:r>
     </w:p>
     <w:p>
@@ -4141,7 +4132,7 @@
           <w:rFonts w:ascii="Times New Roman" w:hAnsi="Times New Roman"/>
           <w:sz w:val="17"/>
         </w:rPr>
-        <w:t>[20] B. Mandelbrot, 'The variation of certain speculative prices,' J. Bus., vol. 36, no. 4, pp. 394–419, 1963.</w:t>
+        <w:t>[20] Á. Cartea and S. Jaimungal, 'Risk metrics and fine tuning of high-frequency trading strategies,' Math. Finance, vol. 24, no. 3, pp. 577–602, 2014.</w:t>
       </w:r>
     </w:p>
     <w:p>

</xml_diff>